<commit_message>
Revise CAT bond paper after five-seat review
Make the contradictions explicit (three positions, Table 1 row), fix the
Forbes-Rigobon algebra and the GARCH-filtering claim, use one definition
of a strong safe haven, state beta_l = 0 as an assumption, add falsifiable
tests (Lehman-swap comparison, funding-stress interaction), sample
periods, post-2009 collateral source, and keep the PDF at 15 pages.

Co-Authored-By: Claude Opus 5.5 <noreply@anthropic.com>
Claude-Session: https://claude.ai/code/session_01BdQY4NFtUtwfapZaVYAnaN
</commit_message>
<xml_diff>
--- a/cat-bonds-final-paper/paper.docx
+++ b/cat-bonds-final-paper/paper.docx
@@ -141,7 +141,7 @@
         <w:pStyle w:val="BodyText"/>
       </w:pPr>
       <w:r>
-        <w:t xml:space="preserve">To attract those investors, the market offered a simple argument. Whether a hurricane hits Florida or an earthquake hits Tokyo does not depend on the stock market, so the losses on a CAT bond should be unrelated to the losses on stocks and corporate bonds. In CAPM terms, CAT bonds would be zero-beta assets, and their spread over the risk-free rate would pay investors for a risk that adds nothing to the systematic risk of a diversified portfolio.</w:t>
+        <w:t xml:space="preserve">To attract those investors, the market offered a simple argument. Whether a hurricane hits Florida or an earthquake hits Tokyo does not depend on the stock market, so the losses on a CAT bond should be unrelated to the losses on stocks and corporate bonds. In CAPM terms, CAT bonds would be zero-beta assets. Their spread over the risk-free rate should then do little more than cover expected losses, and any spread well above that level would be an attractive reward for a risk that adds nothing to the systematic risk of a diversified portfolio.</w:t>
       </w:r>
     </w:p>
     <w:p>
@@ -149,7 +149,7 @@
         <w:pStyle w:val="BodyText"/>
       </w:pPr>
       <w:r>
-        <w:t xml:space="preserve">The argument concerns the natural event, while the investor holds a financial security. A CAT bond is a contract with a special purpose vehicle, its principal sits in a collateral account, its price comes from dealer quotes, and it is held by funds that may need cash at the same moment as everyone else. Each of these features can carry financial stress into the bond when no catastrophe has happened. Whether they do so is an empirical question, and the published answers disagree.</w:t>
+        <w:t xml:space="preserve">The argument concerns the natural event, while the investor holds a financial security. A CAT bond is a contract with a special purpose vehicle, its principal sits in a collateral account, its price comes from dealer quotes, and it is held by funds that may need cash at the same moment as everyone else. Each of these features can carry financial stress into the bond when no catastrophe has happened. Whether they do so is an empirical question, and the published answers contradict each other.</w:t>
       </w:r>
     </w:p>
     <w:p>
@@ -157,7 +157,7 @@
         <w:pStyle w:val="BodyText"/>
       </w:pPr>
       <w:r>
-        <w:t xml:space="preserve">Carayannopoulos and Perez (2015) find that CAT bonds behaved as zero-beta assets outside crisis periods but became correlated with the market after the collapse of Lehman Brothers. Drobetz, Schröder and Tegtmeier (2020) find that CAT bonds are an effective diversifier but a poor hedge, and that they acted as a strong safe haven against extreme stock market declines only after the financial crisis. Haffar and Le Fur (2022) find that, of the assets they study, CAT bonds have the highest risk-adjusted performance and add the least to the probability of extreme joint movements with an equity portfolio. Other studies push in both directions. Gürtler, Hibbeln and Winkelvos (2016) conclude from the link between CAT bond premiums and corporate bond spreads that CAT bonds should not be regarded as zero-beta securities, while Feng and Zeng (2025) find that CAT bonds acted as a safe haven against stocks after the COVID-19 outbreak.</w:t>
+        <w:t xml:space="preserve">Three positions can be distinguished. The first supports the zero-beta view: Carayannopoulos and Perez (2015) find that CAT bonds behaved as zero-beta assets outside crisis periods, and Haffar and Le Fur (2022) find that, of the assets they study, CAT bonds add the least to the probability of extreme joint movements with an equity portfolio. The second rejects it: Gürtler, Hibbeln and Winkelvos (2016) conclude from the link between CAT bond premiums and corporate bond spreads that CAT bonds should not be regarded as zero-beta securities, and Carayannopoulos and Perez themselves find that CAT bond returns became correlated with the market after the collapse of Lehman Brothers. The third makes the answer depend on the period: Drobetz, Schröder and Tegtmeier (2020) find that CAT bonds are a diversifier but a poor hedge, and a strong safe haven against extreme stock market declines only after the financial crisis, while Feng and Zeng (2025) find a safe haven against stocks after the COVID-19 outbreak.</w:t>
       </w:r>
     </w:p>
     <w:p>
@@ -165,7 +165,7 @@
         <w:pStyle w:val="BodyText"/>
       </w:pPr>
       <w:r>
-        <w:t xml:space="preserve">The difference matters for a pension fund or an insurer deciding how much to invest. A diversifier lowers the variance of a portfolio on average. A safe haven holds up when the rest of the portfolio is in a crash. An investor who buys CAT bonds for the second property when they only have the first is exposed at the worst possible moment.</w:t>
+        <w:t xml:space="preserve">The difference matters for an investor. A diversifier lowers the variance of a portfolio on average. A safe haven holds up when the rest of the portfolio is in a crash. An investor who buys CAT bonds for the second property when they only have the first is exposed at the worst moment.</w:t>
       </w:r>
     </w:p>
     <w:p>
@@ -189,7 +189,7 @@
         <w:t xml:space="preserve"> </w:t>
       </w:r>
       <w:r>
-        <w:t xml:space="preserve">I argue that most of the disagreement has little to do with catastrophe risk. It comes from four sources: the property being tested (diversifier, hedge or safe haven), the collateral structure in force during the sample, the type of stress (a shortage of funding or a fall in equity prices), and the way CAT bond returns are measured. As my personal contribution, I decompose the CAT bond return into an insurance core, which is independent of markets, and a financial wrapper, whose market exposure changes with the bond’s structure and with the stress episode. This decomposition sorts the episodes studied in the literature into four regimes, predicts the result each study should find in each regime, and leads to proposals for investors and for the design of future tests.</w:t>
+        <w:t xml:space="preserve">I argue that the disagreement has little to do with whether catastrophes occur and much to do with how catastrophe risk is collateralised, priced and measured. It comes from four sources: the property being tested (diversifier, hedge or safe haven), the collateral structure in force during the sample, the type of stress (a shortage of funding or a fall in equity prices), and the way CAT bond returns are measured. As my personal contribution, I propose a decomposition of the CAT bond return into an insurance core, whose losses are independent of markets for natural perils, and a financial wrapper, whose market exposure changes with the bond’s structure and with the stress episode. The decomposition sorts the episodes studied in the literature into four regimes, makes predictions that can be tested, and leads to proposals for investors.</w:t>
       </w:r>
     </w:p>
     <w:p>
@@ -224,7 +224,7 @@
         <w:pStyle w:val="FirstParagraph"/>
       </w:pPr>
       <w:r>
-        <w:t xml:space="preserve">A sponsor sets up a special purpose vehicle (SPV) that sells notes to investors and signs a reinsurance contract with the sponsor. The proceeds of the notes are placed in a collateral trust account. Investors receive the return earned by the collateral plus a fixed risk spread paid out of the sponsor’s premium. If a qualifying event occurs, the collateral is released to the sponsor to pay its claims and investors lose part or all of their principal (Cummins, 2008). The trigger can be the sponsor’s own losses (indemnity), an industry loss index, a modelled loss, or a physical parameter such as wind speed or ground motion. Indemnity triggers protect the sponsor best but expose investors to the sponsor’s underwriting and claims practices. Index and parametric triggers reduce that moral hazard at the cost of basis risk for the sponsor (Cummins, 2008; Cummins and Weiss, 2009).</w:t>
+        <w:t xml:space="preserve">A sponsor sets up a special purpose vehicle (SPV) that sells notes to investors and signs a reinsurance contract with the sponsor. The proceeds of the notes are placed in a collateral trust account. Investors receive the return earned by the collateral plus a fixed risk spread paid out of the sponsor’s premium. If a qualifying event occurs, the collateral is released to the sponsor to pay its claims and investors lose part or all of their principal (Cummins, 2008). The trigger can be the sponsor’s own losses (indemnity), an industry loss index, a modelled loss, or a physical parameter such as wind speed. Index and parametric triggers reduce moral hazard at the cost of basis risk for the sponsor (Cummins, 2008; Cummins and Weiss, 2009).</w:t>
       </w:r>
     </w:p>
     <w:p>
@@ -245,7 +245,7 @@
         <w:t xml:space="preserve">collateral</w:t>
       </w:r>
       <w:r>
-        <w:t xml:space="preserve">. Before 2009, many deals did not simply hold government securities. The collateral was invested in other assets, and an investment bank promised the SPV a money-market return through a total return swap, making up any shortfall in the value of the collateral. Lehman Brothers Special Financing was the swap counterparty for four CAT bonds: Ajax Re, Carillon, Newton Re and Willow Re. When Lehman failed in September 2008, the collateral behind these bonds lost its guarantee. Ajax Re paid all its interest but could not repay its principal in full at maturity in May 2009 because the collateral assets were worth less than the notes (Artemis, 2009). Carayannopoulos and Perez (2015) attribute the crisis effect on CAT bonds mainly to weaknesses in the composition and structure of the trust account, and they observe that new bonds issued from 2009 onward used improved structures. In practice, post-crisis deals hold short-term Treasury instruments in trust, without a bank guaranteeing their value.</w:t>
+        <w:t xml:space="preserve">. Before 2009, many deals did not simply hold government securities. The collateral was invested in other assets, and an investment bank promised the SPV a money-market return through a total return swap, making up any shortfall in the value of the collateral. Lehman Brothers Special Financing was the swap counterparty for four CAT bonds: Ajax Re, Carillon, Newton Re and Willow Re. When Lehman failed in September 2008, the collateral lost its guarantee. Ajax Re paid all its interest but could not repay its principal in full at maturity in May 2009 because the collateral assets were worth less than the notes (Artemis, 2009). Carayannopoulos and Perez (2015) attribute the crisis effect on CAT bonds mainly to weaknesses in the composition and structure of the trust account, and they observe that new bonds issued from 2009 onward used improved structures. No new CAT bond used a total return swap after 2009, and by the end of 2011 Treasury money-market funds accounted for more than 60 percent of collateral structures, alongside structured notes and tri-party repurchase agreements (Artemis, 2011).</w:t>
       </w:r>
     </w:p>
     <w:p>
@@ -340,7 +340,7 @@
         <w:t xml:space="preserve"> </w:t>
       </w:r>
       <w:r>
-        <w:t xml:space="preserve">is uncorrelated or negatively correlated with it during extreme market declines. Baur and McDermott (2010) distinguish strong and weak versions: a strong hedge or safe haven is negatively correlated with the market, a weak one is uncorrelated.</w:t>
+        <w:t xml:space="preserve">is uncorrelated or negatively correlated with it during extreme market declines. Baur and McDermott (2010) distinguish strong and weak versions: a strong hedge or safe haven is negatively correlated with the market, a weak one is uncorrelated. In this terminology, an asset whose beta is zero on average is a weak hedge, which is a stronger property than being a diversifier.</w:t>
       </w:r>
     </w:p>
     <w:p>
@@ -348,7 +348,7 @@
         <w:pStyle w:val="BodyText"/>
       </w:pPr>
       <w:r>
-        <w:t xml:space="preserve">These properties are distinct: an asset can be a good diversifier and still fail as a safe haven. The zero-beta claim, which says the beta is zero at all times, is closer to</w:t>
+        <w:t xml:space="preserve">These properties are distinct: an asset can be a good diversifier and still fail as a safe haven. The zero-beta claim, which says the beta is zero at all times, amounts to</w:t>
       </w:r>
       <w:r>
         <w:t xml:space="preserve"> </w:t>
@@ -363,10 +363,7 @@
         <w:t xml:space="preserve">”</w:t>
       </w:r>
       <w:r>
-        <w:t xml:space="preserve"> </w:t>
-      </w:r>
-      <w:r>
-        <w:t xml:space="preserve">than to diversification, so evidence of diversification does not confirm it. The definitions are also about correlation, not about price. A statistical safe haven can lose money in a crash as long as its losses do not move with the market’s. An investor who has to sell during a crisis cares about the price received, so the economic meaning of a safe haven is stricter than the statistical one.</w:t>
+        <w:t xml:space="preserve">, so evidence of diversification does not confirm it. The definitions are also about correlation, not about price. A statistical safe haven can lose money in a crash as long as its losses do not move with the market’s. An investor who has to sell during a crisis cares about the price received, so the economic meaning of a safe haven is stricter than the statistical one.</w:t>
       </w:r>
     </w:p>
     <w:p>
@@ -374,7 +371,51 @@
         <w:pStyle w:val="BodyText"/>
       </w:pPr>
       <w:r>
-        <w:t xml:space="preserve">The tools differ as well. A beta is the covariance with the market divided by the market’s variance. A correlation scales the same covariance by both volatilities. A copula separates the dependence between two series from their individual distributions and can measure tail dependence, the probability that one series has an extreme loss given that the other has one. These tools can give different verdicts on the same data. Forbes and Rigobon (2002) showed one reason: when market volatility rises, the measured correlation rises even if the underlying relation between the two assets has not changed, so correlations estimated in crisis windows are biased upward unless they are corrected.</w:t>
+        <w:t xml:space="preserve">The word</w:t>
+      </w:r>
+      <w:r>
+        <w:t xml:space="preserve"> </w:t>
+      </w:r>
+      <w:r>
+        <w:t xml:space="preserve">“</w:t>
+      </w:r>
+      <w:r>
+        <w:t xml:space="preserve">strong</w:t>
+      </w:r>
+      <w:r>
+        <w:t xml:space="preserve">”</w:t>
+      </w:r>
+      <w:r>
+        <w:t xml:space="preserve"> </w:t>
+      </w:r>
+      <w:r>
+        <w:t xml:space="preserve">also changes meaning between studies. In the two-stage framework used by Drobetz et al. (2020), taken from Bouri et al. (2017), the safe-haven verdict rests on the coefficients of extreme-week dummies, which measure how the correlation changes in those weeks. A strong safe haven in that sense is a significant fall in the correlation, which does not require the correlation to become negative as Baur and McDermott’s definition does. In this paper,</w:t>
+      </w:r>
+      <w:r>
+        <w:t xml:space="preserve"> </w:t>
+      </w:r>
+      <w:r>
+        <w:t xml:space="preserve">“</w:t>
+      </w:r>
+      <w:r>
+        <w:t xml:space="preserve">strong</w:t>
+      </w:r>
+      <w:r>
+        <w:t xml:space="preserve">”</w:t>
+      </w:r>
+      <w:r>
+        <w:t xml:space="preserve"> </w:t>
+      </w:r>
+      <w:r>
+        <w:t xml:space="preserve">refers to the regression sense when I discuss Drobetz et al. and to a negative correlation otherwise.</w:t>
+      </w:r>
+    </w:p>
+    <w:p>
+      <w:pPr>
+        <w:pStyle w:val="BodyText"/>
+      </w:pPr>
+      <w:r>
+        <w:t xml:space="preserve">The tools differ as well. A beta is the covariance with the market divided by the market’s variance, and a correlation scales the same covariance by both volatilities. A copula separates the dependence between two series from their individual distributions and can measure tail dependence, the probability of an extreme loss in one series given an extreme loss in the other. Forbes and Rigobon (2002) showed one reason: when two assets share a common factor, a rise in market volatility raises their measured correlation even if the underlying relation has not changed, so correlations estimated in crisis windows are biased upward unless they are corrected.</w:t>
       </w:r>
     </w:p>
     <w:bookmarkEnd w:id="22"/>
@@ -392,7 +433,7 @@
         <w:pStyle w:val="FirstParagraph"/>
       </w:pPr>
       <w:r>
-        <w:t xml:space="preserve">The first article asks two questions: are CAT bonds zero-beta investments, and do they diversify a portfolio? The authors study the joint dynamics of CAT bond returns and the returns of the stock, corporate bond and government bond markets with a multivariate GARCH model. From the estimated conditional covariances they compute dynamic hedge ratios, the conditional covariance with each market divided by that market’s conditional variance. Because a hedge ratio defined this way is a beta, they read the series as time-varying betas.</w:t>
+        <w:t xml:space="preserve">The first article asks two questions: are CAT bonds zero-beta investments, and do they diversify a portfolio? Over January 2002 to October 2013, the authors study the joint dynamics of CAT bond returns and the returns of the stock, corporate bond and government bond markets with a multivariate GARCH model. From the estimated conditional covariances they compute dynamic hedge ratios, the conditional covariance with each market divided by that market’s conditional variance. Because a hedge ratio defined this way is a beta, they read the series as time-varying betas.</w:t>
       </w:r>
     </w:p>
     <w:p>
@@ -400,7 +441,7 @@
         <w:pStyle w:val="BodyText"/>
       </w:pPr>
       <w:r>
-        <w:t xml:space="preserve">The results depend on the period. Outside the crisis, the betas are indistinguishable from zero and CAT bonds look like the zero-beta asset of the textbook argument. With the collapse of Lehman Brothers, CAT bond returns became significantly correlated with the market. The authors add two qualifications. The crisis affected CAT bonds much less than it affected the other asset classes, so CAT bonds still diversified a portfolio. And CAT bond betas returned to their pre-crisis levels once bonds with improved structures were issued from 2009 onward, which the authors read as the market’s approval of those structures.</w:t>
+        <w:t xml:space="preserve">The results depend on the period. Outside the crisis, the betas are indistinguishable from zero and CAT bonds look like the zero-beta asset of the textbook argument. With the collapse of Lehman Brothers, CAT bond returns became significantly correlated with the market. The size of the effect is small: the hedge ratios of CAT bonds stay very close to zero in all sub-periods, while those of government bonds change markedly after September 2008. The authors conclude that the crisis affected CAT bonds much less than the other asset classes, so CAT bonds still diversified a portfolio, and that CAT bond betas returned to their pre-crisis levels once bonds with improved structures were issued from 2009 onward, which they read as the market’s approval of those structures.</w:t>
       </w:r>
     </w:p>
     <w:p>
@@ -408,7 +449,7 @@
         <w:pStyle w:val="BodyText"/>
       </w:pPr>
       <w:r>
-        <w:t xml:space="preserve">The strength of the article is that it treats beta as a variable. The time-varying hedge ratios show when the zero-beta property broke down, and the timing points to the trust-account structure, since catastrophe risk itself did not change when Lehman failed. Its limit, for my question, is that a beta estimated on returns cannot say which part of the bond moved with the market. A fall in the value of Lehman-guaranteed collateral, a rise in the premium demanded by investors who needed cash, and a stale price catching up after a quiet period would all appear as a positive beta. The article also studies a single crisis, and an unusual one for CAT bonds, since a swap counterparty failed during it. Timing adds a further difficulty. Hurricane Ike made landfall in Texas on 13 September 2008, two days before Lehman Brothers filed for bankruptcy, so in weekly data a catastrophe loss and a financial shock can fall in the same observation. In a short crisis window such a coincidence carries a large weight, and a crisis beta is only interpretable once the two are separated.</w:t>
+        <w:t xml:space="preserve">The strength of the article is that it treats beta as a variable. The time-varying hedge ratios show when the zero-beta property broke down, and the timing points to the trust-account structure that the authors identify as the main weakness. Its limit, for my question, is that a beta estimated on returns cannot say which part of the bond moved with the market. A fall in the value of Lehman-guaranteed collateral, a rise in the premium demanded by investors who needed cash, and a stale price catching up after a quiet period would all appear as a positive beta. The article also studies a single crisis, and an unusual one for CAT bonds, since a swap counterparty failed during it. Timing adds a further difficulty. Hurricane Ike made landfall in Texas on 13 September 2008, two days before Lehman Brothers filed for bankruptcy, so in weekly data a catastrophe event and a financial shock can fall in the same observation. In a short crisis window such a coincidence carries a large weight, and a crisis beta is only interpretable once the two are separated.</w:t>
       </w:r>
     </w:p>
     <w:bookmarkEnd w:id="23"/>
@@ -426,7 +467,7 @@
         <w:pStyle w:val="FirstParagraph"/>
       </w:pPr>
       <w:r>
-        <w:t xml:space="preserve">The second article widens the comparison to an international multi-asset portfolio. The authors pair the Swiss Re Global Unhedged CAT Bond Performance Index with six asset classes: global stocks, bonds, real estate, commodities, private equity and infrastructure, using weekly returns. Their method has two stages, following Bouri et al. (2017). First, they estimate dynamic conditional correlations (DCC) between the CAT bond index and each asset class. Second, they regress these correlations on dummy variables that mark the weeks in which the other asset’s return falls in its extreme lower tail. The constant of the regression measures the average correlation, which settles the hedge-or-diversifier question. The coefficients on the dummies measure how the correlation changes in extreme weeks, which settles the safe-haven question.</w:t>
+        <w:t xml:space="preserve">The second article widens the comparison to an international multi-asset portfolio. The authors pair the Swiss Re Global Unhedged CAT Bond Performance Index with six asset classes: global stocks, bonds, real estate, commodities, private equity and infrastructure, using weekly returns from 2002 to 2018. Their method has two stages, following Bouri et al. (2017). First, they estimate dynamic conditional correlations (DCC) between the CAT bond index and each asset class. Second, they regress these correlations on dummy variables that mark the weeks in which the other asset’s return falls in its extreme lower tail. The constant of the regression measures the average correlation, which settles the hedge-or-diversifier question. The coefficients on the dummies measure how the correlation changes in extreme weeks, which settles the safe-haven question.</w:t>
       </w:r>
     </w:p>
     <w:p>
@@ -442,7 +483,7 @@
         <w:pStyle w:val="BodyText"/>
       </w:pPr>
       <w:r>
-        <w:t xml:space="preserve">This article is the closest to my question because it separates the three properties and tests them by sub-period. It also sharpens the puzzle. If the zero-beta argument were complete, the safe-haven property would hold in every period, because the probability of a hurricane does not depend on the state of financial markets. Two features of the design matter for the interpretation. The index is built from bid indications, not trades, so weekly correlations may understate co-movement when quotes adjust slowly. And the extreme-week dummies identify stress through the other asset’s return only. A week in which stock prices fall while funding markets work normally and a week of forced selling in a funding crisis are treated as the same event.</w:t>
+        <w:t xml:space="preserve">This article is the closest to my question because it separates the three properties and tests them by sub-period. It also contradicts the first article on average behaviour: a positive average correlation is incompatible with the zero beta that Carayannopoulos and Perez find outside crises. And it sharpens the puzzle. If the zero-beta argument were complete, the safe-haven property would hold in every period, because the probability of a hurricane does not depend on the state of financial markets. Two features of the design matter for the interpretation. The index is built from bid indications, not trades, so weekly correlations may understate co-movement when quotes adjust slowly. And the extreme-week dummies identify stress through the other asset’s return only. A week in which stock prices fall while funding markets work normally and a week of forced selling in a funding crisis are treated as the same event.</w:t>
       </w:r>
     </w:p>
     <w:bookmarkEnd w:id="24"/>
@@ -476,7 +517,7 @@
         <w:pStyle w:val="BodyText"/>
       </w:pPr>
       <w:r>
-        <w:t xml:space="preserve">The copula approach answers a question that correlation-based studies cannot answer directly: do the two assets crash together? On that question, the article supports the zero-beta view, and because the GARCH margins absorb changes in volatility, it is less exposed to the bias identified by Forbes and Rigobon (2002). The result has limits. The alternatives against which CAT bonds are ranked are stock indices, which depend strongly on each other and on an equity benchmark by construction, so ranking first among them on extreme co-movement is a modest test. The headline results describe the dependence structure as a whole. They do not tell an investor whether the probability of a joint extreme rises in a funding crisis like that of 2008. And if the CAT bond series is an index of quoted prices, as in most of this literature, its volatility is understated and its risk-adjusted performance overstated (Getmansky et al., 2004).</w:t>
+        <w:t xml:space="preserve">The copula approach answers a question that correlation-based studies cannot answer directly: do the two assets crash together? On that question, the article supports the zero-beta view. The result has limits. The alternatives against which CAT bonds are ranked are stock indices, which depend strongly on each other and on an equity benchmark by construction, so ranking first among them on extreme co-movement is a modest test. The headline results describe the dependence structure as a whole. They do not tell an investor whether the probability of a joint extreme rises in a funding crisis like that of 2008. And if the CAT bond series is an index of quoted prices, as in most of this literature, its volatility is understated and its risk-adjusted performance overstated (Getmansky et al., 2004).</w:t>
       </w:r>
     </w:p>
     <w:bookmarkEnd w:id="25"/>
@@ -494,7 +535,7 @@
         <w:pStyle w:val="FirstParagraph"/>
       </w:pPr>
       <w:r>
-        <w:t xml:space="preserve">Two studies of CAT bond prices take the opposite side. Gürtler et al. (2016) analyse premiums in the secondary market and find that both the financial crisis and Hurricane Katrina had a significant effect on them. They also find a positive relation between corporate bond spreads and CAT bond premiums, a dependence that grew stronger during the crisis, and conclude that CAT bonds should not be regarded as zero-beta securities. Braun (2016), who models spreads at issuance, finds that apart from the expected loss, the covered territory, the sponsor and the reinsurance cycle, the spreads of comparably rated corporate bonds help explain CAT bond spreads. These two studies concern the price of risk and say nothing directly about realized losses. They show that the premium investors demand for catastrophe risk moves with the premium they demand for credit risk.</w:t>
+        <w:t xml:space="preserve">Two studies of CAT bond prices take the opposite side. Gürtler et al. (2016) analyse premiums in the secondary market and find that both the financial crisis and Hurricane Katrina had a significant effect on them. They also find a positive relation between corporate bond spreads and CAT bond premiums, a dependence that grew stronger during the crisis, and conclude that CAT bonds should not be regarded as zero-beta securities. Braun (2016), who models spreads at issuance, finds that apart from the expected loss, the covered territory, the sponsor and the reinsurance cycle, the spreads of comparably rated corporate bonds help explain CAT bond spreads. These two studies concern the price of risk and say nothing directly about realized losses. They show that the premium investors demand for catastrophe risk moves with the premium they demand for credit risk, outside crises as well as during them.</w:t>
       </w:r>
     </w:p>
     <w:p>
@@ -502,7 +543,7 @@
         <w:pStyle w:val="BodyText"/>
       </w:pPr>
       <w:r>
-        <w:t xml:space="preserve">A recent study supports the favourable view for a later crisis. Feng and Zeng (2025) apply a DCC-GARCH model to an international multi-asset portfolio before and during the COVID-19 pandemic. They find that CAT bonds were a diversifier over the whole sample and a safe haven against stocks and private equity after the outbreak. The results hold with desmoothed returns, which addresses the quote-smoothing problem described above, but the authors also find that hedge ratios are sensitive to extreme weather events. Market reports from March 2020 show what the stress looked like inside the CAT bond market: the Swiss Re price return index fell by 0.81 percent in the week to 20 March, with markdowns linked to bulk lists of bonds put up for sale (Insurance Insider ILS, 2020).</w:t>
+        <w:t xml:space="preserve">A recent study supports the favourable view for a later crisis. Feng and Zeng (2025) apply a DCC-GARCH model to an international multi-asset portfolio before and during the COVID-19 pandemic. They find that CAT bonds were a diversifier over the whole sample and a safe haven against stocks and private equity after the outbreak. The results hold with desmoothed returns, which addresses the quote-smoothing problem described above, but the authors also find that hedge ratios are sensitive to extreme weather events.</w:t>
       </w:r>
     </w:p>
     <w:p>
@@ -510,7 +551,7 @@
         <w:pStyle w:val="BodyText"/>
       </w:pPr>
       <w:r>
-        <w:t xml:space="preserve">The same period produced a case in which the zero-beta argument fails by design. The World Bank’s pandemic bonds, issued in 2017 for its Pandemic Emergency Financing Facility, put 16.67 percent of the principal of the Class A notes and all of the principal of the Class B notes at risk if a qualifying pandemic occurred (Government Actuary’s Department, 2021). COVID-19 met the trigger conditions in 2020, during the same shock that hit equity markets. When the insured peril is itself a macroeconomic shock, the insurance losses and the market move together, and no collateral rule can separate them.</w:t>
+        <w:t xml:space="preserve">The same period produced a case in which the zero-beta argument fails by design. The World Bank’s 2017 pandemic bonds put 16.67 percent of the principal of the Class A notes and all of the principal of the Class B notes at risk if a qualifying pandemic occurred (Government Actuary’s Department, 2021), and COVID-19 met the trigger conditions during the same shock that hit equity markets.</w:t>
       </w:r>
     </w:p>
     <w:p>
@@ -730,7 +771,7 @@
                 <w:b/>
                 <w:sz w:val="19"/>
               </w:rPr>
-              <w:t xml:space="preserve">Comparison assets</w:t>
+              <w:t xml:space="preserve">Data</w:t>
             </w:r>
           </w:p>
         </w:tc>
@@ -749,7 +790,7 @@
                 <w:rFonts w:ascii="Times New Roman" w:hAnsi="Times New Roman"/>
                 <w:sz w:val="19"/>
               </w:rPr>
-              <w:t xml:space="preserve">Stocks, corporate bonds, government bonds</w:t>
+              <w:t xml:space="preserve">CAT bonds vs stocks, corporate bonds, government bonds; Jan. 2002 to Oct. 2013</w:t>
             </w:r>
           </w:p>
         </w:tc>
@@ -768,7 +809,7 @@
                 <w:rFonts w:ascii="Times New Roman" w:hAnsi="Times New Roman"/>
                 <w:sz w:val="19"/>
               </w:rPr>
-              <w:t xml:space="preserve">Global stocks, bonds, real estate, commodities, private equity, infrastructure</w:t>
+              <w:t xml:space="preserve">Swiss Re index vs global stocks, bonds, real estate, commodities, private equity, infrastructure; weekly, 2002 to 2018</w:t>
             </w:r>
           </w:p>
         </w:tc>
@@ -787,7 +828,7 @@
                 <w:rFonts w:ascii="Times New Roman" w:hAnsi="Times New Roman"/>
                 <w:sz w:val="19"/>
               </w:rPr>
-              <w:t xml:space="preserve">Six stock indices (CAC 40, DJIA, EURO STOXX 50, FTSE 100, Hang Seng, Nikkei 225)</w:t>
+              <w:t xml:space="preserve">CAT bonds and six stock indices (CAC 40, DJIA, EURO STOXX 50, FTSE 100, Hang Seng, Nikkei 225)</w:t>
             </w:r>
           </w:p>
         </w:tc>
@@ -809,7 +850,7 @@
                 <w:b/>
                 <w:sz w:val="19"/>
               </w:rPr>
-              <w:t xml:space="preserve">Method</w:t>
+              <w:t xml:space="preserve">Method and statistic</w:t>
             </w:r>
           </w:p>
         </w:tc>
@@ -967,85 +1008,6 @@
                 <w:b/>
                 <w:sz w:val="19"/>
               </w:rPr>
-              <w:t xml:space="preserve">Statistic</w:t>
-            </w:r>
-          </w:p>
-        </w:tc>
-        <w:tc>
-          <w:tcPr>
-            <w:tcW w:type="dxa" w:w="2633"/>
-          </w:tcPr>
-          <w:p>
-            <w:pPr>
-              <w:pStyle w:val="Compact"/>
-              <w:spacing w:after="40" w:line="240" w:lineRule="auto"/>
-              <w:jc w:val="left"/>
-            </w:pPr>
-            <w:r>
-              <w:rPr>
-                <w:rFonts w:ascii="Times New Roman" w:hAnsi="Times New Roman"/>
-                <w:sz w:val="19"/>
-              </w:rPr>
-              <w:t xml:space="preserve">Beta</w:t>
-            </w:r>
-          </w:p>
-        </w:tc>
-        <w:tc>
-          <w:tcPr>
-            <w:tcW w:type="dxa" w:w="2633"/>
-          </w:tcPr>
-          <w:p>
-            <w:pPr>
-              <w:pStyle w:val="Compact"/>
-              <w:spacing w:after="40" w:line="240" w:lineRule="auto"/>
-              <w:jc w:val="left"/>
-            </w:pPr>
-            <w:r>
-              <w:rPr>
-                <w:rFonts w:ascii="Times New Roman" w:hAnsi="Times New Roman"/>
-                <w:sz w:val="19"/>
-              </w:rPr>
-              <w:t xml:space="preserve">Conditional correlation</w:t>
-            </w:r>
-          </w:p>
-        </w:tc>
-        <w:tc>
-          <w:tcPr>
-            <w:tcW w:type="dxa" w:w="2633"/>
-          </w:tcPr>
-          <w:p>
-            <w:pPr>
-              <w:pStyle w:val="Compact"/>
-              <w:spacing w:after="40" w:line="240" w:lineRule="auto"/>
-              <w:jc w:val="left"/>
-            </w:pPr>
-            <w:r>
-              <w:rPr>
-                <w:rFonts w:ascii="Times New Roman" w:hAnsi="Times New Roman"/>
-                <w:sz w:val="19"/>
-              </w:rPr>
-              <w:t xml:space="preserve">Copula dependence</w:t>
-            </w:r>
-          </w:p>
-        </w:tc>
-      </w:tr>
-      <w:tr>
-        <w:tc>
-          <w:tcPr>
-            <w:tcW w:type="dxa" w:w="1505"/>
-          </w:tcPr>
-          <w:p>
-            <w:pPr>
-              <w:pStyle w:val="Compact"/>
-              <w:spacing w:after="40" w:line="240" w:lineRule="auto"/>
-              <w:jc w:val="left"/>
-            </w:pPr>
-            <w:r>
-              <w:rPr>
-                <w:rFonts w:ascii="Times New Roman" w:hAnsi="Times New Roman"/>
-                <w:b/>
-                <w:sz w:val="19"/>
-              </w:rPr>
               <w:t xml:space="preserve">Main conclusion</w:t>
             </w:r>
           </w:p>
@@ -1065,7 +1027,7 @@
                 <w:rFonts w:ascii="Times New Roman" w:hAnsi="Times New Roman"/>
                 <w:sz w:val="19"/>
               </w:rPr>
-              <w:t xml:space="preserve">Zero-beta only outside crises; less affected than other assets; betas back to pre-crisis levels after the 2009 structures</w:t>
+              <w:t xml:space="preserve">Zero-beta only outside crises; small crisis effect; betas back to pre-crisis levels after the 2009 structures</w:t>
             </w:r>
           </w:p>
         </w:tc>
@@ -1108,6 +1070,85 @@
           </w:p>
         </w:tc>
       </w:tr>
+      <w:tr>
+        <w:tc>
+          <w:tcPr>
+            <w:tcW w:type="dxa" w:w="1505"/>
+          </w:tcPr>
+          <w:p>
+            <w:pPr>
+              <w:pStyle w:val="Compact"/>
+              <w:spacing w:after="40" w:line="240" w:lineRule="auto"/>
+              <w:jc w:val="left"/>
+            </w:pPr>
+            <w:r>
+              <w:rPr>
+                <w:rFonts w:ascii="Times New Roman" w:hAnsi="Times New Roman"/>
+                <w:b/>
+                <w:sz w:val="19"/>
+              </w:rPr>
+              <w:t xml:space="preserve">Position on the zero-beta claim</w:t>
+            </w:r>
+          </w:p>
+        </w:tc>
+        <w:tc>
+          <w:tcPr>
+            <w:tcW w:type="dxa" w:w="2633"/>
+          </w:tcPr>
+          <w:p>
+            <w:pPr>
+              <w:pStyle w:val="Compact"/>
+              <w:spacing w:after="40" w:line="240" w:lineRule="auto"/>
+              <w:jc w:val="left"/>
+            </w:pPr>
+            <w:r>
+              <w:rPr>
+                <w:rFonts w:ascii="Times New Roman" w:hAnsi="Times New Roman"/>
+                <w:sz w:val="19"/>
+              </w:rPr>
+              <w:t xml:space="preserve">Holds in normal times (weak hedge), fails after Lehman</w:t>
+            </w:r>
+          </w:p>
+        </w:tc>
+        <w:tc>
+          <w:tcPr>
+            <w:tcW w:type="dxa" w:w="2633"/>
+          </w:tcPr>
+          <w:p>
+            <w:pPr>
+              <w:pStyle w:val="Compact"/>
+              <w:spacing w:after="40" w:line="240" w:lineRule="auto"/>
+              <w:jc w:val="left"/>
+            </w:pPr>
+            <w:r>
+              <w:rPr>
+                <w:rFonts w:ascii="Times New Roman" w:hAnsi="Times New Roman"/>
+                <w:sz w:val="19"/>
+              </w:rPr>
+              <w:t xml:space="preserve">Rejected on average (positive correlation), partly restored in post-crisis stress</w:t>
+            </w:r>
+          </w:p>
+        </w:tc>
+        <w:tc>
+          <w:tcPr>
+            <w:tcW w:type="dxa" w:w="2633"/>
+          </w:tcPr>
+          <w:p>
+            <w:pPr>
+              <w:pStyle w:val="Compact"/>
+              <w:spacing w:after="40" w:line="240" w:lineRule="auto"/>
+              <w:jc w:val="left"/>
+            </w:pPr>
+            <w:r>
+              <w:rPr>
+                <w:rFonts w:ascii="Times New Roman" w:hAnsi="Times New Roman"/>
+                <w:sz w:val="19"/>
+              </w:rPr>
+              <w:t xml:space="preserve">Supported for extreme co-movement with equities</w:t>
+            </w:r>
+          </w:p>
+        </w:tc>
+      </w:tr>
     </w:tbl>
     <w:bookmarkEnd w:id="26"/>
     <w:bookmarkEnd w:id="27"/>
@@ -1134,7 +1175,7 @@
         <w:pStyle w:val="FirstParagraph"/>
       </w:pPr>
       <w:r>
-        <w:t xml:space="preserve">All the studies find that CAT bonds diversify a portfolio on average. Carayannopoulos and Perez show it through near-zero betas outside crises, Drobetz et al. and Feng and Zeng through their diversifier result, and Haffar and Le Fur through weak dependence with stock markets. None of them finds that CAT bonds are a hedge. The disagreement sits in one place, the behaviour of CAT bonds under financial stress. Carayannopoulos and Perez and Gürtler et al. find that CAT bonds moved with markets in the 2007-2009 crisis. Drobetz et al. find a strong safe haven against stocks only after that crisis, Feng and Zeng find a safe haven after the COVID-19 outbreak, and Haffar and Le Fur find little extreme co-movement over their sample.</w:t>
+        <w:t xml:space="preserve">The contradictions are of two kinds. The first concerns average behaviour. Outside crises, Carayannopoulos and Perez cannot distinguish the beta of CAT bonds from zero, which makes CAT bonds a weak hedge in Baur and Lucey’s terms. Drobetz et al. find a positive average correlation, which makes them a diversifier but a poor hedge. Gürtler et al. and Braun find that CAT bond premiums move with corporate spreads even outside crises. The second and sharper contradiction concerns stress. Carayannopoulos and Perez and Gürtler et al. find that CAT bonds moved with markets in the 2007-2009 crisis. Drobetz et al. find a strong safe haven against stocks only after that crisis, Feng and Zeng find a safe haven after the COVID-19 outbreak, and Haffar and Le Fur find the weakest extreme co-movement with equities of all the assets they study. On one point all the studies agree: CAT bonds lower portfolio risk on average, whether they are classed as a weak hedge or as a diversifier.</w:t>
       </w:r>
     </w:p>
     <w:p>
@@ -1142,7 +1183,7 @@
         <w:pStyle w:val="BodyText"/>
       </w:pPr>
       <w:r>
-        <w:t xml:space="preserve">The negative findings come from the 2007-2009 crisis and the positive ones from later periods. Three explanations are available: the bonds changed, the crises differed, or the methods differed. My argument is that all three are true and that a simple decomposition can separate them.</w:t>
+        <w:t xml:space="preserve">The negative findings on stress come from 2007-2009 and the positive ones from later periods. Three explanations are available: the bonds changed, the crises differed, or the methods differed. A simpler account would say that 2008 was a special case and the rest is a matter of method. My argument is that all three explanations hold together, that a decomposition can separate them, and that it makes a prediction the simpler account does not make (Section 3.5).</w:t>
       </w:r>
     </w:p>
     <w:bookmarkEnd w:id="28"/>
@@ -1489,7 +1530,7 @@
         <w:t xml:space="preserve"> </w:t>
       </w:r>
       <w:r>
-        <w:t xml:space="preserve">is the change in the premium investors require to hold the bond,</w:t>
+        <w:t xml:space="preserve">is the change in the premium investors require above the expected loss,</w:t>
       </w:r>
       <w:r>
         <w:t xml:space="preserve"> </w:t>
@@ -1527,7 +1568,45 @@
         <w:t xml:space="preserve"> </w:t>
       </w:r>
       <w:r>
-        <w:t xml:space="preserve">is the loss in collateral value caused by the failure of a counterparty or a fall in the value of the collateral assets.</w:t>
+        <w:t xml:space="preserve">is the loss in collateral value caused by the failure of a counterparty or a fall in the value of the collateral assets. Defining</w:t>
+      </w:r>
+      <w:r>
+        <w:t xml:space="preserve"> </w:t>
+      </w:r>
+      <w:r>
+        <w:rPr>
+          <w:iCs/>
+          <w:i/>
+        </w:rPr>
+        <w:t xml:space="preserve">π</w:t>
+      </w:r>
+      <w:r>
+        <w:t xml:space="preserve"> </w:t>
+      </w:r>
+      <w:r>
+        <w:t xml:space="preserve">net of the expected loss keeps a revision of the expected loss in</w:t>
+      </w:r>
+      <w:r>
+        <w:t xml:space="preserve"> </w:t>
+      </w:r>
+      <w:r>
+        <w:rPr>
+          <w:iCs/>
+          <w:i/>
+        </w:rPr>
+        <w:t xml:space="preserve">ℓ</w:t>
+      </w:r>
+      <w:r>
+        <w:rPr>
+          <w:vertAlign w:val="subscript"/>
+        </w:rPr>
+        <w:t xml:space="preserve">t</w:t>
+      </w:r>
+      <w:r>
+        <w:t xml:space="preserve"> </w:t>
+      </w:r>
+      <w:r>
+        <w:t xml:space="preserve">only.</w:t>
       </w:r>
     </w:p>
     <w:p>
@@ -1842,7 +1921,7 @@
         <w:pStyle w:val="BodyText"/>
       </w:pPr>
       <w:r>
-        <w:t xml:space="preserve">The zero-beta argument concerns</w:t>
+        <w:t xml:space="preserve">The zero-beta argument is an assumption about</w:t>
       </w:r>
       <w:r>
         <w:t xml:space="preserve"> </w:t>
@@ -1864,7 +1943,7 @@
         <w:t xml:space="preserve"> </w:t>
       </w:r>
       <w:r>
-        <w:t xml:space="preserve">only: natural catastrophes are independent of financial markets, so</w:t>
+        <w:t xml:space="preserve">only: natural catastrophes do not depend on financial markets, so</w:t>
       </w:r>
       <w:r>
         <w:t xml:space="preserve"> </w:t>
@@ -2053,7 +2132,7 @@
         <w:pStyle w:val="BodyText"/>
       </w:pPr>
       <w:r>
-        <w:t xml:space="preserve">The measured beta of a natural-catastrophe bond is therefore the beta of its financial wrapper, not of its insurance risk. I call the first term the</w:t>
+        <w:t xml:space="preserve">Under this assumption, the measured beta of a natural-catastrophe bond is the beta of its financial wrapper. I call the first term the</w:t>
       </w:r>
       <w:r>
         <w:t xml:space="preserve"> </w:t>
@@ -2120,7 +2199,116 @@
         <w:t xml:space="preserve"> </w:t>
       </w:r>
       <w:r>
-        <w:t xml:space="preserve">&lt; 0), so both channels push the beta above zero in a crisis.</w:t>
+        <w:t xml:space="preserve">&lt; 0), so both channels push the beta above zero in a crisis. The split follows the distinction of Campbell and Vuolteenaho (2004) between cash-flow beta and discount-rate beta:</w:t>
+      </w:r>
+      <w:r>
+        <w:t xml:space="preserve"> </w:t>
+      </w:r>
+      <w:r>
+        <w:rPr>
+          <w:iCs/>
+          <w:i/>
+        </w:rPr>
+        <w:t xml:space="preserve">ℓ</w:t>
+      </w:r>
+      <w:r>
+        <w:rPr>
+          <w:vertAlign w:val="subscript"/>
+        </w:rPr>
+        <w:t xml:space="preserve">t</w:t>
+      </w:r>
+      <w:r>
+        <w:t xml:space="preserve"> </w:t>
+      </w:r>
+      <w:r>
+        <w:t xml:space="preserve">and</w:t>
+      </w:r>
+      <w:r>
+        <w:t xml:space="preserve"> </w:t>
+      </w:r>
+      <w:r>
+        <w:rPr>
+          <w:iCs/>
+          <w:i/>
+        </w:rPr>
+        <w:t xml:space="preserve">k</w:t>
+      </w:r>
+      <w:r>
+        <w:rPr>
+          <w:vertAlign w:val="subscript"/>
+        </w:rPr>
+        <w:t xml:space="preserve">t</w:t>
+      </w:r>
+      <w:r>
+        <w:t xml:space="preserve"> </w:t>
+      </w:r>
+      <w:r>
+        <w:t xml:space="preserve">are cash-flow news, Δ</w:t>
+      </w:r>
+      <w:r>
+        <w:rPr>
+          <w:iCs/>
+          <w:i/>
+        </w:rPr>
+        <w:t xml:space="preserve">π</w:t>
+      </w:r>
+      <w:r>
+        <w:rPr>
+          <w:vertAlign w:val="subscript"/>
+        </w:rPr>
+        <w:t xml:space="preserve">t</w:t>
+      </w:r>
+      <w:r>
+        <w:t xml:space="preserve"> </w:t>
+      </w:r>
+      <w:r>
+        <w:t xml:space="preserve">is discount-rate news. That distinction matters for investors. A price fall caused by a higher premium is recovered as the bond approaches maturity if no catastrophe occurs, so it is a loss mainly for a holder who has to sell.</w:t>
+      </w:r>
+    </w:p>
+    <w:p>
+      <w:pPr>
+        <w:pStyle w:val="BodyText"/>
+      </w:pPr>
+      <w:r>
+        <w:t xml:space="preserve">Two qualifications apply. A very large catastrophe can move a regional stock market, as the Tōhoku earthquake of March 2011 moved Japanese equities, so against a regional benchmark</w:t>
+      </w:r>
+      <w:r>
+        <w:t xml:space="preserve"> </w:t>
+      </w:r>
+      <w:r>
+        <w:rPr>
+          <w:iCs/>
+          <w:i/>
+        </w:rPr>
+        <w:t xml:space="preserve">β</w:t>
+      </w:r>
+      <w:r>
+        <w:rPr>
+          <w:vertAlign w:val="subscript"/>
+        </w:rPr>
+        <w:t xml:space="preserve">ℓ</w:t>
+      </w:r>
+      <w:r>
+        <w:t xml:space="preserve"> </w:t>
+      </w:r>
+      <w:r>
+        <w:t xml:space="preserve">is small rather than exactly zero. And the premium channel is not free of catastrophe risk in every sense, since</w:t>
+      </w:r>
+      <w:r>
+        <w:t xml:space="preserve"> </w:t>
+      </w:r>
+      <w:r>
+        <w:rPr>
+          <w:iCs/>
+          <w:i/>
+        </w:rPr>
+        <w:t xml:space="preserve">π</w:t>
+      </w:r>
+      <w:r>
+        <w:t xml:space="preserve"> </w:t>
+      </w:r>
+      <w:r>
+        <w:t xml:space="preserve">is the price investors charge for bearing it. What the decomposition separates is the occurrence of catastrophes, which markets do not drive, from the price and the packaging of catastrophe risk, which they can.</w:t>
       </w:r>
     </w:p>
     <w:p>
@@ -2140,7 +2328,7 @@
         <w:pStyle w:val="Compact"/>
       </w:pPr>
       <w:r>
-        <w:t xml:space="preserve">In calm markets neither the premium nor the collateral moves with the market, so</w:t>
+        <w:t xml:space="preserve">In calm markets the collateral channel is closed and the premium moves little, so</w:t>
       </w:r>
       <w:r>
         <w:t xml:space="preserve"> </w:t>
@@ -2156,7 +2344,7 @@
         <w:t xml:space="preserve"> </w:t>
       </w:r>
       <w:r>
-        <w:t xml:space="preserve">≈ 0. This is the zero-beta result that every study finds outside crises.</w:t>
+        <w:t xml:space="preserve">is small. It need not be exactly zero: the link between CAT premiums and corporate spreads found by Gürtler et al. (2016) and Braun (2016) exists outside crises, which is consistent with the positive average correlation found by Drobetz et al. (2020).</w:t>
       </w:r>
     </w:p>
     <w:p>
@@ -2168,7 +2356,7 @@
         <w:pStyle w:val="Compact"/>
       </w:pPr>
       <w:r>
-        <w:t xml:space="preserve">The collateral channel is open only when the collateral is exposed to the credit of a financial institution. It was open before 2009 and is close to closed for deals whose collateral is held in Treasury instruments.</w:t>
+        <w:t xml:space="preserve">The collateral channel is open only when the collateral is exposed to the credit of a financial institution. It was open before 2009 and is close to closed for deals whose collateral is held in Treasury money-market funds.</w:t>
       </w:r>
     </w:p>
     <w:p>
@@ -2180,7 +2368,7 @@
         <w:pStyle w:val="Compact"/>
       </w:pPr>
       <w:r>
-        <w:t xml:space="preserve">The premium channel opens when holders of CAT bonds need cash at the moment the market falls. They sell, and dealers short of capital absorb the bonds only at a higher premium. Brunnermeier and Pedersen (2009) show why this happens together with a market decline: when funding is scarce, market liquidity and funding liquidity reinforce each other. Herrmann and Hibbeln’s (2023) estimate that liquidity accounts for about a fifth of CAT bond spreads shows that this channel has room to move prices. The same channel covers the evidence of Gürtler et al. (2016) and Braun (2016): if the capital available to bear catastrophe risk shrinks with financial wealth, the price of catastrophe risk rises when credit spreads rise, as Froot’s (2001) account of capital-driven catastrophe pricing would predict.</w:t>
+        <w:t xml:space="preserve">The premium channel opens when holders of CAT bonds need cash at the moment the market falls. They sell, and dealers short of capital absorb the bonds only at a higher premium. When funding is scarce, market liquidity and funding liquidity reinforce each other (Brunnermeier and Pedersen, 2009), and when capital moves slowly into a market after such a shock, prices fall further than fundamentals justify and then recover gradually (Duffie, 2010). Herrmann and Hibbeln’s (2023) estimate that liquidity accounts for about a fifth of CAT bond spreads shows that this channel has room to move prices. The same channel covers the evidence of Gürtler et al. and Braun: if the capital available to bear catastrophe risk shrinks with financial wealth, the price of catastrophe risk rises when credit spreads rise, as Froot’s (2001) account of capital-driven catastrophe pricing would predict.</w:t>
       </w:r>
     </w:p>
     <w:p>
@@ -2390,7 +2578,7 @@
                 <w:rFonts w:ascii="Times New Roman" w:hAnsi="Times New Roman"/>
                 <w:sz w:val="19"/>
               </w:rPr>
-              <w:t xml:space="preserve">the subprime crisis after Lehman’s failure (Carayannopoulos and Perez, 2015; Gürtler et al., 2016); the four Lehman-backed bonds.</w:t>
+              <w:t xml:space="preserve">the crisis after Lehman’s failure (Carayannopoulos and Perez, 2015; Gürtler et al., 2016); the four Lehman-backed bonds.</w:t>
             </w:r>
           </w:p>
         </w:tc>
@@ -2425,7 +2613,7 @@
                 <w:i/>
                 <w:sz w:val="19"/>
               </w:rPr>
-              <w:t xml:space="preserve">Evidence:</w:t>
+              <w:t xml:space="preserve">Indirect evidence:</w:t>
             </w:r>
             <w:r>
               <w:rPr>
@@ -2439,7 +2627,7 @@
                 <w:rFonts w:ascii="Times New Roman" w:hAnsi="Times New Roman"/>
                 <w:sz w:val="19"/>
               </w:rPr>
-              <w:t xml:space="preserve">zero betas outside the crisis (Carayannopoulos and Perez, 2015).</w:t>
+              <w:t xml:space="preserve">zero betas in non-crisis periods (Carayannopoulos and Perez, 2015).</w:t>
             </w:r>
           </w:p>
         </w:tc>
@@ -2462,7 +2650,7 @@
                 <w:b/>
                 <w:sz w:val="19"/>
               </w:rPr>
-              <w:t xml:space="preserve">Collateral in short-term Treasury instruments (post-2009)</w:t>
+              <w:t xml:space="preserve">Collateral in Treasury money-market funds (post-2009)</w:t>
             </w:r>
           </w:p>
         </w:tc>
@@ -2481,7 +2669,7 @@
                 <w:rFonts w:ascii="Times New Roman" w:hAnsi="Times New Roman"/>
                 <w:sz w:val="19"/>
               </w:rPr>
-              <w:t xml:space="preserve">Premium channel only: a small, short-lived drop; at most a weak safe haven.</w:t>
+              <w:t xml:space="preserve">Premium channel only: a small fall, later reversed; at most a weak safe haven.</w:t>
             </w:r>
             <w:r>
               <w:rPr>
@@ -2511,7 +2699,7 @@
                 <w:rFonts w:ascii="Times New Roman" w:hAnsi="Times New Roman"/>
                 <w:sz w:val="19"/>
               </w:rPr>
-              <w:t xml:space="preserve">March 2020 (a 0.81 percent fall in the week to 20 March, bid lists); safe haven against stocks after the outbreak (Feng and Zeng, 2025).</w:t>
+              <w:t xml:space="preserve">safe haven against stocks after the COVID-19 outbreak, with desmoothed returns (Feng and Zeng, 2025); March 2020 market reports.</w:t>
             </w:r>
           </w:p>
         </w:tc>
@@ -2560,7 +2748,7 @@
                 <w:rFonts w:ascii="Times New Roman" w:hAnsi="Times New Roman"/>
                 <w:sz w:val="19"/>
               </w:rPr>
-              <w:t xml:space="preserve">strong post-crisis safe haven against stocks (Drobetz et al., 2020), possibly helped by index smoothing.</w:t>
+              <w:t xml:space="preserve">strong post-crisis safe haven against stocks (Drobetz et al., 2020), whose strong form the grid does not explain.</w:t>
             </w:r>
           </w:p>
         </w:tc>
@@ -2572,7 +2760,7 @@
         <w:spacing w:before="160"/>
       </w:pPr>
       <w:r>
-        <w:t xml:space="preserve">Each of the main results falls in one cell of the grid, so none of the studies needs to be wrong.</w:t>
+        <w:t xml:space="preserve">Each of the main results can be placed in one cell. Since the grid was built after reading the evidence, this fit is not a test; it shows that the results are compatible, and Section 3.5 states how the grid could be proved wrong.</w:t>
       </w:r>
     </w:p>
     <w:p>
@@ -2580,7 +2768,7 @@
         <w:pStyle w:val="BodyText"/>
       </w:pPr>
       <w:r>
-        <w:t xml:space="preserve">The top-left cell contains one episode, the months after Lehman’s failure, when both channels were open. The crisis betas of Carayannopoulos and Perez and the link between CAT premiums and corporate spreads found by Gürtler et al. are what equation (3) predicts there. In that episode, much of the market exposure of CAT bonds came from a collateral design that the market has since abandoned.</w:t>
+        <w:t xml:space="preserve">The top-left cell contains one episode, the months after Lehman’s failure, when both channels were open. The crisis betas of Carayannopoulos and Perez and the link between CAT premiums and corporate spreads found by Gürtler et al. are what equation (3) predicts there. Carayannopoulos and Perez attribute much of the crisis effect to the collateral design that the market has since abandoned, but none of the reviewed evidence splits the crisis beta between the two channels.</w:t>
       </w:r>
     </w:p>
     <w:p>
@@ -2588,7 +2776,7 @@
         <w:pStyle w:val="BodyText"/>
       </w:pPr>
       <w:r>
-        <w:t xml:space="preserve">The post-crisis safe haven of Drobetz et al. belongs to the bottom-right cell. After 2009 the collateral channel was closed, and in my reading the stock market declines of their post-crisis sample were not accompanied by forced selling on the scale of late 2008, so the premium channel stayed weak. The grid predicts a beta close to zero in this cell, which makes CAT bonds at least a weak safe haven. The strong form that Drobetz et al. report, a fall in the correlation during extreme weeks, needs more than that, and part of it may be statistical: an index of quotes that lags the market shows a lower correlation in exactly the weeks when the market moves most (Section 3.4). In their crisis sub-period both channels were open, so the absence of a safe haven there is what the grid predicts. For the pre-crisis sub-period the grid predicts at most a weak safe haven, which is compatible with the absence of the strong form.</w:t>
+        <w:t xml:space="preserve">The post-crisis safe haven of Drobetz et al. belongs to the bottom-right cell. After 2009 the collateral channel was closed, and in my reading the stock market declines of their post-crisis sample did not bring forced selling on the scale of late 2008, so the premium channel stayed weak and CAT bonds should be at least a weak safe haven. The grid does not predict the strong form that Drobetz et al. report, a significant fall in the correlation during extreme weeks. Equation (3) produces it only if the required premium falls when stocks fall, for instance through inflows into CAT bonds during an equity sell-off, which the reviewed evidence does not document. Index smoothing cannot explain it either, since the same index is used in every sub-period. This part of their result is left open. In their crisis sub-period both channels were open, so the absence of a safe haven there is what the grid predicts.</w:t>
       </w:r>
     </w:p>
     <w:p>
@@ -2596,7 +2784,7 @@
         <w:pStyle w:val="BodyText"/>
       </w:pPr>
       <w:r>
-        <w:t xml:space="preserve">March 2020 is the test of the bottom-left cell: Treasury collateral combined with a severe scramble for cash. The framework predicts a small, short-lived fall driven by forced sales and no loss on collateral. That is what the market reports and Feng and Zeng’s results describe. Prices fell by less than one percent in the week to 20 March, at the height of the scramble for cash, the markdowns came from bid lists of sellers, and Feng and Zeng still classify CAT bonds as a safe haven against stocks after the outbreak. The episode also shows why the statistical and economic meanings of a safe haven must be kept apart. A bond can qualify as a statistical safe haven in a regression on extreme weeks and still post a negative return in the week an investor needed to sell it.</w:t>
+        <w:t xml:space="preserve">March 2020 is the main test of the bottom-left cell: collateral in Treasury funds combined with a severe scramble for cash. The framework predicts a fall driven by forced sales, no loss on collateral, and a recovery once capital returns. The best evidence is Feng and Zeng’s, because it holds with desmoothed returns: CAT bonds remained a safe haven against stocks after the outbreak. Market reports agree. The Swiss Re price return index fell by 0.81 percent in the week to 20 March, with markdowns linked to bulk lists of bonds put up for sale (Insurance Insider ILS, 2020), and by May the sell-off was described as temporary (The Insurer, 2020). Because that index is built from quotes, the true fall was probably larger. The decomposition can still give it an order of magnitude: with a spread duration of one to two years, as for bonds with a few years to maturity, a 0.81 percent price fall corresponds to a rise of roughly 40 to 80 basis points in the required premium, which is of the same order as the average liquidity premium estimated by Herrmann and Hibbeln (2023). A bond can thus qualify as a statistical safe haven and still post a negative return in the week an investor needed to sell it.</w:t>
       </w:r>
     </w:p>
     <w:p>
@@ -2604,7 +2792,15 @@
         <w:pStyle w:val="BodyText"/>
       </w:pPr>
       <w:r>
-        <w:t xml:space="preserve">Haffar and Le Fur’s result reads, in this grid, as an average over the cells. An estimate over a full sample is dominated by calm weeks and, for post-2009 data, by the bottom row, so the dependence it measures is low. The grid predicts that the same copula estimated on the top-left cell alone would show stronger tail dependence.</w:t>
+        <w:t xml:space="preserve">The post-2009 period contains other candidates for this cell that the reviewed studies do not isolate: the strains on euro-area bank funding in 2011-2012, and September-October 2022, when stress in UK pension funds’ liability-driven investment strategies coincided with Hurricane Ian’s landfall in Florida on 28 September, a repeat of the Ike-Lehman coincidence.</w:t>
+      </w:r>
+    </w:p>
+    <w:p>
+      <w:pPr>
+        <w:pStyle w:val="BodyText"/>
+      </w:pPr>
+      <w:r>
+        <w:t xml:space="preserve">Haffar and Le Fur’s result reads, in this grid, as an average over the cells, dominated by calm weeks. The grid predicts stronger tail dependence in funding-crisis weeks alone.</w:t>
       </w:r>
     </w:p>
     <w:bookmarkEnd w:id="30"/>
@@ -2622,7 +2818,7 @@
         <w:pStyle w:val="FirstParagraph"/>
       </w:pPr>
       <w:r>
-        <w:t xml:space="preserve">The grid explains why the economic answer changes from one episode to the next. Part of the divergence between the articles is statistical, and here two biases pull in opposite directions.</w:t>
+        <w:t xml:space="preserve">Part of the divergence between the articles is statistical, and two biases pull in opposite directions.</w:t>
       </w:r>
     </w:p>
     <w:p>
@@ -2741,7 +2937,7 @@
         <w:t xml:space="preserve"> </w:t>
       </w:r>
       <w:r>
-        <w:t xml:space="preserve">+ … with weights summing to one (Getmansky et al., 2004). The contemporaneous covariance with the market is then</w:t>
+        <w:t xml:space="preserve">+ … with weights summing to one (Getmansky et al., 2004). If the true returns are serially uncorrelated, the contemporaneous beta is</w:t>
       </w:r>
       <w:r>
         <w:t xml:space="preserve"> </w:t>
@@ -2763,7 +2959,7 @@
         <w:t xml:space="preserve"> </w:t>
       </w:r>
       <w:r>
-        <w:t xml:space="preserve">times the true covariance, so weekly betas and correlations are biased toward zero. The bias is probably largest in a crisis, when quotes are updated less often and</w:t>
+        <w:t xml:space="preserve">times the true beta, and the correlation is scaled by</w:t>
       </w:r>
       <w:r>
         <w:t xml:space="preserve"> </w:t>
@@ -2782,10 +2978,23 @@
         <w:t xml:space="preserve">0</w:t>
       </w:r>
       <w:r>
-        <w:t xml:space="preserve"> </w:t>
-      </w:r>
-      <w:r>
-        <w:t xml:space="preserve">falls. In a regression on extreme weeks, the lag lowers the measured correlation in exactly the weeks that define a safe haven, so this bias makes CAT bonds look more like a safe haven than they are.</w:t>
+        <w:t xml:space="preserve">/√(Σ</w:t>
+      </w:r>
+      <w:r>
+        <w:rPr>
+          <w:iCs/>
+          <w:i/>
+        </w:rPr>
+        <w:t xml:space="preserve">θ</w:t>
+      </w:r>
+      <w:r>
+        <w:rPr>
+          <w:vertAlign w:val="subscript"/>
+        </w:rPr>
+        <w:t xml:space="preserve">j</w:t>
+      </w:r>
+      <w:r>
+        <w:t xml:space="preserve">²), a smaller reduction because smoothing also lowers the measured volatility. Both are biased toward zero. The bias is probably largest in a crisis, when quotes are updated less often. It makes CAT bonds look more like a safe haven than they are. Dimson (1979) betas, which add lagged market returns to the regression, recover the covariance that a stale price misses.</w:t>
       </w:r>
     </w:p>
     <w:p>
@@ -2806,7 +3015,42 @@
         <w:t xml:space="preserve">conditioning on volatility</w:t>
       </w:r>
       <w:r>
-        <w:t xml:space="preserve">. When correlations are estimated in a crisis window or in extreme weeks, the market’s volatility is higher than usual, and since</w:t>
+        <w:t xml:space="preserve">. Suppose the CAT bond return is</w:t>
+      </w:r>
+      <w:r>
+        <w:t xml:space="preserve"> </w:t>
+      </w:r>
+      <w:r>
+        <w:rPr>
+          <w:iCs/>
+          <w:i/>
+        </w:rPr>
+        <w:t xml:space="preserve">β</w:t>
+      </w:r>
+      <w:r>
+        <w:t xml:space="preserve"> </w:t>
+      </w:r>
+      <w:r>
+        <w:t xml:space="preserve">times the market return plus an independent shock with volatility</w:t>
+      </w:r>
+      <w:r>
+        <w:t xml:space="preserve"> </w:t>
+      </w:r>
+      <w:r>
+        <w:rPr>
+          <w:iCs/>
+          <w:i/>
+        </w:rPr>
+        <w:t xml:space="preserve">σ</w:t>
+      </w:r>
+      <w:r>
+        <w:rPr>
+          <w:vertAlign w:val="subscript"/>
+        </w:rPr>
+        <w:t xml:space="preserve">ε</w:t>
+      </w:r>
+      <w:r>
+        <w:t xml:space="preserve">. The correlation is then</w:t>
       </w:r>
       <w:r>
         <w:t xml:space="preserve"> </w:t>
@@ -2851,7 +3095,17 @@
         <w:t xml:space="preserve">m</w:t>
       </w:r>
       <w:r>
-        <w:t xml:space="preserve">/</w:t>
+        <w:t xml:space="preserve">/√(</w:t>
+      </w:r>
+      <w:r>
+        <w:rPr>
+          <w:iCs/>
+          <w:i/>
+        </w:rPr>
+        <w:t xml:space="preserve">β</w:t>
+      </w:r>
+      <w:r>
+        <w:t xml:space="preserve">²</w:t>
       </w:r>
       <w:r>
         <w:rPr>
@@ -2864,10 +3118,67 @@
         <w:rPr>
           <w:vertAlign w:val="subscript"/>
         </w:rPr>
-        <w:t xml:space="preserve">CAT</w:t>
-      </w:r>
-      <w:r>
-        <w:t xml:space="preserve">, the correlation rises even when the beta has not changed (Forbes and Rigobon, 2002). This bias makes CAT bonds look less like a safe haven than they are.</w:t>
+        <w:t xml:space="preserve">m</w:t>
+      </w:r>
+      <w:r>
+        <w:t xml:space="preserve">² +</w:t>
+      </w:r>
+      <w:r>
+        <w:t xml:space="preserve"> </w:t>
+      </w:r>
+      <w:r>
+        <w:rPr>
+          <w:iCs/>
+          <w:i/>
+        </w:rPr>
+        <w:t xml:space="preserve">σ</w:t>
+      </w:r>
+      <w:r>
+        <w:rPr>
+          <w:vertAlign w:val="subscript"/>
+        </w:rPr>
+        <w:t xml:space="preserve">ε</w:t>
+      </w:r>
+      <w:r>
+        <w:t xml:space="preserve">²), which rises with the market’s volatility</w:t>
+      </w:r>
+      <w:r>
+        <w:t xml:space="preserve"> </w:t>
+      </w:r>
+      <w:r>
+        <w:rPr>
+          <w:iCs/>
+          <w:i/>
+        </w:rPr>
+        <w:t xml:space="preserve">σ</w:t>
+      </w:r>
+      <w:r>
+        <w:rPr>
+          <w:vertAlign w:val="subscript"/>
+        </w:rPr>
+        <w:t xml:space="preserve">m</w:t>
+      </w:r>
+      <w:r>
+        <w:t xml:space="preserve"> </w:t>
+      </w:r>
+      <w:r>
+        <w:t xml:space="preserve">whenever</w:t>
+      </w:r>
+      <w:r>
+        <w:t xml:space="preserve"> </w:t>
+      </w:r>
+      <w:r>
+        <w:rPr>
+          <w:iCs/>
+          <w:i/>
+        </w:rPr>
+        <w:t xml:space="preserve">β</w:t>
+      </w:r>
+      <w:r>
+        <w:t xml:space="preserve"> </w:t>
+      </w:r>
+      <w:r>
+        <w:t xml:space="preserve">&gt; 0 (Forbes and Rigobon, 2002). A correlation measured in a crisis window or in extreme weeks therefore overstates any co-movement that exists. If the true beta is zero, the bias disappears: conditioning on volatility can exaggerate co-movement, but it cannot create it.</w:t>
       </w:r>
     </w:p>
     <w:p>
@@ -2875,7 +3186,7 @@
         <w:pStyle w:val="BodyText"/>
       </w:pPr>
       <w:r>
-        <w:t xml:space="preserve">Which bias dominates depends on the method. A beta, as in Carayannopoulos and Perez, is free of the second bias but exposed to the first. A DCC regression on extreme weeks, as in Drobetz et al., is exposed to both. A copula on GARCH-filtered returns, as in Haffar and Le Fur, removes most of the second bias but still measures the dependence of observed, possibly smoothed, prices. Two further choices separate the studies: the comparison set (three bond and stock markets, six asset classes, or six stock indices) and the definition of stress (a calendar crisis window, extreme weeks of the other asset, or the tails of a copula). With this many differences in design, the articles would be expected to disagree even if they studied the same market history.</w:t>
+        <w:t xml:space="preserve">Which bias matters depends on the method. A beta, as in Carayannopoulos and Perez, is free of the second bias but exposed to the first. A DCC regression on extreme weeks, as in Drobetz et al., is exposed to both. A copula on GARCH-filtered returns, as in Haffar and Le Fur, is not protected from the second bias by the filtering, because dividing each series by its own volatility leaves their correlation unchanged; its contribution is to measure dependence in the tails, and it still works on observed, possibly smoothed, prices. The studies also differ in their comparison set and in their definition of stress (Table 1), so they would disagree even if they studied the same market history.</w:t>
       </w:r>
     </w:p>
     <w:bookmarkEnd w:id="31"/>
@@ -2893,25 +3204,17 @@
         <w:pStyle w:val="FirstParagraph"/>
       </w:pPr>
       <w:r>
-        <w:t xml:space="preserve">The decomposition leads to two sets of proposals. The first concerns the design of future tests, the second the rules that can make the diversification benefit more reliable for investors.</w:t>
-      </w:r>
-    </w:p>
-    <w:p>
-      <w:pPr>
-        <w:pStyle w:val="BodyText"/>
-      </w:pPr>
-      <w:r>
         <w:rPr>
           <w:bCs/>
           <w:b/>
         </w:rPr>
-        <w:t xml:space="preserve">A test design that addresses each source of divergence.</w:t>
-      </w:r>
-      <w:r>
-        <w:t xml:space="preserve"> </w:t>
-      </w:r>
-      <w:r>
-        <w:t xml:space="preserve">Without estimating anything here, the framework specifies the test that would settle the disagreement rather than add one more estimate to it.</w:t>
+        <w:t xml:space="preserve">Tests that could prove the framework wrong.</w:t>
+      </w:r>
+      <w:r>
+        <w:t xml:space="preserve"> </w:t>
+      </w:r>
+      <w:r>
+        <w:t xml:space="preserve">No estimation is done here, but the framework specifies tests that would settle the disagreement rather than add one more estimate to it.</w:t>
       </w:r>
     </w:p>
     <w:p>
@@ -2927,83 +3230,13 @@
           <w:iCs/>
           <w:i/>
         </w:rPr>
-        <w:t xml:space="preserve">Separate the components of the return.</w:t>
-      </w:r>
-      <w:r>
-        <w:t xml:space="preserve"> </w:t>
-      </w:r>
-      <w:r>
-        <w:t xml:space="preserve">Swiss Re publishes a price return index alongside the total return index. The price return excludes coupons, so the collateral yield and the contractual spread drop out and what is left is mainly −</w:t>
-      </w:r>
-      <w:r>
-        <w:rPr>
-          <w:iCs/>
-          <w:i/>
-        </w:rPr>
-        <w:t xml:space="preserve">ℓ</w:t>
-      </w:r>
-      <w:r>
-        <w:rPr>
-          <w:vertAlign w:val="subscript"/>
-        </w:rPr>
-        <w:t xml:space="preserve">t</w:t>
-      </w:r>
-      <w:r>
-        <w:t xml:space="preserve"> </w:t>
-      </w:r>
-      <w:r>
-        <w:t xml:space="preserve">−</w:t>
-      </w:r>
-      <w:r>
-        <w:t xml:space="preserve"> </w:t>
-      </w:r>
-      <w:r>
-        <w:rPr>
-          <w:iCs/>
-          <w:i/>
-        </w:rPr>
-        <w:t xml:space="preserve">D</w:t>
-      </w:r>
-      <w:r>
-        <w:t xml:space="preserve">·Δ</w:t>
-      </w:r>
-      <w:r>
-        <w:rPr>
-          <w:iCs/>
-          <w:i/>
-        </w:rPr>
-        <w:t xml:space="preserve">π</w:t>
-      </w:r>
-      <w:r>
-        <w:rPr>
-          <w:vertAlign w:val="subscript"/>
-        </w:rPr>
-        <w:t xml:space="preserve">t</w:t>
-      </w:r>
-      <w:r>
-        <w:t xml:space="preserve"> </w:t>
-      </w:r>
-      <w:r>
-        <w:t xml:space="preserve">−</w:t>
-      </w:r>
-      <w:r>
-        <w:t xml:space="preserve"> </w:t>
-      </w:r>
-      <w:r>
-        <w:rPr>
-          <w:iCs/>
-          <w:i/>
-        </w:rPr>
-        <w:t xml:space="preserve">k</w:t>
-      </w:r>
-      <w:r>
-        <w:rPr>
-          <w:vertAlign w:val="subscript"/>
-        </w:rPr>
-        <w:t xml:space="preserve">t</w:t>
-      </w:r>
-      <w:r>
-        <w:t xml:space="preserve">. For post-2009 bonds, a stress beta should appear in this price component and nowhere else.</w:t>
+        <w:t xml:space="preserve">Split the 2008 beta between the two channels.</w:t>
+      </w:r>
+      <w:r>
+        <w:t xml:space="preserve"> </w:t>
+      </w:r>
+      <w:r>
+        <w:t xml:space="preserve">Compare the four Lehman-swap bonds with other CAT bonds from September to December 2008. A gap between the two groups measures the collateral channel. A fall common to all bonds, larger for bonds with a longer spread duration, measures the premium channel.</w:t>
       </w:r>
     </w:p>
     <w:p>
@@ -3025,7 +3258,211 @@
         <w:t xml:space="preserve"> </w:t>
       </w:r>
       <w:r>
-        <w:t xml:space="preserve">Instead of a calendar crisis dummy or the quantiles of equity returns, the regression should include an indicator of funding conditions, such as the TED spread, next to the equity return. The prediction is that the safe-haven coefficient deteriorates when funding stress is high, holding the equity return fixed, and not when equities fall alone.</w:t>
+        <w:t xml:space="preserve">Estimate DCC</w:t>
+      </w:r>
+      <w:r>
+        <w:rPr>
+          <w:vertAlign w:val="subscript"/>
+        </w:rPr>
+        <w:t xml:space="preserve">t</w:t>
+      </w:r>
+      <w:r>
+        <w:t xml:space="preserve"> </w:t>
+      </w:r>
+      <w:r>
+        <w:t xml:space="preserve">=</w:t>
+      </w:r>
+      <w:r>
+        <w:t xml:space="preserve"> </w:t>
+      </w:r>
+      <w:r>
+        <w:rPr>
+          <w:iCs/>
+          <w:i/>
+        </w:rPr>
+        <w:t xml:space="preserve">c</w:t>
+      </w:r>
+      <w:r>
+        <w:rPr>
+          <w:vertAlign w:val="subscript"/>
+        </w:rPr>
+        <w:t xml:space="preserve">0</w:t>
+      </w:r>
+      <w:r>
+        <w:t xml:space="preserve"> </w:t>
+      </w:r>
+      <w:r>
+        <w:t xml:space="preserve">+</w:t>
+      </w:r>
+      <w:r>
+        <w:t xml:space="preserve"> </w:t>
+      </w:r>
+      <w:r>
+        <w:rPr>
+          <w:iCs/>
+          <w:i/>
+        </w:rPr>
+        <w:t xml:space="preserve">c</w:t>
+      </w:r>
+      <w:r>
+        <w:rPr>
+          <w:vertAlign w:val="subscript"/>
+        </w:rPr>
+        <w:t xml:space="preserve">1</w:t>
+      </w:r>
+      <w:r>
+        <w:t xml:space="preserve">·Ext</w:t>
+      </w:r>
+      <w:r>
+        <w:rPr>
+          <w:vertAlign w:val="subscript"/>
+        </w:rPr>
+        <w:t xml:space="preserve">t</w:t>
+      </w:r>
+      <w:r>
+        <w:t xml:space="preserve"> </w:t>
+      </w:r>
+      <w:r>
+        <w:t xml:space="preserve">+</w:t>
+      </w:r>
+      <w:r>
+        <w:t xml:space="preserve"> </w:t>
+      </w:r>
+      <w:r>
+        <w:rPr>
+          <w:iCs/>
+          <w:i/>
+        </w:rPr>
+        <w:t xml:space="preserve">c</w:t>
+      </w:r>
+      <w:r>
+        <w:rPr>
+          <w:vertAlign w:val="subscript"/>
+        </w:rPr>
+        <w:t xml:space="preserve">2</w:t>
+      </w:r>
+      <w:r>
+        <w:t xml:space="preserve">·Fund</w:t>
+      </w:r>
+      <w:r>
+        <w:rPr>
+          <w:vertAlign w:val="subscript"/>
+        </w:rPr>
+        <w:t xml:space="preserve">t</w:t>
+      </w:r>
+      <w:r>
+        <w:t xml:space="preserve"> </w:t>
+      </w:r>
+      <w:r>
+        <w:t xml:space="preserve">+</w:t>
+      </w:r>
+      <w:r>
+        <w:t xml:space="preserve"> </w:t>
+      </w:r>
+      <w:r>
+        <w:rPr>
+          <w:iCs/>
+          <w:i/>
+        </w:rPr>
+        <w:t xml:space="preserve">c</w:t>
+      </w:r>
+      <w:r>
+        <w:rPr>
+          <w:vertAlign w:val="subscript"/>
+        </w:rPr>
+        <w:t xml:space="preserve">3</w:t>
+      </w:r>
+      <w:r>
+        <w:t xml:space="preserve">·(Ext</w:t>
+      </w:r>
+      <w:r>
+        <w:rPr>
+          <w:vertAlign w:val="subscript"/>
+        </w:rPr>
+        <w:t xml:space="preserve">t</w:t>
+      </w:r>
+      <w:r>
+        <w:t xml:space="preserve"> </w:t>
+      </w:r>
+      <w:r>
+        <w:t xml:space="preserve">× Fund</w:t>
+      </w:r>
+      <w:r>
+        <w:rPr>
+          <w:vertAlign w:val="subscript"/>
+        </w:rPr>
+        <w:t xml:space="preserve">t</w:t>
+      </w:r>
+      <w:r>
+        <w:t xml:space="preserve">), where Ext</w:t>
+      </w:r>
+      <w:r>
+        <w:rPr>
+          <w:vertAlign w:val="subscript"/>
+        </w:rPr>
+        <w:t xml:space="preserve">t</w:t>
+      </w:r>
+      <w:r>
+        <w:t xml:space="preserve"> </w:t>
+      </w:r>
+      <w:r>
+        <w:t xml:space="preserve">marks extreme equity weeks and Fund</w:t>
+      </w:r>
+      <w:r>
+        <w:rPr>
+          <w:vertAlign w:val="subscript"/>
+        </w:rPr>
+        <w:t xml:space="preserve">t</w:t>
+      </w:r>
+      <w:r>
+        <w:t xml:space="preserve"> </w:t>
+      </w:r>
+      <w:r>
+        <w:t xml:space="preserve">marks weeks of high funding stress, measured for example by the Chicago Fed National Financial Conditions Index or the spread between commercial paper and Treasury bills (the TED spread ended with LIBOR). My framework predicts</w:t>
+      </w:r>
+      <w:r>
+        <w:t xml:space="preserve"> </w:t>
+      </w:r>
+      <w:r>
+        <w:rPr>
+          <w:iCs/>
+          <w:i/>
+        </w:rPr>
+        <w:t xml:space="preserve">c</w:t>
+      </w:r>
+      <w:r>
+        <w:rPr>
+          <w:vertAlign w:val="subscript"/>
+        </w:rPr>
+        <w:t xml:space="preserve">3</w:t>
+      </w:r>
+      <w:r>
+        <w:t xml:space="preserve"> </w:t>
+      </w:r>
+      <w:r>
+        <w:t xml:space="preserve">&gt; 0 after 2009 as well as before: the correlation rises in extreme weeks only when funding is under stress. The simpler account, in which 2008 was a special case, predicts</w:t>
+      </w:r>
+      <w:r>
+        <w:t xml:space="preserve"> </w:t>
+      </w:r>
+      <w:r>
+        <w:rPr>
+          <w:iCs/>
+          <w:i/>
+        </w:rPr>
+        <w:t xml:space="preserve">c</w:t>
+      </w:r>
+      <w:r>
+        <w:rPr>
+          <w:vertAlign w:val="subscript"/>
+        </w:rPr>
+        <w:t xml:space="preserve">3</w:t>
+      </w:r>
+      <w:r>
+        <w:t xml:space="preserve"> </w:t>
+      </w:r>
+      <w:r>
+        <w:t xml:space="preserve">= 0 after 2009. March 2020 and September-October 2022 provide the observations.</w:t>
       </w:r>
     </w:p>
     <w:p>
@@ -3041,13 +3478,83 @@
           <w:iCs/>
           <w:i/>
         </w:rPr>
-        <w:t xml:space="preserve">Correct both biases.</w:t>
-      </w:r>
-      <w:r>
-        <w:t xml:space="preserve"> </w:t>
-      </w:r>
-      <w:r>
-        <w:t xml:space="preserve">Desmooth the index, as Feng and Zeng (2025) do, adjust crisis correlations for volatility as Forbes and Rigobon (2002) propose, or use transaction prices from TRACE, as Herrmann and Hibbeln (2023) do.</w:t>
+        <w:t xml:space="preserve">Correct both biases and separate the components.</w:t>
+      </w:r>
+      <w:r>
+        <w:t xml:space="preserve"> </w:t>
+      </w:r>
+      <w:r>
+        <w:t xml:space="preserve">Desmooth the index, as Feng and Zeng (2025) do, add lagged market returns (Dimson, 1979), and adjust crisis correlations for volatility (Forbes and Rigobon, 2002), or use transaction prices from TRACE, as Herrmann and Hibbeln (2023) do. Using Swiss Re’s price return index instead of the total return index removes the collateral yield and the contractual spread, so what is left is mainly −</w:t>
+      </w:r>
+      <w:r>
+        <w:rPr>
+          <w:iCs/>
+          <w:i/>
+        </w:rPr>
+        <w:t xml:space="preserve">ℓ</w:t>
+      </w:r>
+      <w:r>
+        <w:rPr>
+          <w:vertAlign w:val="subscript"/>
+        </w:rPr>
+        <w:t xml:space="preserve">t</w:t>
+      </w:r>
+      <w:r>
+        <w:t xml:space="preserve"> </w:t>
+      </w:r>
+      <w:r>
+        <w:t xml:space="preserve">−</w:t>
+      </w:r>
+      <w:r>
+        <w:t xml:space="preserve"> </w:t>
+      </w:r>
+      <w:r>
+        <w:rPr>
+          <w:iCs/>
+          <w:i/>
+        </w:rPr>
+        <w:t xml:space="preserve">D</w:t>
+      </w:r>
+      <w:r>
+        <w:t xml:space="preserve">·Δ</w:t>
+      </w:r>
+      <w:r>
+        <w:rPr>
+          <w:iCs/>
+          <w:i/>
+        </w:rPr>
+        <w:t xml:space="preserve">π</w:t>
+      </w:r>
+      <w:r>
+        <w:rPr>
+          <w:vertAlign w:val="subscript"/>
+        </w:rPr>
+        <w:t xml:space="preserve">t</w:t>
+      </w:r>
+      <w:r>
+        <w:t xml:space="preserve"> </w:t>
+      </w:r>
+      <w:r>
+        <w:t xml:space="preserve">−</w:t>
+      </w:r>
+      <w:r>
+        <w:t xml:space="preserve"> </w:t>
+      </w:r>
+      <w:r>
+        <w:rPr>
+          <w:iCs/>
+          <w:i/>
+        </w:rPr>
+        <w:t xml:space="preserve">k</w:t>
+      </w:r>
+      <w:r>
+        <w:rPr>
+          <w:vertAlign w:val="subscript"/>
+        </w:rPr>
+        <w:t xml:space="preserve">t</w:t>
+      </w:r>
+      <w:r>
+        <w:t xml:space="preserve">.</w:t>
       </w:r>
     </w:p>
     <w:p>
@@ -3069,7 +3576,7 @@
         <w:t xml:space="preserve"> </w:t>
       </w:r>
       <w:r>
-        <w:t xml:space="preserve">Weeks with a major catastrophe, such as the landfall of Hurricane Ike just before Lehman’s failure, should be identified separately, so that a coincidence of the two shocks is not read as market beta.</w:t>
+        <w:t xml:space="preserve">Weeks with a major catastrophe, such as the landfalls of Ike in 2008 and Ian in 2022, should be identified separately, so that a coincidence of the two shocks is not read as market beta.</w:t>
       </w:r>
     </w:p>
     <w:p>
@@ -3085,13 +3592,13 @@
           <w:iCs/>
           <w:i/>
         </w:rPr>
-        <w:t xml:space="preserve">Report results by regime and by liquidity.</w:t>
-      </w:r>
-      <w:r>
-        <w:t xml:space="preserve"> </w:t>
-      </w:r>
-      <w:r>
-        <w:t xml:space="preserve">Results should be reported cell by cell of Table 2. Since riskier bonds and bonds far from maturity are less liquid, the framework predicts larger stress betas for them.</w:t>
+        <w:t xml:space="preserve">Separate liquidity from duration.</w:t>
+      </w:r>
+      <w:r>
+        <w:t xml:space="preserve"> </w:t>
+      </w:r>
+      <w:r>
+        <w:t xml:space="preserve">Less liquid bonds should show larger stress betas, but bonds far from maturity are both less liquid and longer in spread duration. The comparison has to be made between bonds with similar remaining terms.</w:t>
       </w:r>
     </w:p>
     <w:p>
@@ -3125,13 +3632,13 @@
           <w:iCs/>
           <w:i/>
         </w:rPr>
-        <w:t xml:space="preserve">Close the collateral channel.</w:t>
-      </w:r>
-      <w:r>
-        <w:t xml:space="preserve"> </w:t>
-      </w:r>
-      <w:r>
-        <w:t xml:space="preserve">Collateral should be held in short-term Treasury instruments in a trust account, with no bank guaranteeing its value and with the holdings disclosed. Most of the market has adopted this since 2009, but an investor should verify the collateral terms of each issue rather than assume them.</w:t>
+        <w:t xml:space="preserve">Keep the collateral channel closed.</w:t>
+      </w:r>
+      <w:r>
+        <w:t xml:space="preserve"> </w:t>
+      </w:r>
+      <w:r>
+        <w:t xml:space="preserve">Collateral should be held in Treasury money-market funds or equivalent instruments in trust, with no bank guaranteeing its value and with the holdings disclosed. Most of the market has moved this way since 2009 (Artemis, 2011), but investors should verify the terms of each issue.</w:t>
       </w:r>
     </w:p>
     <w:p>
@@ -3153,7 +3660,7 @@
         <w:t xml:space="preserve"> </w:t>
       </w:r>
       <w:r>
-        <w:t xml:space="preserve">It cannot be eliminated, but investors can avoid feeding it. An investor that plans to raise cash by selling CAT bonds in a crisis creates the correlation it bought them to avoid. Funds that promise frequent redemptions should match those terms to the liquidity of their bonds, through notice periods, cash buffers or limits on redemptions, so that they are not forced to sell into a falling market. At the portfolio level, the allocation should be small enough that it never has to be sold in a crisis.</w:t>
+        <w:t xml:space="preserve">An investor that plans to raise cash by selling CAT bonds in a crisis creates the correlation it bought them to avoid. Funds that promise frequent redemptions should match those terms to the liquidity of their bonds through notice periods, cash buffers or redemption limits, and the allocation should be small enough that it never has to be sold in a crisis. Since a premium-driven fall is recovered by a holder who can wait, the investor’s own funding decides whether the fall becomes a loss.</w:t>
       </w:r>
     </w:p>
     <w:p>
@@ -3169,13 +3676,13 @@
           <w:iCs/>
           <w:i/>
         </w:rPr>
-        <w:t xml:space="preserve">Limit concentration within the allocation.</w:t>
-      </w:r>
-      <w:r>
-        <w:t xml:space="preserve"> </w:t>
-      </w:r>
-      <w:r>
-        <w:t xml:space="preserve">A portfolio concentrated in one peril and region, U.S. hurricane for instance, can lose several bonds to a single event, and Feng and Zeng (2025) find hedge ratios sensitive to extreme weather. Limits by peril, region and sponsor keep the insurance core diversified.</w:t>
+        <w:t xml:space="preserve">Limit concentration.</w:t>
+      </w:r>
+      <w:r>
+        <w:t xml:space="preserve"> </w:t>
+      </w:r>
+      <w:r>
+        <w:t xml:space="preserve">Limits by peril, region and sponsor keep the insurance core diversified within the allocation, which matters since Feng and Zeng (2025) find hedge ratios sensitive to extreme weather.</w:t>
       </w:r>
     </w:p>
     <w:p>
@@ -3215,7 +3722,7 @@
         <w:pStyle w:val="FirstParagraph"/>
       </w:pPr>
       <w:r>
-        <w:t xml:space="preserve">Whether CAT bonds are zero-beta assets depends on which part of the bond the question refers to. For natural perils, the insurance core is zero-beta. The bond as a traded security has a beta close to zero in calm markets that can turn positive in a funding crisis through the premium channel, and that was turned positive in 2008 by a collateral design the market has since abandoned. On the evidence reviewed, CAT bonds are a reliable diversifier, they are not a hedge, and their safe-haven property is conditional: present in equity sell-offs, weaker in funding crises, and absent for perils that are themselves macroeconomic shocks.</w:t>
+        <w:t xml:space="preserve">Whether CAT bonds are zero-beta assets depends on which part of the bond the question refers to. Under the assumption that natural catastrophes do not depend on markets, the insurance core is zero-beta. The bond as a traded security has a small beta in calm markets, a beta that can turn positive in a funding crisis through the premium channel, and a beta that turned positive in 2008, when Carayannopoulos and Perez attribute much of the effect to a collateral design the market has since abandoned. On the evidence reviewed, CAT bonds are a reliable diversifier; whether they also qualify as a weak hedge on average is disputed; and their safe-haven property is conditional: at least weak in equity sell-offs, weaker in funding crises, and absent for perils that are themselves macroeconomic shocks.</w:t>
       </w:r>
     </w:p>
     <w:bookmarkEnd w:id="33"/>
@@ -3234,7 +3741,7 @@
         <w:pStyle w:val="FirstParagraph"/>
       </w:pPr>
       <w:r>
-        <w:t xml:space="preserve">This paper asked whether CAT bonds keep their diversification benefits during financial stress. Carayannopoulos and Perez (2015) find that they lost their zero-beta property after Lehman’s failure. Drobetz et al. (2020) find that they are a diversifier in every period but a strong safe haven only after the financial crisis, and Haffar and Le Fur (2022) find little extreme co-movement with equity markets. Gürtler et al. (2016) and Braun (2016) add evidence that CAT bond premiums move with corporate spreads, while Feng and Zeng (2025) find a safe haven after the COVID-19 outbreak.</w:t>
+        <w:t xml:space="preserve">This paper asked whether CAT bonds keep their diversification benefits during financial stress. The literature gives three answers: the zero-beta property holds (Carayannopoulos and Perez, 2015, outside crises; Haffar and Le Fur, 2022), it fails (Gürtler et al., 2016; Carayannopoulos and Perez after Lehman’s failure), or it depends on the period (Drobetz et al., 2020; Feng and Zeng, 2025).</w:t>
       </w:r>
     </w:p>
     <w:p>
@@ -3242,7 +3749,7 @@
         <w:pStyle w:val="BodyText"/>
       </w:pPr>
       <w:r>
-        <w:t xml:space="preserve">My contribution is to show that these conclusions are compatible once the CAT bond return is split into an insurance core and a financial wrapper. The core is independent of markets for natural perils. The wrapper is not, and its exposure depends on the collateral structure and on whether a stress episode is a funding crisis. Sorting the evidence into the four regimes of Table 2 explains why the 2007-2009 crisis produced positive betas, why the post-crisis period produced a safe haven against stocks, and why March 2020 produced a small, temporary fall. A further part of the disagreement is statistical: quote-based indices bias co-movement toward zero, crisis-window correlations bias it upward, and the studies are exposed to these biases in different degrees.</w:t>
+        <w:t xml:space="preserve">My contribution is to propose a framework under which these conclusions are consistent. It splits the CAT bond return into an insurance core, which for natural perils is close to independent of markets, and a financial wrapper, whose exposure depends on the collateral structure and on whether a stress episode is a funding crisis. Sorting the evidence into the four regimes of Table 2 accounts for the positive betas of 2007-2009, the safe haven against stocks after the crisis, and the small fall of March 2020 that was described as temporary within weeks. Part of the disagreement is also statistical: quote-based indices bias co-movement toward zero, correlations measured in volatile periods exaggerate the co-movement that exists, and the studies are exposed to these biases in different degrees.</w:t>
       </w:r>
     </w:p>
     <w:p>
@@ -3250,7 +3757,7 @@
         <w:pStyle w:val="BodyText"/>
       </w:pPr>
       <w:r>
-        <w:t xml:space="preserve">The answer to the research question is therefore conditional. CAT bonds retain their diversification benefit in financial stress when their collateral is safe and their holders are not forced to sell. Under those conditions they can act as a safe haven against stocks. They lose part of it when either condition fails. The practical implication follows: investors can make the benefit more reliable through collateral rules, liquidity management and concentration limits, but they should treat CAT bonds as a diversifier with a conditional safe-haven property, not as crisis insurance.</w:t>
+        <w:t xml:space="preserve">The answer to the research question is therefore conditional. CAT bonds retain their diversification benefit in financial stress when their collateral is safe and their holders are not forced to sell. Under those conditions they can act as a weak safe haven against stocks. They lose part of the benefit when either condition fails. Investors can make the benefit more reliable through collateral rules, liquidity management and concentration limits, but they should treat CAT bonds as a diversifier with a conditional safe-haven property, not as crisis insurance.</w:t>
       </w:r>
     </w:p>
     <w:p>
@@ -3258,7 +3765,7 @@
         <w:pStyle w:val="BodyText"/>
       </w:pPr>
       <w:r>
-        <w:t xml:space="preserve">The analysis has limits. It rests on published results rather than new estimates, so the four regimes and the predictions of Section 3.5 are hypotheses that still need to be tested. The post-2009 period contains only one severe funding crisis, March 2020, so the evidence for the bottom-left cell of Table 2 is thin. Finally, the framework assumes that catastrophe losses are independent of markets for natural perils. That assumption is the right starting point today, but it deserves to be re-examined as pandemic, cyber and climate-related risks take a larger share of the market.</w:t>
+        <w:t xml:space="preserve">The analysis has limits. It rests on published results rather than new estimates, and the grid was built after reading the evidence, so the predictions of Section 3.5 are hypotheses that still need to be tested. The strong post-crisis safe haven found by Drobetz et al. is not explained by the framework. Several post-2009 funding episodes, in 2011-2012 and in 2022, have not been studied separately, so the evidence for the bottom-left cell of Table 2 rests mainly on March 2020. Finally, the framework assumes that catastrophe losses are independent of markets for natural perils. That assumption is a reasonable starting point, but it deserves to be re-examined as pandemic, cyber and climate-related risks take a larger share of the market.</w:t>
       </w:r>
     </w:p>
     <w:bookmarkEnd w:id="35"/>
@@ -3280,51 +3787,51 @@
       </w:pPr>
       <w:r>
         <w:rPr>
-          <w:sz w:val="22"/>
+          <w:sz w:val="21"/>
         </w:rPr>
         <w:t xml:space="preserve">Artemis (2009).</w:t>
       </w:r>
       <w:r>
         <w:rPr>
-          <w:sz w:val="22"/>
-        </w:rPr>
-        <w:t xml:space="preserve"> </w:t>
-      </w:r>
-      <w:r>
-        <w:rPr>
-          <w:sz w:val="22"/>
+          <w:sz w:val="21"/>
+        </w:rPr>
+        <w:t xml:space="preserve"> </w:t>
+      </w:r>
+      <w:r>
+        <w:rPr>
+          <w:sz w:val="21"/>
         </w:rPr>
         <w:t xml:space="preserve">“</w:t>
       </w:r>
       <w:r>
         <w:rPr>
-          <w:sz w:val="22"/>
+          <w:sz w:val="21"/>
         </w:rPr>
         <w:t xml:space="preserve">Ajax Re notes downgraded again by S&amp;P after principal not paid in full,</w:t>
       </w:r>
       <w:r>
         <w:rPr>
-          <w:sz w:val="22"/>
+          <w:sz w:val="21"/>
         </w:rPr>
         <w:t xml:space="preserve">”</w:t>
       </w:r>
       <w:r>
         <w:rPr>
-          <w:sz w:val="22"/>
-        </w:rPr>
-        <w:t xml:space="preserve"> </w:t>
-      </w:r>
-      <w:r>
-        <w:rPr>
-          <w:iCs/>
-          <w:i/>
-          <w:sz w:val="22"/>
+          <w:sz w:val="21"/>
+        </w:rPr>
+        <w:t xml:space="preserve"> </w:t>
+      </w:r>
+      <w:r>
+        <w:rPr>
+          <w:iCs/>
+          <w:i/>
+          <w:sz w:val="21"/>
         </w:rPr>
         <w:t xml:space="preserve">Artemis.bm</w:t>
       </w:r>
       <w:r>
         <w:rPr>
-          <w:sz w:val="22"/>
+          <w:sz w:val="21"/>
         </w:rPr>
         <w:t xml:space="preserve">, May 12, 2009. https://www.artemis.bm/news/ajax-re-notes-downgraded-again-by-sp-after-principal-not-paid-in-full/</w:t>
       </w:r>
@@ -3338,53 +3845,53 @@
       </w:pPr>
       <w:r>
         <w:rPr>
-          <w:sz w:val="22"/>
-        </w:rPr>
-        <w:t xml:space="preserve">Baur, Dirk G., and Brian M. Lucey (2010).</w:t>
-      </w:r>
-      <w:r>
-        <w:rPr>
-          <w:sz w:val="22"/>
-        </w:rPr>
-        <w:t xml:space="preserve"> </w:t>
-      </w:r>
-      <w:r>
-        <w:rPr>
-          <w:sz w:val="22"/>
+          <w:sz w:val="21"/>
+        </w:rPr>
+        <w:t xml:space="preserve">Artemis (2011).</w:t>
+      </w:r>
+      <w:r>
+        <w:rPr>
+          <w:sz w:val="21"/>
+        </w:rPr>
+        <w:t xml:space="preserve"> </w:t>
+      </w:r>
+      <w:r>
+        <w:rPr>
+          <w:sz w:val="21"/>
         </w:rPr>
         <w:t xml:space="preserve">“</w:t>
       </w:r>
       <w:r>
         <w:rPr>
-          <w:sz w:val="22"/>
-        </w:rPr>
-        <w:t xml:space="preserve">Is gold a hedge or a safe haven? An analysis of stocks, bonds and gold,</w:t>
-      </w:r>
-      <w:r>
-        <w:rPr>
-          <w:sz w:val="22"/>
+          <w:sz w:val="21"/>
+        </w:rPr>
+        <w:t xml:space="preserve">The death of the total return swap and the rise of the Treasury money market fund,</w:t>
+      </w:r>
+      <w:r>
+        <w:rPr>
+          <w:sz w:val="21"/>
         </w:rPr>
         <w:t xml:space="preserve">”</w:t>
       </w:r>
       <w:r>
         <w:rPr>
-          <w:sz w:val="22"/>
-        </w:rPr>
-        <w:t xml:space="preserve"> </w:t>
-      </w:r>
-      <w:r>
-        <w:rPr>
-          <w:iCs/>
-          <w:i/>
-          <w:sz w:val="22"/>
-        </w:rPr>
-        <w:t xml:space="preserve">The Financial Review</w:t>
-      </w:r>
-      <w:r>
-        <w:rPr>
-          <w:sz w:val="22"/>
-        </w:rPr>
-        <w:t xml:space="preserve">, vol. 45, no. 2, p. 217–229. https://doi.org/10.1111/j.1540-6288.2010.00244.x</w:t>
+          <w:sz w:val="21"/>
+        </w:rPr>
+        <w:t xml:space="preserve"> </w:t>
+      </w:r>
+      <w:r>
+        <w:rPr>
+          <w:iCs/>
+          <w:i/>
+          <w:sz w:val="21"/>
+        </w:rPr>
+        <w:t xml:space="preserve">Artemis.bm</w:t>
+      </w:r>
+      <w:r>
+        <w:rPr>
+          <w:sz w:val="21"/>
+        </w:rPr>
+        <w:t xml:space="preserve">, December 19, 2011. https://www.artemis.bm/news/the-death-of-the-total-return-swap-and-the-rise-of-the-treasury-money-market-fund/</w:t>
       </w:r>
     </w:p>
     <w:p>
@@ -3396,53 +3903,53 @@
       </w:pPr>
       <w:r>
         <w:rPr>
-          <w:sz w:val="22"/>
-        </w:rPr>
-        <w:t xml:space="preserve">Baur, Dirk G., and Thomas K. McDermott (2010).</w:t>
-      </w:r>
-      <w:r>
-        <w:rPr>
-          <w:sz w:val="22"/>
-        </w:rPr>
-        <w:t xml:space="preserve"> </w:t>
-      </w:r>
-      <w:r>
-        <w:rPr>
-          <w:sz w:val="22"/>
+          <w:sz w:val="21"/>
+        </w:rPr>
+        <w:t xml:space="preserve">Baur, Dirk G., and Brian M. Lucey (2010).</w:t>
+      </w:r>
+      <w:r>
+        <w:rPr>
+          <w:sz w:val="21"/>
+        </w:rPr>
+        <w:t xml:space="preserve"> </w:t>
+      </w:r>
+      <w:r>
+        <w:rPr>
+          <w:sz w:val="21"/>
         </w:rPr>
         <w:t xml:space="preserve">“</w:t>
       </w:r>
       <w:r>
         <w:rPr>
-          <w:sz w:val="22"/>
-        </w:rPr>
-        <w:t xml:space="preserve">Is gold a safe haven? International evidence,</w:t>
-      </w:r>
-      <w:r>
-        <w:rPr>
-          <w:sz w:val="22"/>
+          <w:sz w:val="21"/>
+        </w:rPr>
+        <w:t xml:space="preserve">Is gold a hedge or a safe haven? An analysis of stocks, bonds and gold,</w:t>
+      </w:r>
+      <w:r>
+        <w:rPr>
+          <w:sz w:val="21"/>
         </w:rPr>
         <w:t xml:space="preserve">”</w:t>
       </w:r>
       <w:r>
         <w:rPr>
-          <w:sz w:val="22"/>
-        </w:rPr>
-        <w:t xml:space="preserve"> </w:t>
-      </w:r>
-      <w:r>
-        <w:rPr>
-          <w:iCs/>
-          <w:i/>
-          <w:sz w:val="22"/>
-        </w:rPr>
-        <w:t xml:space="preserve">Journal of Banking and Finance</w:t>
-      </w:r>
-      <w:r>
-        <w:rPr>
-          <w:sz w:val="22"/>
-        </w:rPr>
-        <w:t xml:space="preserve">, vol. 34, no. 8, p. 1886–1898. https://doi.org/10.1016/j.jbankfin.2009.12.008</w:t>
+          <w:sz w:val="21"/>
+        </w:rPr>
+        <w:t xml:space="preserve"> </w:t>
+      </w:r>
+      <w:r>
+        <w:rPr>
+          <w:iCs/>
+          <w:i/>
+          <w:sz w:val="21"/>
+        </w:rPr>
+        <w:t xml:space="preserve">The Financial Review</w:t>
+      </w:r>
+      <w:r>
+        <w:rPr>
+          <w:sz w:val="21"/>
+        </w:rPr>
+        <w:t xml:space="preserve">, vol. 45, no. 2, p. 217–229. https://doi.org/10.1111/j.1540-6288.2010.00244.x</w:t>
       </w:r>
     </w:p>
     <w:p>
@@ -3454,53 +3961,53 @@
       </w:pPr>
       <w:r>
         <w:rPr>
-          <w:sz w:val="22"/>
-        </w:rPr>
-        <w:t xml:space="preserve">Bouri, Elie, Peter Molnár, Georges Azzi, David Roubaud, and Lars Ivar Hagfors (2017).</w:t>
-      </w:r>
-      <w:r>
-        <w:rPr>
-          <w:sz w:val="22"/>
-        </w:rPr>
-        <w:t xml:space="preserve"> </w:t>
-      </w:r>
-      <w:r>
-        <w:rPr>
-          <w:sz w:val="22"/>
+          <w:sz w:val="21"/>
+        </w:rPr>
+        <w:t xml:space="preserve">Baur, Dirk G., and Thomas K. McDermott (2010).</w:t>
+      </w:r>
+      <w:r>
+        <w:rPr>
+          <w:sz w:val="21"/>
+        </w:rPr>
+        <w:t xml:space="preserve"> </w:t>
+      </w:r>
+      <w:r>
+        <w:rPr>
+          <w:sz w:val="21"/>
         </w:rPr>
         <w:t xml:space="preserve">“</w:t>
       </w:r>
       <w:r>
         <w:rPr>
-          <w:sz w:val="22"/>
-        </w:rPr>
-        <w:t xml:space="preserve">On the hedge and safe haven properties of Bitcoin: Is it really more than a diversifier?</w:t>
-      </w:r>
-      <w:r>
-        <w:rPr>
-          <w:sz w:val="22"/>
+          <w:sz w:val="21"/>
+        </w:rPr>
+        <w:t xml:space="preserve">Is gold a safe haven? International evidence,</w:t>
+      </w:r>
+      <w:r>
+        <w:rPr>
+          <w:sz w:val="21"/>
         </w:rPr>
         <w:t xml:space="preserve">”</w:t>
       </w:r>
       <w:r>
         <w:rPr>
-          <w:sz w:val="22"/>
-        </w:rPr>
-        <w:t xml:space="preserve"> </w:t>
-      </w:r>
-      <w:r>
-        <w:rPr>
-          <w:iCs/>
-          <w:i/>
-          <w:sz w:val="22"/>
-        </w:rPr>
-        <w:t xml:space="preserve">Finance Research Letters</w:t>
-      </w:r>
-      <w:r>
-        <w:rPr>
-          <w:sz w:val="22"/>
-        </w:rPr>
-        <w:t xml:space="preserve">, vol. 20, p. 192–198. https://doi.org/10.1016/j.frl.2016.09.025</w:t>
+          <w:sz w:val="21"/>
+        </w:rPr>
+        <w:t xml:space="preserve"> </w:t>
+      </w:r>
+      <w:r>
+        <w:rPr>
+          <w:iCs/>
+          <w:i/>
+          <w:sz w:val="21"/>
+        </w:rPr>
+        <w:t xml:space="preserve">Journal of Banking and Finance</w:t>
+      </w:r>
+      <w:r>
+        <w:rPr>
+          <w:sz w:val="21"/>
+        </w:rPr>
+        <w:t xml:space="preserve">, vol. 34, no. 8, p. 1886–1898. https://doi.org/10.1016/j.jbankfin.2009.12.008</w:t>
       </w:r>
     </w:p>
     <w:p>
@@ -3512,53 +4019,53 @@
       </w:pPr>
       <w:r>
         <w:rPr>
-          <w:sz w:val="22"/>
-        </w:rPr>
-        <w:t xml:space="preserve">Braun, Alexander (2016).</w:t>
-      </w:r>
-      <w:r>
-        <w:rPr>
-          <w:sz w:val="22"/>
-        </w:rPr>
-        <w:t xml:space="preserve"> </w:t>
-      </w:r>
-      <w:r>
-        <w:rPr>
-          <w:sz w:val="22"/>
+          <w:sz w:val="21"/>
+        </w:rPr>
+        <w:t xml:space="preserve">Bouri, Elie, Peter Molnár, Georges Azzi, David Roubaud, and Lars Ivar Hagfors (2017).</w:t>
+      </w:r>
+      <w:r>
+        <w:rPr>
+          <w:sz w:val="21"/>
+        </w:rPr>
+        <w:t xml:space="preserve"> </w:t>
+      </w:r>
+      <w:r>
+        <w:rPr>
+          <w:sz w:val="21"/>
         </w:rPr>
         <w:t xml:space="preserve">“</w:t>
       </w:r>
       <w:r>
         <w:rPr>
-          <w:sz w:val="22"/>
-        </w:rPr>
-        <w:t xml:space="preserve">Pricing in the primary market for cat bonds: New empirical evidence,</w:t>
-      </w:r>
-      <w:r>
-        <w:rPr>
-          <w:sz w:val="22"/>
+          <w:sz w:val="21"/>
+        </w:rPr>
+        <w:t xml:space="preserve">On the hedge and safe haven properties of Bitcoin: Is it really more than a diversifier?</w:t>
+      </w:r>
+      <w:r>
+        <w:rPr>
+          <w:sz w:val="21"/>
         </w:rPr>
         <w:t xml:space="preserve">”</w:t>
       </w:r>
       <w:r>
         <w:rPr>
-          <w:sz w:val="22"/>
-        </w:rPr>
-        <w:t xml:space="preserve"> </w:t>
-      </w:r>
-      <w:r>
-        <w:rPr>
-          <w:iCs/>
-          <w:i/>
-          <w:sz w:val="22"/>
-        </w:rPr>
-        <w:t xml:space="preserve">Journal of Risk and Insurance</w:t>
-      </w:r>
-      <w:r>
-        <w:rPr>
-          <w:sz w:val="22"/>
-        </w:rPr>
-        <w:t xml:space="preserve">, vol. 83, no. 4, p. 811–847. https://doi.org/10.1111/jori.12067</w:t>
+          <w:sz w:val="21"/>
+        </w:rPr>
+        <w:t xml:space="preserve"> </w:t>
+      </w:r>
+      <w:r>
+        <w:rPr>
+          <w:iCs/>
+          <w:i/>
+          <w:sz w:val="21"/>
+        </w:rPr>
+        <w:t xml:space="preserve">Finance Research Letters</w:t>
+      </w:r>
+      <w:r>
+        <w:rPr>
+          <w:sz w:val="21"/>
+        </w:rPr>
+        <w:t xml:space="preserve">, vol. 20, p. 192–198. https://doi.org/10.1016/j.frl.2016.09.025</w:t>
       </w:r>
     </w:p>
     <w:p>
@@ -3570,53 +4077,53 @@
       </w:pPr>
       <w:r>
         <w:rPr>
-          <w:sz w:val="22"/>
-        </w:rPr>
-        <w:t xml:space="preserve">Brunnermeier, Markus K., and Lasse Heje Pedersen (2009).</w:t>
-      </w:r>
-      <w:r>
-        <w:rPr>
-          <w:sz w:val="22"/>
-        </w:rPr>
-        <w:t xml:space="preserve"> </w:t>
-      </w:r>
-      <w:r>
-        <w:rPr>
-          <w:sz w:val="22"/>
+          <w:sz w:val="21"/>
+        </w:rPr>
+        <w:t xml:space="preserve">Braun, Alexander (2016).</w:t>
+      </w:r>
+      <w:r>
+        <w:rPr>
+          <w:sz w:val="21"/>
+        </w:rPr>
+        <w:t xml:space="preserve"> </w:t>
+      </w:r>
+      <w:r>
+        <w:rPr>
+          <w:sz w:val="21"/>
         </w:rPr>
         <w:t xml:space="preserve">“</w:t>
       </w:r>
       <w:r>
         <w:rPr>
-          <w:sz w:val="22"/>
-        </w:rPr>
-        <w:t xml:space="preserve">Market liquidity and funding liquidity,</w:t>
-      </w:r>
-      <w:r>
-        <w:rPr>
-          <w:sz w:val="22"/>
+          <w:sz w:val="21"/>
+        </w:rPr>
+        <w:t xml:space="preserve">Pricing in the primary market for cat bonds: New empirical evidence,</w:t>
+      </w:r>
+      <w:r>
+        <w:rPr>
+          <w:sz w:val="21"/>
         </w:rPr>
         <w:t xml:space="preserve">”</w:t>
       </w:r>
       <w:r>
         <w:rPr>
-          <w:sz w:val="22"/>
-        </w:rPr>
-        <w:t xml:space="preserve"> </w:t>
-      </w:r>
-      <w:r>
-        <w:rPr>
-          <w:iCs/>
-          <w:i/>
-          <w:sz w:val="22"/>
-        </w:rPr>
-        <w:t xml:space="preserve">Review of Financial Studies</w:t>
-      </w:r>
-      <w:r>
-        <w:rPr>
-          <w:sz w:val="22"/>
-        </w:rPr>
-        <w:t xml:space="preserve">, vol. 22, no. 6, p. 2201–2238. https://doi.org/10.1093/rfs/hhn098</w:t>
+          <w:sz w:val="21"/>
+        </w:rPr>
+        <w:t xml:space="preserve"> </w:t>
+      </w:r>
+      <w:r>
+        <w:rPr>
+          <w:iCs/>
+          <w:i/>
+          <w:sz w:val="21"/>
+        </w:rPr>
+        <w:t xml:space="preserve">Journal of Risk and Insurance</w:t>
+      </w:r>
+      <w:r>
+        <w:rPr>
+          <w:sz w:val="21"/>
+        </w:rPr>
+        <w:t xml:space="preserve">, vol. 83, no. 4, p. 811–847. https://doi.org/10.1111/jori.12067</w:t>
       </w:r>
     </w:p>
     <w:p>
@@ -3628,53 +4135,53 @@
       </w:pPr>
       <w:r>
         <w:rPr>
-          <w:sz w:val="22"/>
-        </w:rPr>
-        <w:t xml:space="preserve">Carayannopoulos, Peter, and M. Fabricio Perez (2015).</w:t>
-      </w:r>
-      <w:r>
-        <w:rPr>
-          <w:sz w:val="22"/>
-        </w:rPr>
-        <w:t xml:space="preserve"> </w:t>
-      </w:r>
-      <w:r>
-        <w:rPr>
-          <w:sz w:val="22"/>
+          <w:sz w:val="21"/>
+        </w:rPr>
+        <w:t xml:space="preserve">Brunnermeier, Markus K., and Lasse Heje Pedersen (2009).</w:t>
+      </w:r>
+      <w:r>
+        <w:rPr>
+          <w:sz w:val="21"/>
+        </w:rPr>
+        <w:t xml:space="preserve"> </w:t>
+      </w:r>
+      <w:r>
+        <w:rPr>
+          <w:sz w:val="21"/>
         </w:rPr>
         <w:t xml:space="preserve">“</w:t>
       </w:r>
       <w:r>
         <w:rPr>
-          <w:sz w:val="22"/>
-        </w:rPr>
-        <w:t xml:space="preserve">Diversification through catastrophe bonds: Lessons from the subprime financial crisis,</w:t>
-      </w:r>
-      <w:r>
-        <w:rPr>
-          <w:sz w:val="22"/>
+          <w:sz w:val="21"/>
+        </w:rPr>
+        <w:t xml:space="preserve">Market liquidity and funding liquidity,</w:t>
+      </w:r>
+      <w:r>
+        <w:rPr>
+          <w:sz w:val="21"/>
         </w:rPr>
         <w:t xml:space="preserve">”</w:t>
       </w:r>
       <w:r>
         <w:rPr>
-          <w:sz w:val="22"/>
-        </w:rPr>
-        <w:t xml:space="preserve"> </w:t>
-      </w:r>
-      <w:r>
-        <w:rPr>
-          <w:iCs/>
-          <w:i/>
-          <w:sz w:val="22"/>
-        </w:rPr>
-        <w:t xml:space="preserve">The Geneva Papers on Risk and Insurance – Issues and Practice</w:t>
-      </w:r>
-      <w:r>
-        <w:rPr>
-          <w:sz w:val="22"/>
-        </w:rPr>
-        <w:t xml:space="preserve">, vol. 40, no. 1, p. 1–28. https://doi.org/10.1057/gpp.2014.14</w:t>
+          <w:sz w:val="21"/>
+        </w:rPr>
+        <w:t xml:space="preserve"> </w:t>
+      </w:r>
+      <w:r>
+        <w:rPr>
+          <w:iCs/>
+          <w:i/>
+          <w:sz w:val="21"/>
+        </w:rPr>
+        <w:t xml:space="preserve">Review of Financial Studies</w:t>
+      </w:r>
+      <w:r>
+        <w:rPr>
+          <w:sz w:val="21"/>
+        </w:rPr>
+        <w:t xml:space="preserve">, vol. 22, no. 6, p. 2201–2238. https://doi.org/10.1093/rfs/hhn098</w:t>
       </w:r>
     </w:p>
     <w:p>
@@ -3686,53 +4193,53 @@
       </w:pPr>
       <w:r>
         <w:rPr>
-          <w:sz w:val="22"/>
-        </w:rPr>
-        <w:t xml:space="preserve">Cummins, J. David (2008).</w:t>
-      </w:r>
-      <w:r>
-        <w:rPr>
-          <w:sz w:val="22"/>
-        </w:rPr>
-        <w:t xml:space="preserve"> </w:t>
-      </w:r>
-      <w:r>
-        <w:rPr>
-          <w:sz w:val="22"/>
+          <w:sz w:val="21"/>
+        </w:rPr>
+        <w:t xml:space="preserve">Campbell, John Y., and Tuomo Vuolteenaho (2004).</w:t>
+      </w:r>
+      <w:r>
+        <w:rPr>
+          <w:sz w:val="21"/>
+        </w:rPr>
+        <w:t xml:space="preserve"> </w:t>
+      </w:r>
+      <w:r>
+        <w:rPr>
+          <w:sz w:val="21"/>
         </w:rPr>
         <w:t xml:space="preserve">“</w:t>
       </w:r>
       <w:r>
         <w:rPr>
-          <w:sz w:val="22"/>
-        </w:rPr>
-        <w:t xml:space="preserve">CAT bonds and other risk-linked securities: State of the market and recent developments,</w:t>
-      </w:r>
-      <w:r>
-        <w:rPr>
-          <w:sz w:val="22"/>
+          <w:sz w:val="21"/>
+        </w:rPr>
+        <w:t xml:space="preserve">Bad beta, good beta,</w:t>
+      </w:r>
+      <w:r>
+        <w:rPr>
+          <w:sz w:val="21"/>
         </w:rPr>
         <w:t xml:space="preserve">”</w:t>
       </w:r>
       <w:r>
         <w:rPr>
-          <w:sz w:val="22"/>
-        </w:rPr>
-        <w:t xml:space="preserve"> </w:t>
-      </w:r>
-      <w:r>
-        <w:rPr>
-          <w:iCs/>
-          <w:i/>
-          <w:sz w:val="22"/>
-        </w:rPr>
-        <w:t xml:space="preserve">Risk Management and Insurance Review</w:t>
-      </w:r>
-      <w:r>
-        <w:rPr>
-          <w:sz w:val="22"/>
-        </w:rPr>
-        <w:t xml:space="preserve">, vol. 11, no. 1, p. 23–47. https://doi.org/10.1111/j.1540-6296.2008.00127.x</w:t>
+          <w:sz w:val="21"/>
+        </w:rPr>
+        <w:t xml:space="preserve"> </w:t>
+      </w:r>
+      <w:r>
+        <w:rPr>
+          <w:iCs/>
+          <w:i/>
+          <w:sz w:val="21"/>
+        </w:rPr>
+        <w:t xml:space="preserve">American Economic Review</w:t>
+      </w:r>
+      <w:r>
+        <w:rPr>
+          <w:sz w:val="21"/>
+        </w:rPr>
+        <w:t xml:space="preserve">, vol. 94, no. 5, p. 1249–1275. https://doi.org/10.1257/0002828043052240</w:t>
       </w:r>
     </w:p>
     <w:p>
@@ -3744,53 +4251,53 @@
       </w:pPr>
       <w:r>
         <w:rPr>
-          <w:sz w:val="22"/>
-        </w:rPr>
-        <w:t xml:space="preserve">Cummins, J. David, and Mary A. Weiss (2009).</w:t>
-      </w:r>
-      <w:r>
-        <w:rPr>
-          <w:sz w:val="22"/>
-        </w:rPr>
-        <w:t xml:space="preserve"> </w:t>
-      </w:r>
-      <w:r>
-        <w:rPr>
-          <w:sz w:val="22"/>
+          <w:sz w:val="21"/>
+        </w:rPr>
+        <w:t xml:space="preserve">Carayannopoulos, Peter, and M. Fabricio Perez (2015).</w:t>
+      </w:r>
+      <w:r>
+        <w:rPr>
+          <w:sz w:val="21"/>
+        </w:rPr>
+        <w:t xml:space="preserve"> </w:t>
+      </w:r>
+      <w:r>
+        <w:rPr>
+          <w:sz w:val="21"/>
         </w:rPr>
         <w:t xml:space="preserve">“</w:t>
       </w:r>
       <w:r>
         <w:rPr>
-          <w:sz w:val="22"/>
-        </w:rPr>
-        <w:t xml:space="preserve">Convergence of insurance and financial markets: Hybrid and securitized risk-transfer solutions,</w:t>
-      </w:r>
-      <w:r>
-        <w:rPr>
-          <w:sz w:val="22"/>
+          <w:sz w:val="21"/>
+        </w:rPr>
+        <w:t xml:space="preserve">Diversification through catastrophe bonds: Lessons from the subprime financial crisis,</w:t>
+      </w:r>
+      <w:r>
+        <w:rPr>
+          <w:sz w:val="21"/>
         </w:rPr>
         <w:t xml:space="preserve">”</w:t>
       </w:r>
       <w:r>
         <w:rPr>
-          <w:sz w:val="22"/>
-        </w:rPr>
-        <w:t xml:space="preserve"> </w:t>
-      </w:r>
-      <w:r>
-        <w:rPr>
-          <w:iCs/>
-          <w:i/>
-          <w:sz w:val="22"/>
-        </w:rPr>
-        <w:t xml:space="preserve">Journal of Risk and Insurance</w:t>
-      </w:r>
-      <w:r>
-        <w:rPr>
-          <w:sz w:val="22"/>
-        </w:rPr>
-        <w:t xml:space="preserve">, vol. 76, no. 3, p. 493–545. https://doi.org/10.1111/j.1539-6975.2009.01311.x</w:t>
+          <w:sz w:val="21"/>
+        </w:rPr>
+        <w:t xml:space="preserve"> </w:t>
+      </w:r>
+      <w:r>
+        <w:rPr>
+          <w:iCs/>
+          <w:i/>
+          <w:sz w:val="21"/>
+        </w:rPr>
+        <w:t xml:space="preserve">The Geneva Papers on Risk and Insurance – Issues and Practice</w:t>
+      </w:r>
+      <w:r>
+        <w:rPr>
+          <w:sz w:val="21"/>
+        </w:rPr>
+        <w:t xml:space="preserve">, vol. 40, no. 1, p. 1–28. https://doi.org/10.1057/gpp.2014.14</w:t>
       </w:r>
     </w:p>
     <w:p>
@@ -3802,53 +4309,53 @@
       </w:pPr>
       <w:r>
         <w:rPr>
-          <w:sz w:val="22"/>
-        </w:rPr>
-        <w:t xml:space="preserve">Drobetz, Wolfgang, Henning Schröder, and Lars Tegtmeier (2020).</w:t>
-      </w:r>
-      <w:r>
-        <w:rPr>
-          <w:sz w:val="22"/>
-        </w:rPr>
-        <w:t xml:space="preserve"> </w:t>
-      </w:r>
-      <w:r>
-        <w:rPr>
-          <w:sz w:val="22"/>
+          <w:sz w:val="21"/>
+        </w:rPr>
+        <w:t xml:space="preserve">Cummins, J. David (2008).</w:t>
+      </w:r>
+      <w:r>
+        <w:rPr>
+          <w:sz w:val="21"/>
+        </w:rPr>
+        <w:t xml:space="preserve"> </w:t>
+      </w:r>
+      <w:r>
+        <w:rPr>
+          <w:sz w:val="21"/>
         </w:rPr>
         <w:t xml:space="preserve">“</w:t>
       </w:r>
       <w:r>
         <w:rPr>
-          <w:sz w:val="22"/>
-        </w:rPr>
-        <w:t xml:space="preserve">The role of catastrophe bonds in an international multi-asset portfolio: Diversifier, hedge, or safe haven?</w:t>
-      </w:r>
-      <w:r>
-        <w:rPr>
-          <w:sz w:val="22"/>
+          <w:sz w:val="21"/>
+        </w:rPr>
+        <w:t xml:space="preserve">CAT bonds and other risk-linked securities: State of the market and recent developments,</w:t>
+      </w:r>
+      <w:r>
+        <w:rPr>
+          <w:sz w:val="21"/>
         </w:rPr>
         <w:t xml:space="preserve">”</w:t>
       </w:r>
       <w:r>
         <w:rPr>
-          <w:sz w:val="22"/>
-        </w:rPr>
-        <w:t xml:space="preserve"> </w:t>
-      </w:r>
-      <w:r>
-        <w:rPr>
-          <w:iCs/>
-          <w:i/>
-          <w:sz w:val="22"/>
-        </w:rPr>
-        <w:t xml:space="preserve">Finance Research Letters</w:t>
-      </w:r>
-      <w:r>
-        <w:rPr>
-          <w:sz w:val="22"/>
-        </w:rPr>
-        <w:t xml:space="preserve">, vol. 33, article 101198. https://doi.org/10.1016/j.frl.2019.05.016</w:t>
+          <w:sz w:val="21"/>
+        </w:rPr>
+        <w:t xml:space="preserve"> </w:t>
+      </w:r>
+      <w:r>
+        <w:rPr>
+          <w:iCs/>
+          <w:i/>
+          <w:sz w:val="21"/>
+        </w:rPr>
+        <w:t xml:space="preserve">Risk Management and Insurance Review</w:t>
+      </w:r>
+      <w:r>
+        <w:rPr>
+          <w:sz w:val="21"/>
+        </w:rPr>
+        <w:t xml:space="preserve">, vol. 11, no. 1, p. 23–47. https://doi.org/10.1111/j.1540-6296.2008.00127.x</w:t>
       </w:r>
     </w:p>
     <w:p>
@@ -3860,53 +4367,53 @@
       </w:pPr>
       <w:r>
         <w:rPr>
-          <w:sz w:val="22"/>
-        </w:rPr>
-        <w:t xml:space="preserve">Feng, Chi, and Xudong Zeng (2025).</w:t>
-      </w:r>
-      <w:r>
-        <w:rPr>
-          <w:sz w:val="22"/>
-        </w:rPr>
-        <w:t xml:space="preserve"> </w:t>
-      </w:r>
-      <w:r>
-        <w:rPr>
-          <w:sz w:val="22"/>
+          <w:sz w:val="21"/>
+        </w:rPr>
+        <w:t xml:space="preserve">Cummins, J. David, and Mary A. Weiss (2009).</w:t>
+      </w:r>
+      <w:r>
+        <w:rPr>
+          <w:sz w:val="21"/>
+        </w:rPr>
+        <w:t xml:space="preserve"> </w:t>
+      </w:r>
+      <w:r>
+        <w:rPr>
+          <w:sz w:val="21"/>
         </w:rPr>
         <w:t xml:space="preserve">“</w:t>
       </w:r>
       <w:r>
         <w:rPr>
-          <w:sz w:val="22"/>
-        </w:rPr>
-        <w:t xml:space="preserve">The Covid-19 pandemic and the portfolio diversification effect of catastrophe bonds,</w:t>
-      </w:r>
-      <w:r>
-        <w:rPr>
-          <w:sz w:val="22"/>
+          <w:sz w:val="21"/>
+        </w:rPr>
+        <w:t xml:space="preserve">Convergence of insurance and financial markets: Hybrid and securitized risk-transfer solutions,</w:t>
+      </w:r>
+      <w:r>
+        <w:rPr>
+          <w:sz w:val="21"/>
         </w:rPr>
         <w:t xml:space="preserve">”</w:t>
       </w:r>
       <w:r>
         <w:rPr>
-          <w:sz w:val="22"/>
-        </w:rPr>
-        <w:t xml:space="preserve"> </w:t>
-      </w:r>
-      <w:r>
-        <w:rPr>
-          <w:iCs/>
-          <w:i/>
-          <w:sz w:val="22"/>
-        </w:rPr>
-        <w:t xml:space="preserve">Journal of Risk</w:t>
-      </w:r>
-      <w:r>
-        <w:rPr>
-          <w:sz w:val="22"/>
-        </w:rPr>
-        <w:t xml:space="preserve">, vol. 27, no. 4, p. 85–112. https://doi.org/10.21314/JOR.2024.022</w:t>
+          <w:sz w:val="21"/>
+        </w:rPr>
+        <w:t xml:space="preserve"> </w:t>
+      </w:r>
+      <w:r>
+        <w:rPr>
+          <w:iCs/>
+          <w:i/>
+          <w:sz w:val="21"/>
+        </w:rPr>
+        <w:t xml:space="preserve">Journal of Risk and Insurance</w:t>
+      </w:r>
+      <w:r>
+        <w:rPr>
+          <w:sz w:val="21"/>
+        </w:rPr>
+        <w:t xml:space="preserve">, vol. 76, no. 3, p. 493–545. https://doi.org/10.1111/j.1539-6975.2009.01311.x</w:t>
       </w:r>
     </w:p>
     <w:p>
@@ -3918,53 +4425,53 @@
       </w:pPr>
       <w:r>
         <w:rPr>
-          <w:sz w:val="22"/>
-        </w:rPr>
-        <w:t xml:space="preserve">Forbes, Kristin J., and Roberto Rigobon (2002).</w:t>
-      </w:r>
-      <w:r>
-        <w:rPr>
-          <w:sz w:val="22"/>
-        </w:rPr>
-        <w:t xml:space="preserve"> </w:t>
-      </w:r>
-      <w:r>
-        <w:rPr>
-          <w:sz w:val="22"/>
+          <w:sz w:val="21"/>
+        </w:rPr>
+        <w:t xml:space="preserve">Dimson, Elroy (1979).</w:t>
+      </w:r>
+      <w:r>
+        <w:rPr>
+          <w:sz w:val="21"/>
+        </w:rPr>
+        <w:t xml:space="preserve"> </w:t>
+      </w:r>
+      <w:r>
+        <w:rPr>
+          <w:sz w:val="21"/>
         </w:rPr>
         <w:t xml:space="preserve">“</w:t>
       </w:r>
       <w:r>
         <w:rPr>
-          <w:sz w:val="22"/>
-        </w:rPr>
-        <w:t xml:space="preserve">No contagion, only interdependence: Measuring stock market comovements,</w:t>
-      </w:r>
-      <w:r>
-        <w:rPr>
-          <w:sz w:val="22"/>
+          <w:sz w:val="21"/>
+        </w:rPr>
+        <w:t xml:space="preserve">Risk measurement when shares are subject to infrequent trading,</w:t>
+      </w:r>
+      <w:r>
+        <w:rPr>
+          <w:sz w:val="21"/>
         </w:rPr>
         <w:t xml:space="preserve">”</w:t>
       </w:r>
       <w:r>
         <w:rPr>
-          <w:sz w:val="22"/>
-        </w:rPr>
-        <w:t xml:space="preserve"> </w:t>
-      </w:r>
-      <w:r>
-        <w:rPr>
-          <w:iCs/>
-          <w:i/>
-          <w:sz w:val="22"/>
-        </w:rPr>
-        <w:t xml:space="preserve">Journal of Finance</w:t>
-      </w:r>
-      <w:r>
-        <w:rPr>
-          <w:sz w:val="22"/>
-        </w:rPr>
-        <w:t xml:space="preserve">, vol. 57, no. 5, p. 2223–2261. https://doi.org/10.1111/0022-1082.00494</w:t>
+          <w:sz w:val="21"/>
+        </w:rPr>
+        <w:t xml:space="preserve"> </w:t>
+      </w:r>
+      <w:r>
+        <w:rPr>
+          <w:iCs/>
+          <w:i/>
+          <w:sz w:val="21"/>
+        </w:rPr>
+        <w:t xml:space="preserve">Journal of Financial Economics</w:t>
+      </w:r>
+      <w:r>
+        <w:rPr>
+          <w:sz w:val="21"/>
+        </w:rPr>
+        <w:t xml:space="preserve">, vol. 7, no. 2, p. 197–226. https://doi.org/10.1016/0304-405X(79)90013-8</w:t>
       </w:r>
     </w:p>
     <w:p>
@@ -3976,53 +4483,53 @@
       </w:pPr>
       <w:r>
         <w:rPr>
-          <w:sz w:val="22"/>
-        </w:rPr>
-        <w:t xml:space="preserve">Froot, Kenneth A. (2001).</w:t>
-      </w:r>
-      <w:r>
-        <w:rPr>
-          <w:sz w:val="22"/>
-        </w:rPr>
-        <w:t xml:space="preserve"> </w:t>
-      </w:r>
-      <w:r>
-        <w:rPr>
-          <w:sz w:val="22"/>
+          <w:sz w:val="21"/>
+        </w:rPr>
+        <w:t xml:space="preserve">Drobetz, Wolfgang, Henning Schröder, and Lars Tegtmeier (2020).</w:t>
+      </w:r>
+      <w:r>
+        <w:rPr>
+          <w:sz w:val="21"/>
+        </w:rPr>
+        <w:t xml:space="preserve"> </w:t>
+      </w:r>
+      <w:r>
+        <w:rPr>
+          <w:sz w:val="21"/>
         </w:rPr>
         <w:t xml:space="preserve">“</w:t>
       </w:r>
       <w:r>
         <w:rPr>
-          <w:sz w:val="22"/>
-        </w:rPr>
-        <w:t xml:space="preserve">The market for catastrophe risk: A clinical examination,</w:t>
-      </w:r>
-      <w:r>
-        <w:rPr>
-          <w:sz w:val="22"/>
+          <w:sz w:val="21"/>
+        </w:rPr>
+        <w:t xml:space="preserve">The role of catastrophe bonds in an international multi-asset portfolio: Diversifier, hedge, or safe haven?</w:t>
+      </w:r>
+      <w:r>
+        <w:rPr>
+          <w:sz w:val="21"/>
         </w:rPr>
         <w:t xml:space="preserve">”</w:t>
       </w:r>
       <w:r>
         <w:rPr>
-          <w:sz w:val="22"/>
-        </w:rPr>
-        <w:t xml:space="preserve"> </w:t>
-      </w:r>
-      <w:r>
-        <w:rPr>
-          <w:iCs/>
-          <w:i/>
-          <w:sz w:val="22"/>
-        </w:rPr>
-        <w:t xml:space="preserve">Journal of Financial Economics</w:t>
-      </w:r>
-      <w:r>
-        <w:rPr>
-          <w:sz w:val="22"/>
-        </w:rPr>
-        <w:t xml:space="preserve">, vol. 60, nos. 2–3, p. 529–571. https://doi.org/10.1016/S0304-405X(01)00052-6</w:t>
+          <w:sz w:val="21"/>
+        </w:rPr>
+        <w:t xml:space="preserve"> </w:t>
+      </w:r>
+      <w:r>
+        <w:rPr>
+          <w:iCs/>
+          <w:i/>
+          <w:sz w:val="21"/>
+        </w:rPr>
+        <w:t xml:space="preserve">Finance Research Letters</w:t>
+      </w:r>
+      <w:r>
+        <w:rPr>
+          <w:sz w:val="21"/>
+        </w:rPr>
+        <w:t xml:space="preserve">, vol. 33, article 101198. https://doi.org/10.1016/j.frl.2019.05.016</w:t>
       </w:r>
     </w:p>
     <w:p>
@@ -4034,53 +4541,53 @@
       </w:pPr>
       <w:r>
         <w:rPr>
-          <w:sz w:val="22"/>
-        </w:rPr>
-        <w:t xml:space="preserve">Getmansky, Mila, Andrew W. Lo, and Igor Makarov (2004).</w:t>
-      </w:r>
-      <w:r>
-        <w:rPr>
-          <w:sz w:val="22"/>
-        </w:rPr>
-        <w:t xml:space="preserve"> </w:t>
-      </w:r>
-      <w:r>
-        <w:rPr>
-          <w:sz w:val="22"/>
+          <w:sz w:val="21"/>
+        </w:rPr>
+        <w:t xml:space="preserve">Duffie, Darrell (2010).</w:t>
+      </w:r>
+      <w:r>
+        <w:rPr>
+          <w:sz w:val="21"/>
+        </w:rPr>
+        <w:t xml:space="preserve"> </w:t>
+      </w:r>
+      <w:r>
+        <w:rPr>
+          <w:sz w:val="21"/>
         </w:rPr>
         <w:t xml:space="preserve">“</w:t>
       </w:r>
       <w:r>
         <w:rPr>
-          <w:sz w:val="22"/>
-        </w:rPr>
-        <w:t xml:space="preserve">An econometric model of serial correlation and illiquidity in hedge fund returns,</w:t>
-      </w:r>
-      <w:r>
-        <w:rPr>
-          <w:sz w:val="22"/>
+          <w:sz w:val="21"/>
+        </w:rPr>
+        <w:t xml:space="preserve">Presidential address: Asset price dynamics with slow-moving capital,</w:t>
+      </w:r>
+      <w:r>
+        <w:rPr>
+          <w:sz w:val="21"/>
         </w:rPr>
         <w:t xml:space="preserve">”</w:t>
       </w:r>
       <w:r>
         <w:rPr>
-          <w:sz w:val="22"/>
-        </w:rPr>
-        <w:t xml:space="preserve"> </w:t>
-      </w:r>
-      <w:r>
-        <w:rPr>
-          <w:iCs/>
-          <w:i/>
-          <w:sz w:val="22"/>
-        </w:rPr>
-        <w:t xml:space="preserve">Journal of Financial Economics</w:t>
-      </w:r>
-      <w:r>
-        <w:rPr>
-          <w:sz w:val="22"/>
-        </w:rPr>
-        <w:t xml:space="preserve">, vol. 74, no. 3, p. 529–609. https://doi.org/10.1016/j.jfineco.2004.04.001</w:t>
+          <w:sz w:val="21"/>
+        </w:rPr>
+        <w:t xml:space="preserve"> </w:t>
+      </w:r>
+      <w:r>
+        <w:rPr>
+          <w:iCs/>
+          <w:i/>
+          <w:sz w:val="21"/>
+        </w:rPr>
+        <w:t xml:space="preserve">Journal of Finance</w:t>
+      </w:r>
+      <w:r>
+        <w:rPr>
+          <w:sz w:val="21"/>
+        </w:rPr>
+        <w:t xml:space="preserve">, vol. 65, no. 4, p. 1237–1267. https://doi.org/10.1111/j.1540-6261.2010.01569.x</w:t>
       </w:r>
     </w:p>
     <w:p>
@@ -4092,53 +4599,53 @@
       </w:pPr>
       <w:r>
         <w:rPr>
-          <w:sz w:val="22"/>
-        </w:rPr>
-        <w:t xml:space="preserve">Government Actuary’s Department (2021).</w:t>
-      </w:r>
-      <w:r>
-        <w:rPr>
-          <w:sz w:val="22"/>
-        </w:rPr>
-        <w:t xml:space="preserve"> </w:t>
-      </w:r>
-      <w:r>
-        <w:rPr>
-          <w:sz w:val="22"/>
+          <w:sz w:val="21"/>
+        </w:rPr>
+        <w:t xml:space="preserve">Feng, Chi, and Xudong Zeng (2025).</w:t>
+      </w:r>
+      <w:r>
+        <w:rPr>
+          <w:sz w:val="21"/>
+        </w:rPr>
+        <w:t xml:space="preserve"> </w:t>
+      </w:r>
+      <w:r>
+        <w:rPr>
+          <w:sz w:val="21"/>
         </w:rPr>
         <w:t xml:space="preserve">“</w:t>
       </w:r>
       <w:r>
         <w:rPr>
-          <w:sz w:val="22"/>
-        </w:rPr>
-        <w:t xml:space="preserve">Pandemic bonds: What are they and how do they work?</w:t>
-      </w:r>
-      <w:r>
-        <w:rPr>
-          <w:sz w:val="22"/>
+          <w:sz w:val="21"/>
+        </w:rPr>
+        <w:t xml:space="preserve">The Covid-19 pandemic and the portfolio diversification effect of catastrophe bonds,</w:t>
+      </w:r>
+      <w:r>
+        <w:rPr>
+          <w:sz w:val="21"/>
         </w:rPr>
         <w:t xml:space="preserve">”</w:t>
       </w:r>
       <w:r>
         <w:rPr>
-          <w:sz w:val="22"/>
-        </w:rPr>
-        <w:t xml:space="preserve"> </w:t>
-      </w:r>
-      <w:r>
-        <w:rPr>
-          <w:iCs/>
-          <w:i/>
-          <w:sz w:val="22"/>
-        </w:rPr>
-        <w:t xml:space="preserve">GAD blog</w:t>
-      </w:r>
-      <w:r>
-        <w:rPr>
-          <w:sz w:val="22"/>
-        </w:rPr>
-        <w:t xml:space="preserve">, March 2, 2021. https://actuaries.blog.gov.uk/2021/03/02/pandemic-bonds-what-are-they-and-how-do-they-work/</w:t>
+          <w:sz w:val="21"/>
+        </w:rPr>
+        <w:t xml:space="preserve"> </w:t>
+      </w:r>
+      <w:r>
+        <w:rPr>
+          <w:iCs/>
+          <w:i/>
+          <w:sz w:val="21"/>
+        </w:rPr>
+        <w:t xml:space="preserve">Journal of Risk</w:t>
+      </w:r>
+      <w:r>
+        <w:rPr>
+          <w:sz w:val="21"/>
+        </w:rPr>
+        <w:t xml:space="preserve">, vol. 27, no. 4, p. 85–112. https://doi.org/10.21314/JOR.2024.022</w:t>
       </w:r>
     </w:p>
     <w:p>
@@ -4150,53 +4657,53 @@
       </w:pPr>
       <w:r>
         <w:rPr>
-          <w:sz w:val="22"/>
-        </w:rPr>
-        <w:t xml:space="preserve">Gürtler, Marc, Martin Hibbeln, and Christine Winkelvos (2016).</w:t>
-      </w:r>
-      <w:r>
-        <w:rPr>
-          <w:sz w:val="22"/>
-        </w:rPr>
-        <w:t xml:space="preserve"> </w:t>
-      </w:r>
-      <w:r>
-        <w:rPr>
-          <w:sz w:val="22"/>
+          <w:sz w:val="21"/>
+        </w:rPr>
+        <w:t xml:space="preserve">Forbes, Kristin J., and Roberto Rigobon (2002).</w:t>
+      </w:r>
+      <w:r>
+        <w:rPr>
+          <w:sz w:val="21"/>
+        </w:rPr>
+        <w:t xml:space="preserve"> </w:t>
+      </w:r>
+      <w:r>
+        <w:rPr>
+          <w:sz w:val="21"/>
         </w:rPr>
         <w:t xml:space="preserve">“</w:t>
       </w:r>
       <w:r>
         <w:rPr>
-          <w:sz w:val="22"/>
-        </w:rPr>
-        <w:t xml:space="preserve">The impact of the financial crisis and natural catastrophes on CAT bonds,</w:t>
-      </w:r>
-      <w:r>
-        <w:rPr>
-          <w:sz w:val="22"/>
+          <w:sz w:val="21"/>
+        </w:rPr>
+        <w:t xml:space="preserve">No contagion, only interdependence: Measuring stock market comovements,</w:t>
+      </w:r>
+      <w:r>
+        <w:rPr>
+          <w:sz w:val="21"/>
         </w:rPr>
         <w:t xml:space="preserve">”</w:t>
       </w:r>
       <w:r>
         <w:rPr>
-          <w:sz w:val="22"/>
-        </w:rPr>
-        <w:t xml:space="preserve"> </w:t>
-      </w:r>
-      <w:r>
-        <w:rPr>
-          <w:iCs/>
-          <w:i/>
-          <w:sz w:val="22"/>
-        </w:rPr>
-        <w:t xml:space="preserve">Journal of Risk and Insurance</w:t>
-      </w:r>
-      <w:r>
-        <w:rPr>
-          <w:sz w:val="22"/>
-        </w:rPr>
-        <w:t xml:space="preserve">, vol. 83, no. 3, p. 579–612. https://doi.org/10.1111/jori.12057</w:t>
+          <w:sz w:val="21"/>
+        </w:rPr>
+        <w:t xml:space="preserve"> </w:t>
+      </w:r>
+      <w:r>
+        <w:rPr>
+          <w:iCs/>
+          <w:i/>
+          <w:sz w:val="21"/>
+        </w:rPr>
+        <w:t xml:space="preserve">Journal of Finance</w:t>
+      </w:r>
+      <w:r>
+        <w:rPr>
+          <w:sz w:val="21"/>
+        </w:rPr>
+        <w:t xml:space="preserve">, vol. 57, no. 5, p. 2223–2261. https://doi.org/10.1111/0022-1082.00494</w:t>
       </w:r>
     </w:p>
     <w:p>
@@ -4208,53 +4715,53 @@
       </w:pPr>
       <w:r>
         <w:rPr>
-          <w:sz w:val="22"/>
-        </w:rPr>
-        <w:t xml:space="preserve">Haffar, Adlane, and Éric Le Fur (2022).</w:t>
-      </w:r>
-      <w:r>
-        <w:rPr>
-          <w:sz w:val="22"/>
-        </w:rPr>
-        <w:t xml:space="preserve"> </w:t>
-      </w:r>
-      <w:r>
-        <w:rPr>
-          <w:sz w:val="22"/>
+          <w:sz w:val="21"/>
+        </w:rPr>
+        <w:t xml:space="preserve">Froot, Kenneth A. (2001).</w:t>
+      </w:r>
+      <w:r>
+        <w:rPr>
+          <w:sz w:val="21"/>
+        </w:rPr>
+        <w:t xml:space="preserve"> </w:t>
+      </w:r>
+      <w:r>
+        <w:rPr>
+          <w:sz w:val="21"/>
         </w:rPr>
         <w:t xml:space="preserve">“</w:t>
       </w:r>
       <w:r>
         <w:rPr>
-          <w:sz w:val="22"/>
-        </w:rPr>
-        <w:t xml:space="preserve">Dependence structure of CAT bonds and portfolio diversification: A copula-GARCH approach,</w:t>
-      </w:r>
-      <w:r>
-        <w:rPr>
-          <w:sz w:val="22"/>
+          <w:sz w:val="21"/>
+        </w:rPr>
+        <w:t xml:space="preserve">The market for catastrophe risk: A clinical examination,</w:t>
+      </w:r>
+      <w:r>
+        <w:rPr>
+          <w:sz w:val="21"/>
         </w:rPr>
         <w:t xml:space="preserve">”</w:t>
       </w:r>
       <w:r>
         <w:rPr>
-          <w:sz w:val="22"/>
-        </w:rPr>
-        <w:t xml:space="preserve"> </w:t>
-      </w:r>
-      <w:r>
-        <w:rPr>
-          <w:iCs/>
-          <w:i/>
-          <w:sz w:val="22"/>
-        </w:rPr>
-        <w:t xml:space="preserve">Journal of Asset Management</w:t>
-      </w:r>
-      <w:r>
-        <w:rPr>
-          <w:sz w:val="22"/>
-        </w:rPr>
-        <w:t xml:space="preserve">, vol. 23, no. 4, p. 297–309. https://doi.org/10.1057/s41260-022-00271-3</w:t>
+          <w:sz w:val="21"/>
+        </w:rPr>
+        <w:t xml:space="preserve"> </w:t>
+      </w:r>
+      <w:r>
+        <w:rPr>
+          <w:iCs/>
+          <w:i/>
+          <w:sz w:val="21"/>
+        </w:rPr>
+        <w:t xml:space="preserve">Journal of Financial Economics</w:t>
+      </w:r>
+      <w:r>
+        <w:rPr>
+          <w:sz w:val="21"/>
+        </w:rPr>
+        <w:t xml:space="preserve">, vol. 60, nos. 2–3, p. 529–571. https://doi.org/10.1016/S0304-405X(01)00052-6</w:t>
       </w:r>
     </w:p>
     <w:p>
@@ -4266,53 +4773,53 @@
       </w:pPr>
       <w:r>
         <w:rPr>
-          <w:sz w:val="22"/>
-        </w:rPr>
-        <w:t xml:space="preserve">Herrmann, Markus, and Martin Hibbeln (2023).</w:t>
-      </w:r>
-      <w:r>
-        <w:rPr>
-          <w:sz w:val="22"/>
-        </w:rPr>
-        <w:t xml:space="preserve"> </w:t>
-      </w:r>
-      <w:r>
-        <w:rPr>
-          <w:sz w:val="22"/>
+          <w:sz w:val="21"/>
+        </w:rPr>
+        <w:t xml:space="preserve">Getmansky, Mila, Andrew W. Lo, and Igor Makarov (2004).</w:t>
+      </w:r>
+      <w:r>
+        <w:rPr>
+          <w:sz w:val="21"/>
+        </w:rPr>
+        <w:t xml:space="preserve"> </w:t>
+      </w:r>
+      <w:r>
+        <w:rPr>
+          <w:sz w:val="21"/>
         </w:rPr>
         <w:t xml:space="preserve">“</w:t>
       </w:r>
       <w:r>
         <w:rPr>
-          <w:sz w:val="22"/>
-        </w:rPr>
-        <w:t xml:space="preserve">Trading and liquidity in the catastrophe bond market,</w:t>
-      </w:r>
-      <w:r>
-        <w:rPr>
-          <w:sz w:val="22"/>
+          <w:sz w:val="21"/>
+        </w:rPr>
+        <w:t xml:space="preserve">An econometric model of serial correlation and illiquidity in hedge fund returns,</w:t>
+      </w:r>
+      <w:r>
+        <w:rPr>
+          <w:sz w:val="21"/>
         </w:rPr>
         <w:t xml:space="preserve">”</w:t>
       </w:r>
       <w:r>
         <w:rPr>
-          <w:sz w:val="22"/>
-        </w:rPr>
-        <w:t xml:space="preserve"> </w:t>
-      </w:r>
-      <w:r>
-        <w:rPr>
-          <w:iCs/>
-          <w:i/>
-          <w:sz w:val="22"/>
-        </w:rPr>
-        <w:t xml:space="preserve">Journal of Risk and Insurance</w:t>
-      </w:r>
-      <w:r>
-        <w:rPr>
-          <w:sz w:val="22"/>
-        </w:rPr>
-        <w:t xml:space="preserve">, vol. 90, no. 2, p. 283–328. https://doi.org/10.1111/jori.12407</w:t>
+          <w:sz w:val="21"/>
+        </w:rPr>
+        <w:t xml:space="preserve"> </w:t>
+      </w:r>
+      <w:r>
+        <w:rPr>
+          <w:iCs/>
+          <w:i/>
+          <w:sz w:val="21"/>
+        </w:rPr>
+        <w:t xml:space="preserve">Journal of Financial Economics</w:t>
+      </w:r>
+      <w:r>
+        <w:rPr>
+          <w:sz w:val="21"/>
+        </w:rPr>
+        <w:t xml:space="preserve">, vol. 74, no. 3, p. 529–609. https://doi.org/10.1016/j.jfineco.2004.04.001</w:t>
       </w:r>
     </w:p>
     <w:p>
@@ -4324,53 +4831,343 @@
       </w:pPr>
       <w:r>
         <w:rPr>
-          <w:sz w:val="22"/>
+          <w:sz w:val="21"/>
+        </w:rPr>
+        <w:t xml:space="preserve">Government Actuary’s Department (2021).</w:t>
+      </w:r>
+      <w:r>
+        <w:rPr>
+          <w:sz w:val="21"/>
+        </w:rPr>
+        <w:t xml:space="preserve"> </w:t>
+      </w:r>
+      <w:r>
+        <w:rPr>
+          <w:sz w:val="21"/>
+        </w:rPr>
+        <w:t xml:space="preserve">“</w:t>
+      </w:r>
+      <w:r>
+        <w:rPr>
+          <w:sz w:val="21"/>
+        </w:rPr>
+        <w:t xml:space="preserve">Pandemic bonds: What are they and how do they work?</w:t>
+      </w:r>
+      <w:r>
+        <w:rPr>
+          <w:sz w:val="21"/>
+        </w:rPr>
+        <w:t xml:space="preserve">”</w:t>
+      </w:r>
+      <w:r>
+        <w:rPr>
+          <w:sz w:val="21"/>
+        </w:rPr>
+        <w:t xml:space="preserve"> </w:t>
+      </w:r>
+      <w:r>
+        <w:rPr>
+          <w:iCs/>
+          <w:i/>
+          <w:sz w:val="21"/>
+        </w:rPr>
+        <w:t xml:space="preserve">GAD blog</w:t>
+      </w:r>
+      <w:r>
+        <w:rPr>
+          <w:sz w:val="21"/>
+        </w:rPr>
+        <w:t xml:space="preserve">, March 2, 2021. https://actuaries.blog.gov.uk/2021/03/02/pandemic-bonds-what-are-they-and-how-do-they-work/</w:t>
+      </w:r>
+    </w:p>
+    <w:p>
+      <w:pPr>
+        <w:pStyle w:val="BodyText"/>
+        <w:spacing w:after="80" w:line="240" w:lineRule="auto"/>
+        <w:ind w:left="567" w:hanging="567"/>
+        <w:jc w:val="left"/>
+      </w:pPr>
+      <w:r>
+        <w:rPr>
+          <w:sz w:val="21"/>
+        </w:rPr>
+        <w:t xml:space="preserve">Gürtler, Marc, Martin Hibbeln, and Christine Winkelvos (2016).</w:t>
+      </w:r>
+      <w:r>
+        <w:rPr>
+          <w:sz w:val="21"/>
+        </w:rPr>
+        <w:t xml:space="preserve"> </w:t>
+      </w:r>
+      <w:r>
+        <w:rPr>
+          <w:sz w:val="21"/>
+        </w:rPr>
+        <w:t xml:space="preserve">“</w:t>
+      </w:r>
+      <w:r>
+        <w:rPr>
+          <w:sz w:val="21"/>
+        </w:rPr>
+        <w:t xml:space="preserve">The impact of the financial crisis and natural catastrophes on CAT bonds,</w:t>
+      </w:r>
+      <w:r>
+        <w:rPr>
+          <w:sz w:val="21"/>
+        </w:rPr>
+        <w:t xml:space="preserve">”</w:t>
+      </w:r>
+      <w:r>
+        <w:rPr>
+          <w:sz w:val="21"/>
+        </w:rPr>
+        <w:t xml:space="preserve"> </w:t>
+      </w:r>
+      <w:r>
+        <w:rPr>
+          <w:iCs/>
+          <w:i/>
+          <w:sz w:val="21"/>
+        </w:rPr>
+        <w:t xml:space="preserve">Journal of Risk and Insurance</w:t>
+      </w:r>
+      <w:r>
+        <w:rPr>
+          <w:sz w:val="21"/>
+        </w:rPr>
+        <w:t xml:space="preserve">, vol. 83, no. 3, p. 579–612. https://doi.org/10.1111/jori.12057</w:t>
+      </w:r>
+    </w:p>
+    <w:p>
+      <w:pPr>
+        <w:pStyle w:val="BodyText"/>
+        <w:spacing w:after="80" w:line="240" w:lineRule="auto"/>
+        <w:ind w:left="567" w:hanging="567"/>
+        <w:jc w:val="left"/>
+      </w:pPr>
+      <w:r>
+        <w:rPr>
+          <w:sz w:val="21"/>
+        </w:rPr>
+        <w:t xml:space="preserve">Haffar, Adlane, and Éric Le Fur (2022).</w:t>
+      </w:r>
+      <w:r>
+        <w:rPr>
+          <w:sz w:val="21"/>
+        </w:rPr>
+        <w:t xml:space="preserve"> </w:t>
+      </w:r>
+      <w:r>
+        <w:rPr>
+          <w:sz w:val="21"/>
+        </w:rPr>
+        <w:t xml:space="preserve">“</w:t>
+      </w:r>
+      <w:r>
+        <w:rPr>
+          <w:sz w:val="21"/>
+        </w:rPr>
+        <w:t xml:space="preserve">Dependence structure of CAT bonds and portfolio diversification: A copula-GARCH approach,</w:t>
+      </w:r>
+      <w:r>
+        <w:rPr>
+          <w:sz w:val="21"/>
+        </w:rPr>
+        <w:t xml:space="preserve">”</w:t>
+      </w:r>
+      <w:r>
+        <w:rPr>
+          <w:sz w:val="21"/>
+        </w:rPr>
+        <w:t xml:space="preserve"> </w:t>
+      </w:r>
+      <w:r>
+        <w:rPr>
+          <w:iCs/>
+          <w:i/>
+          <w:sz w:val="21"/>
+        </w:rPr>
+        <w:t xml:space="preserve">Journal of Asset Management</w:t>
+      </w:r>
+      <w:r>
+        <w:rPr>
+          <w:sz w:val="21"/>
+        </w:rPr>
+        <w:t xml:space="preserve">, vol. 23, no. 4, p. 297–309. https://doi.org/10.1057/s41260-022-00271-3</w:t>
+      </w:r>
+    </w:p>
+    <w:p>
+      <w:pPr>
+        <w:pStyle w:val="BodyText"/>
+        <w:spacing w:after="80" w:line="240" w:lineRule="auto"/>
+        <w:ind w:left="567" w:hanging="567"/>
+        <w:jc w:val="left"/>
+      </w:pPr>
+      <w:r>
+        <w:rPr>
+          <w:sz w:val="21"/>
+        </w:rPr>
+        <w:t xml:space="preserve">Herrmann, Markus, and Martin Hibbeln (2023).</w:t>
+      </w:r>
+      <w:r>
+        <w:rPr>
+          <w:sz w:val="21"/>
+        </w:rPr>
+        <w:t xml:space="preserve"> </w:t>
+      </w:r>
+      <w:r>
+        <w:rPr>
+          <w:sz w:val="21"/>
+        </w:rPr>
+        <w:t xml:space="preserve">“</w:t>
+      </w:r>
+      <w:r>
+        <w:rPr>
+          <w:sz w:val="21"/>
+        </w:rPr>
+        <w:t xml:space="preserve">Trading and liquidity in the catastrophe bond market,</w:t>
+      </w:r>
+      <w:r>
+        <w:rPr>
+          <w:sz w:val="21"/>
+        </w:rPr>
+        <w:t xml:space="preserve">”</w:t>
+      </w:r>
+      <w:r>
+        <w:rPr>
+          <w:sz w:val="21"/>
+        </w:rPr>
+        <w:t xml:space="preserve"> </w:t>
+      </w:r>
+      <w:r>
+        <w:rPr>
+          <w:iCs/>
+          <w:i/>
+          <w:sz w:val="21"/>
+        </w:rPr>
+        <w:t xml:space="preserve">Journal of Risk and Insurance</w:t>
+      </w:r>
+      <w:r>
+        <w:rPr>
+          <w:sz w:val="21"/>
+        </w:rPr>
+        <w:t xml:space="preserve">, vol. 90, no. 2, p. 283–328. https://doi.org/10.1111/jori.12407</w:t>
+      </w:r>
+    </w:p>
+    <w:p>
+      <w:pPr>
+        <w:pStyle w:val="BodyText"/>
+        <w:spacing w:after="80" w:line="240" w:lineRule="auto"/>
+        <w:ind w:left="567" w:hanging="567"/>
+        <w:jc w:val="left"/>
+      </w:pPr>
+      <w:r>
+        <w:rPr>
+          <w:sz w:val="21"/>
         </w:rPr>
         <w:t xml:space="preserve">Insurance Insider ILS (2020).</w:t>
       </w:r>
       <w:r>
         <w:rPr>
-          <w:sz w:val="22"/>
-        </w:rPr>
-        <w:t xml:space="preserve"> </w:t>
-      </w:r>
-      <w:r>
-        <w:rPr>
-          <w:sz w:val="22"/>
+          <w:sz w:val="21"/>
+        </w:rPr>
+        <w:t xml:space="preserve"> </w:t>
+      </w:r>
+      <w:r>
+        <w:rPr>
+          <w:sz w:val="21"/>
         </w:rPr>
         <w:t xml:space="preserve">“</w:t>
       </w:r>
       <w:r>
         <w:rPr>
-          <w:sz w:val="22"/>
+          <w:sz w:val="21"/>
         </w:rPr>
         <w:t xml:space="preserve">Cat bond prices limit Covid-19 fall to under 1%,</w:t>
       </w:r>
       <w:r>
         <w:rPr>
-          <w:sz w:val="22"/>
+          <w:sz w:val="21"/>
         </w:rPr>
         <w:t xml:space="preserve">”</w:t>
       </w:r>
       <w:r>
         <w:rPr>
-          <w:sz w:val="22"/>
-        </w:rPr>
-        <w:t xml:space="preserve"> </w:t>
-      </w:r>
-      <w:r>
-        <w:rPr>
-          <w:iCs/>
-          <w:i/>
-          <w:sz w:val="22"/>
+          <w:sz w:val="21"/>
+        </w:rPr>
+        <w:t xml:space="preserve"> </w:t>
+      </w:r>
+      <w:r>
+        <w:rPr>
+          <w:iCs/>
+          <w:i/>
+          <w:sz w:val="21"/>
         </w:rPr>
         <w:t xml:space="preserve">Insurance Insider ILS</w:t>
       </w:r>
       <w:r>
         <w:rPr>
-          <w:sz w:val="22"/>
+          <w:sz w:val="21"/>
         </w:rPr>
         <w:t xml:space="preserve">, March 2020. https://www.insuranceinsiderils.com/article/2876fhy9ajjsuvp26rkuq/cat-bond-prices-limit-covid-19-fall-to-under-1</w:t>
+      </w:r>
+    </w:p>
+    <w:p>
+      <w:pPr>
+        <w:pStyle w:val="BodyText"/>
+        <w:spacing w:after="80" w:line="240" w:lineRule="auto"/>
+        <w:ind w:left="567" w:hanging="567"/>
+        <w:jc w:val="left"/>
+      </w:pPr>
+      <w:r>
+        <w:rPr>
+          <w:sz w:val="21"/>
+        </w:rPr>
+        <w:t xml:space="preserve">The Insurer (2020).</w:t>
+      </w:r>
+      <w:r>
+        <w:rPr>
+          <w:sz w:val="21"/>
+        </w:rPr>
+        <w:t xml:space="preserve"> </w:t>
+      </w:r>
+      <w:r>
+        <w:rPr>
+          <w:sz w:val="21"/>
+        </w:rPr>
+        <w:t xml:space="preserve">“</w:t>
+      </w:r>
+      <w:r>
+        <w:rPr>
+          <w:sz w:val="21"/>
+        </w:rPr>
+        <w:t xml:space="preserve">Cat bonds nudge up after temporary Covid-19 sell-off,</w:t>
+      </w:r>
+      <w:r>
+        <w:rPr>
+          <w:sz w:val="21"/>
+        </w:rPr>
+        <w:t xml:space="preserve">”</w:t>
+      </w:r>
+      <w:r>
+        <w:rPr>
+          <w:sz w:val="21"/>
+        </w:rPr>
+        <w:t xml:space="preserve"> </w:t>
+      </w:r>
+      <w:r>
+        <w:rPr>
+          <w:iCs/>
+          <w:i/>
+          <w:sz w:val="21"/>
+        </w:rPr>
+        <w:t xml:space="preserve">The Insurer</w:t>
+      </w:r>
+      <w:r>
+        <w:rPr>
+          <w:sz w:val="21"/>
+        </w:rPr>
+        <w:t xml:space="preserve">, May 2020. https://theinsurer.com/analysis/cat-bonds-nudge-up-after-temporary-covid-19-sell-off</w:t>
       </w:r>
     </w:p>
     <w:bookmarkEnd w:id="36"/>
@@ -4730,7 +5527,7 @@
     <w:name w:val="Normal"/>
     <w:qFormat/>
     <w:pPr>
-      <w:spacing w:after="120" w:before="0" w:line="276" w:lineRule="auto"/>
+      <w:spacing w:after="80" w:before="0" w:line="276" w:lineRule="auto"/>
     </w:pPr>
     <w:rPr>
       <w:rFonts w:ascii="Times New Roman" w:cs="Times New Roman" w:eastAsia="Times New Roman" w:hAnsi="Times New Roman"/>
@@ -4743,7 +5540,7 @@
     <w:basedOn w:val="Normal"/>
     <w:link w:val="BodyTextChar"/>
     <w:pPr>
-      <w:spacing w:after="120" w:before="0" w:line="276" w:lineRule="auto"/>
+      <w:spacing w:after="80" w:before="0" w:line="276" w:lineRule="auto"/>
       <w:jc w:val="both"/>
     </w:pPr>
     <w:qFormat/>
@@ -4759,7 +5556,7 @@
     <w:next w:val="BodyText"/>
     <w:qFormat/>
     <w:pPr>
-      <w:spacing w:after="120" w:before="0" w:line="276" w:lineRule="auto"/>
+      <w:spacing w:after="80" w:before="0" w:line="276" w:lineRule="auto"/>
       <w:jc w:val="both"/>
     </w:pPr>
     <w:rPr>
@@ -4773,7 +5570,7 @@
     <w:basedOn w:val="BodyText"/>
     <w:qFormat/>
     <w:pPr>
-      <w:spacing w:after="120" w:before="0" w:line="276" w:lineRule="auto"/>
+      <w:spacing w:after="80" w:before="0" w:line="276" w:lineRule="auto"/>
     </w:pPr>
     <w:rPr>
       <w:rFonts w:ascii="Times New Roman" w:cs="Times New Roman" w:eastAsia="Times New Roman" w:hAnsi="Times New Roman"/>

</xml_diff>

<commit_message>
Verify the paper against the full texts of the three articles
Add samples, data series and key coefficients from each article; correct
Haffar and Le Fur's data (GAMSTAR fund, monthly, 2011-2020) and the source
of their extreme co-movement result; correct Drobetz et al.'s sub-periods
and safe-haven test; use Carayannopoulos and Perez for post-2009
collateral and for the timing of the 2008 correlation; keep 15 pages and
stop table rows from splitting across pages.

Co-Authored-By: Claude Opus 5.5 <noreply@anthropic.com>
Claude-Session: https://claude.ai/code/session_01BdQY4NFtUtwfapZaVYAnaN
</commit_message>
<xml_diff>
--- a/cat-bonds-final-paper/paper.docx
+++ b/cat-bonds-final-paper/paper.docx
@@ -133,7 +133,7 @@
         <w:pStyle w:val="FirstParagraph"/>
       </w:pPr>
       <w:r>
-        <w:t xml:space="preserve">A catastrophe (CAT) bond lets an insurer, a reinsurer or a government pass part of its exposure to a natural disaster to capital-market investors. The sponsor pays a premium, the investors put up principal that is held as collateral, and if a specified hurricane, earthquake or other event occurs before maturity, part or all of that principal goes to the sponsor (Cummins, 2008). Froot (2001) showed that catastrophe reinsurance in the 1990s was priced far above expected losses and traced the gap to frictions in the supply of reinsurance capital. Securitization was one answer: it opens catastrophe risk to investors whose combined wealth is much larger than the capital of the reinsurance industry.</w:t>
+        <w:t xml:space="preserve">A catastrophe (CAT) bond lets an insurer, a reinsurer or a government pass part of its exposure to natural disasters to capital-market investors. The sponsor pays a premium, the investors put up principal that is held as collateral, and if a specified hurricane, earthquake or other event occurs before maturity, part or all of that principal goes to the sponsor (Cummins, 2008). Froot (2001) showed that catastrophe reinsurance in the 1990s was priced far above expected losses and traced the gap to frictions in the supply of reinsurance capital. Securitization opened catastrophe risk to investors with far more capital, and the market grew accordingly: outstanding CAT bond risk capital rose from about $2.2 billion in 2002 to $23 billion in June 2017 (Drobetz et al., 2020).</w:t>
       </w:r>
     </w:p>
     <w:p>
@@ -141,7 +141,7 @@
         <w:pStyle w:val="BodyText"/>
       </w:pPr>
       <w:r>
-        <w:t xml:space="preserve">To attract those investors, the market offered a simple argument. Whether a hurricane hits Florida or an earthquake hits Tokyo does not depend on the stock market, so the losses on a CAT bond should be unrelated to the losses on stocks and corporate bonds. In CAPM terms, CAT bonds would be zero-beta assets. Their spread over the risk-free rate should then do little more than cover expected losses, and any spread well above that level would be an attractive reward for a risk that adds nothing to the systematic risk of a diversified portfolio.</w:t>
+        <w:t xml:space="preserve">To attract those investors, the market offered a simple argument. Whether a hurricane hits Florida or an earthquake hits Tokyo does not depend on the stock market, so the losses on a CAT bond should be unrelated to the losses on stocks and corporate bonds. In CAPM terms, CAT bonds would be zero-beta assets. Their spread over the risk-free rate should then do little more than cover expected losses, and any spread above that level would be an attractive reward for a risk that adds nothing to the systematic risk of a diversified portfolio.</w:t>
       </w:r>
     </w:p>
     <w:p>
@@ -157,7 +157,7 @@
         <w:pStyle w:val="BodyText"/>
       </w:pPr>
       <w:r>
-        <w:t xml:space="preserve">Three positions can be distinguished. The first supports the zero-beta view: Carayannopoulos and Perez (2015) find that CAT bonds behaved as zero-beta assets outside crisis periods, and Haffar and Le Fur (2022) find that, of the assets they study, CAT bonds add the least to the probability of extreme joint movements with an equity portfolio. The second rejects it: Gürtler, Hibbeln and Winkelvos (2016) conclude from the link between CAT bond premiums and corporate bond spreads that CAT bonds should not be regarded as zero-beta securities, and Carayannopoulos and Perez themselves find that CAT bond returns became correlated with the market after the collapse of Lehman Brothers. The third makes the answer depend on the period: Drobetz, Schröder and Tegtmeier (2020) find that CAT bonds are a diversifier but a poor hedge, and a strong safe haven against extreme stock market declines only after the financial crisis, while Feng and Zeng (2025) find a safe haven against stocks after the COVID-19 outbreak.</w:t>
+        <w:t xml:space="preserve">Three positions can be distinguished. Haffar and Le Fur (2022) support the zero-beta view: in their sample, CAT bonds add the least to the probability of extreme joint movements with an equity portfolio. Carayannopoulos and Perez (2015) and Gürtler, Hibbeln and Winkelvos (2016) reject it: CAT bond returns became correlated with the stock market after the collapse of Lehman Brothers, and CAT bond premiums move with corporate bond spreads. Drobetz, Schröder and Tegtmeier (2020) also conclude that CAT bonds do not behave like a zero-beta investment, but they find that CAT bonds acted as a safe haven against extreme stock market declines after the financial crisis, a result that Feng and Zeng (2025) extend to the COVID-19 period. In this third position the answer depends on the period.</w:t>
       </w:r>
     </w:p>
     <w:p>
@@ -189,7 +189,7 @@
         <w:t xml:space="preserve"> </w:t>
       </w:r>
       <w:r>
-        <w:t xml:space="preserve">I argue that the disagreement has little to do with whether catastrophes occur and much to do with how catastrophe risk is collateralised, priced and measured. It comes from four sources: the property being tested (diversifier, hedge or safe haven), the collateral structure in force during the sample, the type of stress (a shortage of funding or a fall in equity prices), and the way CAT bond returns are measured. As my personal contribution, I propose a decomposition of the CAT bond return into an insurance core, whose losses are independent of markets for natural perils, and a financial wrapper, whose market exposure changes with the bond’s structure and with the stress episode. The decomposition sorts the episodes studied in the literature into four regimes, makes predictions that can be tested, and leads to proposals for investors.</w:t>
+        <w:t xml:space="preserve">I argue that the disagreement has little to do with whether catastrophes occur and much to do with how catastrophe risk is collateralised, priced and measured. It comes from four sources: the property being tested (diversifier, hedge or safe haven), the collateral structure in force during the sample, the type of stress (a shortage of funding or a fall in equity prices), and the way CAT bond returns are measured. As my personal contribution, I propose a decomposition of the CAT bond return into an insurance core, whose losses are independent of markets for natural perils, and a financial wrapper, whose market exposure changes with the bond’s structure and with the stress episode. The decomposition sorts the samples of the three articles into four regimes, makes predictions that can be tested, and leads to proposals for investors.</w:t>
       </w:r>
     </w:p>
     <w:p>
@@ -224,7 +224,7 @@
         <w:pStyle w:val="FirstParagraph"/>
       </w:pPr>
       <w:r>
-        <w:t xml:space="preserve">A sponsor sets up a special purpose vehicle (SPV) that sells notes to investors and signs a reinsurance contract with the sponsor. The proceeds of the notes are placed in a collateral trust account. Investors receive the return earned by the collateral plus a fixed risk spread paid out of the sponsor’s premium. If a qualifying event occurs, the collateral is released to the sponsor to pay its claims and investors lose part or all of their principal (Cummins, 2008). The trigger can be the sponsor’s own losses (indemnity), an industry loss index, a modelled loss, or a physical parameter such as wind speed. Index and parametric triggers reduce moral hazard at the cost of basis risk for the sponsor (Cummins, 2008; Cummins and Weiss, 2009).</w:t>
+        <w:t xml:space="preserve">A sponsor sets up a special purpose vehicle (SPV) that sells notes to investors and signs a reinsurance contract with the sponsor. The proceeds of the notes are placed in a collateral trust account. Investors receive a floating coupon, a money-market rate plus a risk premium, and the bonds usually mature in three to four years (Drobetz et al., 2020). If a qualifying event occurs, the collateral is released to the sponsor and investors lose part or all of their principal. The trigger can be the sponsor’s own losses, an industry loss index, a modelled loss or a physical parameter such as wind speed (Cummins, 2008; Cummins and Weiss, 2009).</w:t>
       </w:r>
     </w:p>
     <w:p>
@@ -245,7 +245,7 @@
         <w:t xml:space="preserve">collateral</w:t>
       </w:r>
       <w:r>
-        <w:t xml:space="preserve">. Before 2009, many deals did not simply hold government securities. The collateral was invested in other assets, and an investment bank promised the SPV a money-market return through a total return swap, making up any shortfall in the value of the collateral. Lehman Brothers Special Financing was the swap counterparty for four CAT bonds: Ajax Re, Carillon, Newton Re and Willow Re. When Lehman failed in September 2008, the collateral lost its guarantee. Ajax Re paid all its interest but could not repay its principal in full at maturity in May 2009 because the collateral assets were worth less than the notes (Artemis, 2009). Carayannopoulos and Perez (2015) attribute the crisis effect on CAT bonds mainly to weaknesses in the composition and structure of the trust account, and they observe that new bonds issued from 2009 onward used improved structures. No new CAT bond used a total return swap after 2009, and by the end of 2011 Treasury money-market funds accounted for more than 60 percent of collateral structures, alongside structured notes and tri-party repurchase agreements (Artemis, 2011).</w:t>
+        <w:t xml:space="preserve">. Before 2009, the vast majority of CAT bonds used a total return swap: an investment bank converted the return on the collateral into a money-market rate and was supposed to absorb changes in the value of the collateral. The collateral itself often had much longer maturities than the bond and could include highly rated asset-backed and mortgage-backed securities, with little monitoring and no obligation for the swap counterparty to keep its value above a threshold (Carayannopoulos and Perez, 2015). Lehman Brothers Special Financing was the swap counterparty for four CAT bonds: Ajax Re, Carillon, Newton Re and Willow Re. When Lehman failed in September 2008, these bonds were downgraded and their collateral lost value. Ajax Re paid all its interest but could not repay its principal in full at maturity in May 2009 (Artemis, 2009). After issuance froze in late 2008, new deals restricted collateral to cash, government-guaranteed bank debt, U.S. Treasury money-market funds and putable notes from sovereign or quasi-governmental issuers, with frequent mark-to-market and trustee monitoring (Carayannopoulos and Perez, 2015). No new CAT bond used a total return swap after 2009, and by the end of 2011 Treasury money-market funds accounted for more than 60 percent of collateral structures (Artemis, 2011).</w:t>
       </w:r>
     </w:p>
     <w:p>
@@ -266,7 +266,25 @@
         <w:t xml:space="preserve">liquidity</w:t>
       </w:r>
       <w:r>
-        <w:t xml:space="preserve">. CAT bonds trade over the counter and not very often. Using 9,393 secondary-market trades reported to TRACE between 2015 and 2019, Herrmann and Hibbeln (2023) find that liquidity is lower for riskier bonds and for bonds far from maturity, and they estimate that the liquidity premium accounts for about a fifth of the observed CAT bond yield spread. A premium of that size can move when dealers and investors run short of capital, which is also when stock prices fall (Brunnermeier and Pedersen, 2009).</w:t>
+        <w:t xml:space="preserve">. CAT bonds trade over the counter and not very often. Using 9,393 secondary-market trades reported to TRACE between 2015 and 2019, Herrmann and Hibbeln (2023) find that liquidity is lower for riskier bonds and for bonds far from maturity, and they estimate that the liquidity premium accounts for about a fifth of the observed CAT bond yield spread. A premium of that size can move when dealers and investors run short of capital, which is also when stock prices fall (Brunnermeier and Pedersen, 2009). In late 2008, distressed CAT bonds were put up for sale quickly in a market drained of liquidity, and investors suffered losses</w:t>
+      </w:r>
+      <w:r>
+        <w:t xml:space="preserve"> </w:t>
+      </w:r>
+      <w:r>
+        <w:t xml:space="preserve">“</w:t>
+      </w:r>
+      <w:r>
+        <w:t xml:space="preserve">not from natural catastrophic events, but from market risks that they thought they had been isolated from</w:t>
+      </w:r>
+      <w:r>
+        <w:t xml:space="preserve">”</w:t>
+      </w:r>
+      <w:r>
+        <w:t xml:space="preserve"> </w:t>
+      </w:r>
+      <w:r>
+        <w:t xml:space="preserve">(Carayannopoulos and Perez, 2015, p. 22-23).</w:t>
       </w:r>
     </w:p>
     <w:p>
@@ -274,7 +292,7 @@
         <w:pStyle w:val="BodyText"/>
       </w:pPr>
       <w:r>
-        <w:t xml:space="preserve">Measurement is a further source of financial noise. Most empirical studies use Swiss Re’s CAT bond indices. Drobetz et al. (2020) describe the index they use as tracking secondary-market bid indications that Swiss Re provides to investors each week. An index built from dealer quotes tends to be smoothed: it absorbs news with a delay, which lowers its measured volatility and its contemporaneous correlation with other markets (Getmansky, Lo and Makarov, 2004).</w:t>
+        <w:t xml:space="preserve">Measurement is a further source of difference. The three articles use two Swiss Re indices, which are built from secondary-market bid indications rather than trades (Drobetz et al., 2020), and the net asset value of a CAT bond fund. An index of quotes can be smoothed, which lowers its measured volatility and its correlation with other markets (Getmansky, Lo and Makarov, 2004).</w:t>
       </w:r>
     </w:p>
     <w:bookmarkEnd w:id="21"/>
@@ -348,7 +366,7 @@
         <w:pStyle w:val="BodyText"/>
       </w:pPr>
       <w:r>
-        <w:t xml:space="preserve">These properties are distinct: an asset can be a good diversifier and still fail as a safe haven. The zero-beta claim, which says the beta is zero at all times, amounts to</w:t>
+        <w:t xml:space="preserve">The zero-beta claim, which says the beta is zero at all times, amounts to</w:t>
       </w:r>
       <w:r>
         <w:t xml:space="preserve"> </w:t>
@@ -363,7 +381,7 @@
         <w:t xml:space="preserve">”</w:t>
       </w:r>
       <w:r>
-        <w:t xml:space="preserve">, so evidence of diversification does not confirm it. The definitions are also about correlation, not about price. A statistical safe haven can lose money in a crash as long as its losses do not move with the market’s. An investor who has to sell during a crisis cares about the price received, so the economic meaning of a safe haven is stricter than the statistical one.</w:t>
+        <w:t xml:space="preserve">, so evidence of diversification does not confirm it. The definitions are also about correlation, not price: a statistical safe haven can lose money in a crash as long as its losses do not move with the market’s.</w:t>
       </w:r>
     </w:p>
     <w:p>
@@ -389,25 +407,7 @@
         <w:t xml:space="preserve"> </w:t>
       </w:r>
       <w:r>
-        <w:t xml:space="preserve">also changes meaning between studies. In the two-stage framework used by Drobetz et al. (2020), taken from Bouri et al. (2017), the safe-haven verdict rests on the coefficients of extreme-week dummies, which measure how the correlation changes in those weeks. A strong safe haven in that sense is a significant fall in the correlation, which does not require the correlation to become negative as Baur and McDermott’s definition does. In this paper,</w:t>
-      </w:r>
-      <w:r>
-        <w:t xml:space="preserve"> </w:t>
-      </w:r>
-      <w:r>
-        <w:t xml:space="preserve">“</w:t>
-      </w:r>
-      <w:r>
-        <w:t xml:space="preserve">strong</w:t>
-      </w:r>
-      <w:r>
-        <w:t xml:space="preserve">”</w:t>
-      </w:r>
-      <w:r>
-        <w:t xml:space="preserve"> </w:t>
-      </w:r>
-      <w:r>
-        <w:t xml:space="preserve">refers to the regression sense when I discuss Drobetz et al. and to a negative correlation otherwise.</w:t>
+        <w:t xml:space="preserve">also changes meaning between studies. In the regression test used by Drobetz et al. (2020), described in Section 2.4, a strong safe haven is an asset whose correlation falls significantly during extreme weeks. That does not require the correlation in those weeks to be negative, as Baur and McDermott’s definition does.</w:t>
       </w:r>
     </w:p>
     <w:p>
@@ -415,7 +415,7 @@
         <w:pStyle w:val="BodyText"/>
       </w:pPr>
       <w:r>
-        <w:t xml:space="preserve">The tools differ as well. A beta is the covariance with the market divided by the market’s variance, and a correlation scales the same covariance by both volatilities. A copula separates the dependence between two series from their individual distributions and can measure tail dependence, the probability of an extreme loss in one series given an extreme loss in the other. These tools can give different verdicts on the same data, and Forbes and Rigobon (2002) showed one reason: when two assets share a common factor, a rise in market volatility raises their measured correlation even if the underlying relation has not changed, so correlations estimated in crisis windows are biased upward unless they are corrected.</w:t>
+        <w:t xml:space="preserve">The tools differ as well. A beta divides the covariance with the market by the market’s variance, a correlation scales the same covariance by both volatilities, and a copula describes dependence separately from the individual distributions, including in the tails. They can give different verdicts on the same data (Section 3.4).</w:t>
       </w:r>
     </w:p>
     <w:bookmarkEnd w:id="22"/>
@@ -433,7 +433,7 @@
         <w:pStyle w:val="FirstParagraph"/>
       </w:pPr>
       <w:r>
-        <w:t xml:space="preserve">The first article asks two questions: are CAT bonds zero-beta investments, and do they diversify a portfolio? Over January 2002 to October 2013, the authors study the joint dynamics of CAT bond returns and the returns of the stock, corporate bond and government bond markets with a multivariate GARCH model. From the estimated conditional covariances they compute dynamic hedge ratios, the conditional covariance with each market divided by that market’s conditional variance. Because a hedge ratio defined this way is a beta, they read the series as time-varying betas.</w:t>
+        <w:t xml:space="preserve">The first article asks whether CAT bonds are zero-beta investments and whether they diversify a portfolio. The authors use 614 weekly returns, from January 2002 to October 2013, on the Swiss Re BB CAT bond price index, the S&amp;P 500, an investment-grade U.S. corporate bond index and a 5-to-7-year government bond index. They estimate time-varying covariances with a diagonal-VEC multivariate GARCH model, identify high- and low-correlation regimes with a Markov-switching model, and compute dynamic hedge ratios, the conditional covariance with the S&amp;P 500 divided by its conditional variance, which they read as time-varying betas. The crisis is the NBER period from December 2007 to May 2009.</w:t>
       </w:r>
     </w:p>
     <w:p>
@@ -441,7 +441,25 @@
         <w:pStyle w:val="BodyText"/>
       </w:pPr>
       <w:r>
-        <w:t xml:space="preserve">The results depend on the period. Outside the crisis, the betas are indistinguishable from zero and CAT bonds look like the zero-beta asset of the textbook argument. With the collapse of Lehman Brothers, CAT bond returns became significantly correlated with the market. The size of the effect is small: the hedge ratios of CAT bonds stay very close to zero in all sub-periods, while those of government bonds change markedly after September 2008. The authors conclude that the crisis affected CAT bonds much less than the other asset classes, so CAT bonds still diversified a portfolio, and that CAT bond betas returned to their pre-crisis levels once bonds with improved structures were issued from 2009 onward, which they read as the market’s approval of those structures.</w:t>
+        <w:t xml:space="preserve">Simple correlations already show the pattern. The correlation between CAT bonds and the S&amp;P 500 is 0.016 before the crisis, 0.252 during it (significant at 5 percent) and 0.058 after it; with corporate bonds it goes from 0.003 to 0.475 and back to 0.092. The dynamic estimates add the timing. The correlation with the stock market stayed close to zero until the end of August 2008, rose from September 2008 to 0.24 in May 2009, fluctuated widely through 2010, and returned to its pre-crisis level at the beginning of 2011. The high-correlation regime that began in October 2008 lasted about 30 months; those after Katrina, the 2011 Japanese earthquake and Sandy were much shorter. The economic size of the effect was small. The CAT bond beta peaked at 0.014 in January 2010, against 0.13 for corporate bonds, and the weekly volatility of CAT bonds barely moved (0.37 percent before the crisis, 0.41 percent during it) while that of the S&amp;P 500 rose from 1.91 to 4.49 percent. The authors conclude that CAT bonds</w:t>
+      </w:r>
+      <w:r>
+        <w:t xml:space="preserve"> </w:t>
+      </w:r>
+      <w:r>
+        <w:t xml:space="preserve">“</w:t>
+      </w:r>
+      <w:r>
+        <w:t xml:space="preserve">are not zero-beta assets</w:t>
+      </w:r>
+      <w:r>
+        <w:t xml:space="preserve">”</w:t>
+      </w:r>
+      <w:r>
+        <w:t xml:space="preserve"> </w:t>
+      </w:r>
+      <w:r>
+        <w:t xml:space="preserve">(p. 21), that weaknesses of the trust accounts were the main cause, and that CAT bonds remain a valuable diversifier because the crisis affected them far less than other assets.</w:t>
       </w:r>
     </w:p>
     <w:p>
@@ -449,7 +467,7 @@
         <w:pStyle w:val="BodyText"/>
       </w:pPr>
       <w:r>
-        <w:t xml:space="preserve">The strength of the article is that it treats beta as a variable. The time-varying hedge ratios show when the zero-beta property broke down, and the timing points to the trust-account structure that the authors identify as the main weakness. Its limit, for my question, is that a beta estimated on returns cannot say which part of the bond moved with the market. A fall in the value of Lehman-guaranteed collateral, a rise in the premium demanded by investors who needed cash, and a stale price catching up after a quiet period would all appear as a positive beta. The article also studies a single crisis, and an unusual one for CAT bonds, since a swap counterparty failed during it. Timing adds a further difficulty. Hurricane Ike made landfall in Texas on 13 September 2008, two days before Lehman Brothers filed for bankruptcy, so in weekly data a catastrophe event and a financial shock can fall in the same observation. In a short crisis window such a coincidence carries a large weight, and a crisis beta is only interpretable once the two are separated.</w:t>
+        <w:t xml:space="preserve">The strength of the article is that it treats beta as a variable and dates the change precisely. The date matters: the first nine months of the recession, including the funding strains around Bear Stearns in March 2008, left the correlation near zero, and the jump came only when Lehman’s failure hit the swap structures. Its limit, for my question, is that a beta estimated on returns cannot say which part of the bond moved with the market. A fall in the value of Lehman-guaranteed collateral and a rise in the premium demanded by investors who needed cash both appear as a positive beta, and the authors’ own account of the crisis describes both. Timing adds a further difficulty, since Hurricane Ike struck Texas in the same month as Lehman’s failure. The authors discuss the coincidence and argue, by comparison with Katrina, the Japanese earthquake and Sandy, that Ike alone cannot explain the size and persistence of the 2008 correlation; they treat Ike as a catalyst. The comparison is reasonable, but it is not a formal separation of the two shocks.</w:t>
       </w:r>
     </w:p>
     <w:bookmarkEnd w:id="23"/>
@@ -467,7 +485,175 @@
         <w:pStyle w:val="FirstParagraph"/>
       </w:pPr>
       <w:r>
-        <w:t xml:space="preserve">The second article widens the comparison to an international multi-asset portfolio. The authors pair the Swiss Re Global Unhedged CAT Bond Performance Index with six asset classes: global stocks, bonds, real estate, commodities, private equity and infrastructure, using weekly returns from 2002 to 2018. Their method has two stages, following Bouri et al. (2017). First, they estimate dynamic conditional correlations (DCC) between the CAT bond index and each asset class. Second, they regress these correlations on dummy variables that mark the weeks in which the other asset’s return falls in its extreme lower tail. The constant of the regression measures the average correlation, which settles the hedge-or-diversifier question. The coefficients on the dummies measure how the correlation changes in extreme weeks, which settles the safe-haven question.</w:t>
+        <w:t xml:space="preserve">The second article widens the comparison to an international multi-asset portfolio. The authors pair the Swiss Re Global Unhedged CAT Bond Performance Index with total return indices for world stocks (MSCI World IMI), global government bonds (J.P. Morgan GBI Broad), listed real estate (GPR 250), commodities (CRB), listed private equity (LPX 50) and infrastructure (NMX 30). They use 885 weekly returns from January 2002 to December 2018, split into a pre-crisis period (2002-2008) and a post-crisis period (2009-2018). Following Bouri et al. (2017), they first estimate dynamic conditional correlations (DCC) between CAT bonds and each asset class, then regress them on dummies for the weeks in which the other asset’s return falls below its 10, 5 and 1 percent quantiles: DCC</w:t>
+      </w:r>
+      <w:r>
+        <w:rPr>
+          <w:vertAlign w:val="subscript"/>
+        </w:rPr>
+        <w:t xml:space="preserve">t</w:t>
+      </w:r>
+      <w:r>
+        <w:t xml:space="preserve"> </w:t>
+      </w:r>
+      <w:r>
+        <w:t xml:space="preserve">=</w:t>
+      </w:r>
+      <w:r>
+        <w:t xml:space="preserve"> </w:t>
+      </w:r>
+      <w:r>
+        <w:rPr>
+          <w:iCs/>
+          <w:i/>
+        </w:rPr>
+        <w:t xml:space="preserve">m</w:t>
+      </w:r>
+      <w:r>
+        <w:rPr>
+          <w:vertAlign w:val="subscript"/>
+        </w:rPr>
+        <w:t xml:space="preserve">0</w:t>
+      </w:r>
+      <w:r>
+        <w:t xml:space="preserve"> </w:t>
+      </w:r>
+      <w:r>
+        <w:t xml:space="preserve">+</w:t>
+      </w:r>
+      <w:r>
+        <w:t xml:space="preserve"> </w:t>
+      </w:r>
+      <w:r>
+        <w:rPr>
+          <w:iCs/>
+          <w:i/>
+        </w:rPr>
+        <w:t xml:space="preserve">m</w:t>
+      </w:r>
+      <w:r>
+        <w:rPr>
+          <w:vertAlign w:val="subscript"/>
+        </w:rPr>
+        <w:t xml:space="preserve">1</w:t>
+      </w:r>
+      <w:r>
+        <w:t xml:space="preserve">·D</w:t>
+      </w:r>
+      <w:r>
+        <w:rPr>
+          <w:vertAlign w:val="subscript"/>
+        </w:rPr>
+        <w:t xml:space="preserve">10%</w:t>
+      </w:r>
+      <w:r>
+        <w:t xml:space="preserve"> </w:t>
+      </w:r>
+      <w:r>
+        <w:t xml:space="preserve">+</w:t>
+      </w:r>
+      <w:r>
+        <w:t xml:space="preserve"> </w:t>
+      </w:r>
+      <w:r>
+        <w:rPr>
+          <w:iCs/>
+          <w:i/>
+        </w:rPr>
+        <w:t xml:space="preserve">m</w:t>
+      </w:r>
+      <w:r>
+        <w:rPr>
+          <w:vertAlign w:val="subscript"/>
+        </w:rPr>
+        <w:t xml:space="preserve">2</w:t>
+      </w:r>
+      <w:r>
+        <w:t xml:space="preserve">·D</w:t>
+      </w:r>
+      <w:r>
+        <w:rPr>
+          <w:vertAlign w:val="subscript"/>
+        </w:rPr>
+        <w:t xml:space="preserve">5%</w:t>
+      </w:r>
+      <w:r>
+        <w:t xml:space="preserve"> </w:t>
+      </w:r>
+      <w:r>
+        <w:t xml:space="preserve">+</w:t>
+      </w:r>
+      <w:r>
+        <w:t xml:space="preserve"> </w:t>
+      </w:r>
+      <w:r>
+        <w:rPr>
+          <w:iCs/>
+          <w:i/>
+        </w:rPr>
+        <w:t xml:space="preserve">m</w:t>
+      </w:r>
+      <w:r>
+        <w:rPr>
+          <w:vertAlign w:val="subscript"/>
+        </w:rPr>
+        <w:t xml:space="preserve">3</w:t>
+      </w:r>
+      <w:r>
+        <w:t xml:space="preserve">·D</w:t>
+      </w:r>
+      <w:r>
+        <w:rPr>
+          <w:vertAlign w:val="subscript"/>
+        </w:rPr>
+        <w:t xml:space="preserve">1%</w:t>
+      </w:r>
+      <w:r>
+        <w:t xml:space="preserve">. A significantly positive</w:t>
+      </w:r>
+      <w:r>
+        <w:t xml:space="preserve"> </w:t>
+      </w:r>
+      <w:r>
+        <w:rPr>
+          <w:iCs/>
+          <w:i/>
+        </w:rPr>
+        <w:t xml:space="preserve">m</w:t>
+      </w:r>
+      <w:r>
+        <w:rPr>
+          <w:vertAlign w:val="subscript"/>
+        </w:rPr>
+        <w:t xml:space="preserve">0</w:t>
+      </w:r>
+      <w:r>
+        <w:t xml:space="preserve"> </w:t>
+      </w:r>
+      <w:r>
+        <w:t xml:space="preserve">makes CAT bonds a diversifier, a zero (negative)</w:t>
+      </w:r>
+      <w:r>
+        <w:t xml:space="preserve"> </w:t>
+      </w:r>
+      <w:r>
+        <w:rPr>
+          <w:iCs/>
+          <w:i/>
+        </w:rPr>
+        <w:t xml:space="preserve">m</w:t>
+      </w:r>
+      <w:r>
+        <w:rPr>
+          <w:vertAlign w:val="subscript"/>
+        </w:rPr>
+        <w:t xml:space="preserve">0</w:t>
+      </w:r>
+      <w:r>
+        <w:t xml:space="preserve"> </w:t>
+      </w:r>
+      <w:r>
+        <w:t xml:space="preserve">a weak (strong) hedge. Insignificant dummy coefficients make them a weak safe haven, significantly negative ones a strong safe haven.</w:t>
       </w:r>
     </w:p>
     <w:p>
@@ -475,7 +661,87 @@
         <w:pStyle w:val="BodyText"/>
       </w:pPr>
       <w:r>
-        <w:t xml:space="preserve">According to the article, CAT bonds are a poor hedge, since their average correlation with the other asset classes is positive. They are an effective diversifier against all six classes. They are a strong safe haven against extreme declines of the stock market, but only during the post-crisis period. In the earlier sub-periods this property is absent.</w:t>
+        <w:t xml:space="preserve">The constant</w:t>
+      </w:r>
+      <w:r>
+        <w:t xml:space="preserve"> </w:t>
+      </w:r>
+      <w:r>
+        <w:rPr>
+          <w:iCs/>
+          <w:i/>
+        </w:rPr>
+        <w:t xml:space="preserve">m</w:t>
+      </w:r>
+      <w:r>
+        <w:rPr>
+          <w:vertAlign w:val="subscript"/>
+        </w:rPr>
+        <w:t xml:space="preserve">0</w:t>
+      </w:r>
+      <w:r>
+        <w:t xml:space="preserve"> </w:t>
+      </w:r>
+      <w:r>
+        <w:t xml:space="preserve">is positive and significant at 1 percent for every asset class: about 0.11 with stocks over the full period, 0.24 before 2009 and 0.10 after. CAT bonds are therefore a diversifier, not a hedge. Before 2009 several dummy coefficients are positive, including 0.072 for the 5 percent stock quantile, so the correlation rose in extreme weeks. After 2009 only one coefficient is negative and significant:</w:t>
+      </w:r>
+      <w:r>
+        <w:t xml:space="preserve"> </w:t>
+      </w:r>
+      <w:r>
+        <w:rPr>
+          <w:iCs/>
+          <w:i/>
+        </w:rPr>
+        <w:t xml:space="preserve">m</w:t>
+      </w:r>
+      <w:r>
+        <w:rPr>
+          <w:vertAlign w:val="subscript"/>
+        </w:rPr>
+        <w:t xml:space="preserve">2</w:t>
+      </w:r>
+      <w:r>
+        <w:t xml:space="preserve"> </w:t>
+      </w:r>
+      <w:r>
+        <w:t xml:space="preserve">for stocks, −0.091 at the 10 percent level, or −0.101 at the 5 percent level with desmoothed returns. On this coefficient rests the conclusion that CAT bonds are a strong safe haven against extreme stock market declines only in the post-crisis period. The authors also conclude that CAT bonds are</w:t>
+      </w:r>
+      <w:r>
+        <w:t xml:space="preserve"> </w:t>
+      </w:r>
+      <w:r>
+        <w:t xml:space="preserve">“</w:t>
+      </w:r>
+      <w:r>
+        <w:t xml:space="preserve">not immune to changes in systematic risk</w:t>
+      </w:r>
+      <w:r>
+        <w:t xml:space="preserve">”</w:t>
+      </w:r>
+      <w:r>
+        <w:t xml:space="preserve"> </w:t>
+      </w:r>
+      <w:r>
+        <w:t xml:space="preserve">and that their behaviour</w:t>
+      </w:r>
+      <w:r>
+        <w:t xml:space="preserve"> </w:t>
+      </w:r>
+      <w:r>
+        <w:t xml:space="preserve">“</w:t>
+      </w:r>
+      <w:r>
+        <w:t xml:space="preserve">is not consistent with a zero-beta investment</w:t>
+      </w:r>
+      <w:r>
+        <w:t xml:space="preserve">”</w:t>
+      </w:r>
+      <w:r>
+        <w:t xml:space="preserve"> </w:t>
+      </w:r>
+      <w:r>
+        <w:t xml:space="preserve">(p. 5).</w:t>
       </w:r>
     </w:p>
     <w:p>
@@ -483,7 +749,43 @@
         <w:pStyle w:val="BodyText"/>
       </w:pPr>
       <w:r>
-        <w:t xml:space="preserve">This article is the closest to my question because it separates the three properties and tests them by sub-period. It also contradicts the first article on average behaviour: a positive average correlation is incompatible with the zero beta that Carayannopoulos and Perez find outside crises. And it sharpens the puzzle. If the zero-beta argument were complete, the safe-haven property would hold in every period, because the probability of a hurricane does not depend on the state of financial markets. Two features of the design matter for the interpretation. The index is built from bid indications, not trades, so weekly correlations may understate co-movement when quotes adjust slowly. And the extreme-week dummies identify stress through the other asset’s return only. A week in which stock prices fall while funding markets work normally and a week of forced selling in a funding crisis are treated as the same event.</w:t>
+        <w:t xml:space="preserve">This article is the closest to my question because it separates the three properties and tests them by sub-period. Three features matter for the interpretation. The post-crisis</w:t>
+      </w:r>
+      <w:r>
+        <w:t xml:space="preserve"> </w:t>
+      </w:r>
+      <w:r>
+        <w:t xml:space="preserve">“</w:t>
+      </w:r>
+      <w:r>
+        <w:t xml:space="preserve">strong</w:t>
+      </w:r>
+      <w:r>
+        <w:t xml:space="preserve">”</w:t>
+      </w:r>
+      <w:r>
+        <w:t xml:space="preserve"> </w:t>
+      </w:r>
+      <w:r>
+        <w:t xml:space="preserve">safe haven rests on one coefficient out of three, and the implied correlation in those weeks is about 0.10 − 0.09 ≈ 0.01, which is a weak safe haven in Baur and McDermott’s terms. The pre-crisis period ends in December 2008, so it contains the months after Lehman’s failure. And the dummies identify stress through the other asset’s return only, so a week of falling stock prices with working funding markets and a week of forced selling are treated alike. The authors deal with the smoothing problem directly: re-estimated with desmoothed returns, their estimates</w:t>
+      </w:r>
+      <w:r>
+        <w:t xml:space="preserve"> </w:t>
+      </w:r>
+      <w:r>
+        <w:t xml:space="preserve">“</w:t>
+      </w:r>
+      <w:r>
+        <w:t xml:space="preserve">remain virtually unchanged</w:t>
+      </w:r>
+      <w:r>
+        <w:t xml:space="preserve">”</w:t>
+      </w:r>
+      <w:r>
+        <w:t xml:space="preserve"> </w:t>
+      </w:r>
+      <w:r>
+        <w:t xml:space="preserve">(p. 5).</w:t>
       </w:r>
     </w:p>
     <w:bookmarkEnd w:id="24"/>
@@ -501,7 +803,7 @@
         <w:pStyle w:val="FirstParagraph"/>
       </w:pPr>
       <w:r>
-        <w:t xml:space="preserve">The third article studies the dependence structure itself. The authors model each return series with a GARCH process and join the series with copulas, which lets the dependence change over time and differ between ordinary and extreme outcomes. Their portfolio combines CAT bonds with six stock markets: the CAC 40, the Dow Jones Industrial Average, the EURO STOXX 50, the FTSE 100, the Hang Seng and the Nikkei 225. The authors present the paper as the first to analyse the dependence structure and diversification value of CAT bonds with copulas.</w:t>
+        <w:t xml:space="preserve">The third article studies the dependence structure. Its CAT bond series is not an index but a CAT bond fund, the GAMSTAR Institutional USD Acc share class managed by GAM, whose monthly returns are compared with six stock indices (CAC 40, DJIA, EURO STOXX 50, FTSE 100, Hang Seng, Nikkei 225) over 100 months, from November 2011 to February 2020. The authors model each series with an ARMA-GARCH process and join them with a Student-t copula with asymmetric dynamic conditional correlation. They then compare risk-adjusted performance, contributions to the portfolio’s value-at-risk and expected shortfall, co-moments with an equally weighted benchmark portfolio of the other assets, and mean-variance optimal portfolios. They present the paper as the first to use copulas for CAT bonds.</w:t>
       </w:r>
     </w:p>
     <w:p>
@@ -509,7 +811,25 @@
         <w:pStyle w:val="BodyText"/>
       </w:pPr>
       <w:r>
-        <w:t xml:space="preserve">Their findings are the most favourable of the three. CAT bonds display the highest risk-adjusted performance among the assets studied, they are one of the best diversifiers, and they are the asset that raises the probability of extreme co-movements with the benchmark portfolio the least.</w:t>
+        <w:t xml:space="preserve">Their findings are the most favourable of the three. The fund has the highest modified Sharpe ratio (0.112, against 0.027 to 0.089 for the stock indices). Its beta with the benchmark portfolio is 0.031, against 0.77 to 1.27 for the stock indices, and its</w:t>
+      </w:r>
+      <w:r>
+        <w:t xml:space="preserve"> </w:t>
+      </w:r>
+      <w:r>
+        <w:t xml:space="preserve">“</w:t>
+      </w:r>
+      <w:r>
+        <w:t xml:space="preserve">beta co-kurtosis</w:t>
+      </w:r>
+      <w:r>
+        <w:t xml:space="preserve">”</w:t>
+      </w:r>
+      <w:r>
+        <w:t xml:space="preserve"> </w:t>
+      </w:r>
+      <w:r>
+        <w:t xml:space="preserve">is 0.015, against 0.80 to 1.35. Its contribution to the portfolio’s 99 percent value-at-risk is negative (−0.54 percent). From the co-kurtosis result, the authors conclude that CAT bonds are the asset that raises the probability of extreme co-variations with the benchmark portfolio the least.</w:t>
       </w:r>
     </w:p>
     <w:p>
@@ -517,7 +837,23 @@
         <w:pStyle w:val="BodyText"/>
       </w:pPr>
       <w:r>
-        <w:t xml:space="preserve">The copula approach answers a question that correlation-based studies cannot answer directly: do the two assets crash together? On that question, the article supports the zero-beta view. The result has limits. The alternatives against which CAT bonds are ranked are stock indices, which depend strongly on each other and on an equity benchmark by construction, so ranking first among them on extreme co-movement is a modest test. The headline results describe the dependence structure as a whole. They do not tell an investor whether the probability of a joint extreme rises in a funding crisis like that of 2008. And if the CAT bond series is an index of quoted prices, as in most of this literature, its volatility is understated and its risk-adjusted performance overstated (Getmansky et al., 2004).</w:t>
+        <w:t xml:space="preserve">The result has limits that the article itself documents. The extreme co-movement finding comes from co-kurtosis betas, not from a copula tail-dependence coefficient, and the copula’s correlation dynamics are weakly identified: the estimated</w:t>
+      </w:r>
+      <w:r>
+        <w:t xml:space="preserve"> </w:t>
+      </w:r>
+      <w:r>
+        <w:rPr>
+          <w:iCs/>
+          <w:i/>
+        </w:rPr>
+        <w:t xml:space="preserve">a</w:t>
+      </w:r>
+      <w:r>
+        <w:t xml:space="preserve"> </w:t>
+      </w:r>
+      <w:r>
+        <w:t xml:space="preserve">parameter is zero, which the authors note is inconsistent with their test of dynamic correlation. The performance advantage is not statistically distinct, since their peer-performance test gives a 98 percent probability that the fund performs equally to the stock indices, and their most-diversified portfolio gives the fund a zero weight. The alternatives are six stock indices, which depend strongly on each other and on an equity benchmark by construction, so ranking first among them is a modest test. Most important for my question, the sample begins in November 2011 and ends on 28 February 2020, days before the March 2020 sell-off. It contains no funding crisis and no collateral failure.</w:t>
       </w:r>
     </w:p>
     <w:bookmarkEnd w:id="25"/>
@@ -535,7 +871,7 @@
         <w:pStyle w:val="FirstParagraph"/>
       </w:pPr>
       <w:r>
-        <w:t xml:space="preserve">Two studies of CAT bond prices take the opposite side. Gürtler et al. (2016) analyse premiums in the secondary market and find that both the financial crisis and Hurricane Katrina had a significant effect on them. They also find a positive relation between corporate bond spreads and CAT bond premiums, a dependence that grew stronger during the crisis, and conclude that CAT bonds should not be regarded as zero-beta securities. Braun (2016), who models spreads at issuance, finds that apart from the expected loss, the covered territory, the sponsor and the reinsurance cycle, the spreads of comparably rated corporate bonds help explain CAT bond spreads. These two studies concern the price of risk and say nothing directly about realized losses. They show that the premium investors demand for catastrophe risk moves with the premium they demand for credit risk, outside crises as well as during them.</w:t>
+        <w:t xml:space="preserve">Two studies of CAT bond prices take the opposite side. Gürtler et al. (2016) find that the financial crisis and Hurricane Katrina both had a significant effect on secondary-market premiums, and that premiums are positively related to corporate bond spreads, a link that grew stronger during the crisis; they conclude that CAT bonds should not be regarded as zero-beta securities. Braun (2016) finds that the spreads of comparably rated corporate bonds help explain CAT bond spreads at issuance. Both studies show that the price investors demand for catastrophe risk moves with the price of credit risk.</w:t>
       </w:r>
     </w:p>
     <w:p>
@@ -543,7 +879,7 @@
         <w:pStyle w:val="BodyText"/>
       </w:pPr>
       <w:r>
-        <w:t xml:space="preserve">A recent study supports the favourable view for a later crisis. Feng and Zeng (2025) apply a DCC-GARCH model to an international multi-asset portfolio before and during the COVID-19 pandemic. They find that CAT bonds were a diversifier over the whole sample and a safe haven against stocks and private equity after the outbreak. The results hold with desmoothed returns, which addresses the quote-smoothing problem described above, but the authors also find that hedge ratios are sensitive to extreme weather events.</w:t>
+        <w:t xml:space="preserve">A recent study supports the favourable view for a later crisis. Applying a DCC-GARCH model to a multi-asset portfolio before and during the COVID-19 pandemic, Feng and Zeng (2025) find that CAT bonds were a diversifier over the whole sample and a safe haven against stocks and private equity after the outbreak. The results hold with desmoothed returns, but the authors also find that hedge ratios are sensitive to extreme weather events.</w:t>
       </w:r>
     </w:p>
     <w:p>
@@ -601,6 +937,8 @@
       <w:tr>
         <w:trPr>
           <w:tblHeader w:val="true"/>
+          <w:cantSplit/>
+          <w:tblHeader/>
         </w:trPr>
         <w:tc>
           <w:tcPr>
@@ -676,6 +1014,9 @@
         </w:tc>
       </w:tr>
       <w:tr>
+        <w:trPr>
+          <w:cantSplit/>
+        </w:trPr>
         <w:tc>
           <w:tcPr>
             <w:tcW w:type="dxa" w:w="1505"/>
@@ -749,12 +1090,15 @@
                 <w:rFonts w:ascii="Times New Roman" w:hAnsi="Times New Roman"/>
                 <w:sz w:val="19"/>
               </w:rPr>
-              <w:t xml:space="preserve">How do CAT bonds depend on equity markets, including in the tails?</w:t>
+              <w:t xml:space="preserve">How do CAT bonds depend on equity markets, including in the extremes?</w:t>
             </w:r>
           </w:p>
         </w:tc>
       </w:tr>
       <w:tr>
+        <w:trPr>
+          <w:cantSplit/>
+        </w:trPr>
         <w:tc>
           <w:tcPr>
             <w:tcW w:type="dxa" w:w="1505"/>
@@ -790,7 +1134,7 @@
                 <w:rFonts w:ascii="Times New Roman" w:hAnsi="Times New Roman"/>
                 <w:sz w:val="19"/>
               </w:rPr>
-              <w:t xml:space="preserve">CAT bonds vs stocks, corporate bonds, government bonds; Jan. 2002 to Oct. 2013</w:t>
+              <w:t xml:space="preserve">Swiss Re BB CAT bond price index vs S&amp;P 500, corporate and government bonds; 614 weekly returns, Jan. 2002 to Oct. 2013</w:t>
             </w:r>
           </w:p>
         </w:tc>
@@ -809,7 +1153,7 @@
                 <w:rFonts w:ascii="Times New Roman" w:hAnsi="Times New Roman"/>
                 <w:sz w:val="19"/>
               </w:rPr>
-              <w:t xml:space="preserve">Swiss Re index vs global stocks, bonds, real estate, commodities, private equity, infrastructure; weekly, 2002 to 2018</w:t>
+              <w:t xml:space="preserve">Swiss Re Global Unhedged index vs six asset classes; 885 weekly returns, Jan. 2002 to Dec. 2018</w:t>
             </w:r>
           </w:p>
         </w:tc>
@@ -828,12 +1172,15 @@
                 <w:rFonts w:ascii="Times New Roman" w:hAnsi="Times New Roman"/>
                 <w:sz w:val="19"/>
               </w:rPr>
-              <w:t xml:space="preserve">CAT bonds and six stock indices (CAC 40, DJIA, EURO STOXX 50, FTSE 100, Hang Seng, Nikkei 225)</w:t>
+              <w:t xml:space="preserve">GAMSTAR CAT bond fund vs six stock indices; 100 monthly returns, Nov. 2011 to Feb. 2020</w:t>
             </w:r>
           </w:p>
         </w:tc>
       </w:tr>
       <w:tr>
+        <w:trPr>
+          <w:cantSplit/>
+        </w:trPr>
         <w:tc>
           <w:tcPr>
             <w:tcW w:type="dxa" w:w="1505"/>
@@ -850,7 +1197,7 @@
                 <w:b/>
                 <w:sz w:val="19"/>
               </w:rPr>
-              <w:t xml:space="preserve">Method and statistic</w:t>
+              <w:t xml:space="preserve">Method</w:t>
             </w:r>
           </w:p>
         </w:tc>
@@ -869,7 +1216,7 @@
                 <w:rFonts w:ascii="Times New Roman" w:hAnsi="Times New Roman"/>
                 <w:sz w:val="19"/>
               </w:rPr>
-              <w:t xml:space="preserve">Multivariate GARCH; dynamic hedge ratios read as betas</w:t>
+              <w:t xml:space="preserve">Diagonal-VEC MGARCH, Markov switching, dynamic hedge ratios</w:t>
             </w:r>
           </w:p>
         </w:tc>
@@ -888,7 +1235,7 @@
                 <w:rFonts w:ascii="Times New Roman" w:hAnsi="Times New Roman"/>
                 <w:sz w:val="19"/>
               </w:rPr>
-              <w:t xml:space="preserve">DCC, then regression of the DCC on extreme-week dummies</w:t>
+              <w:t xml:space="preserve">DCC-GARCH, then regression of the DCC on 10/5/1 percent quantile dummies</w:t>
             </w:r>
           </w:p>
         </w:tc>
@@ -907,12 +1254,15 @@
                 <w:rFonts w:ascii="Times New Roman" w:hAnsi="Times New Roman"/>
                 <w:sz w:val="19"/>
               </w:rPr>
-              <w:t xml:space="preserve">Copula-GARCH; time-varying and tail dependence</w:t>
+              <w:t xml:space="preserve">Student-t copula with AGDCC; performance, VaR, co-moments, optimal portfolios</w:t>
             </w:r>
           </w:p>
         </w:tc>
       </w:tr>
       <w:tr>
+        <w:trPr>
+          <w:cantSplit/>
+        </w:trPr>
         <w:tc>
           <w:tcPr>
             <w:tcW w:type="dxa" w:w="1505"/>
@@ -929,7 +1279,7 @@
                 <w:b/>
                 <w:sz w:val="19"/>
               </w:rPr>
-              <w:t xml:space="preserve">What counts as stress</w:t>
+              <w:t xml:space="preserve">Stress</w:t>
             </w:r>
           </w:p>
         </w:tc>
@@ -948,7 +1298,7 @@
                 <w:rFonts w:ascii="Times New Roman" w:hAnsi="Times New Roman"/>
                 <w:sz w:val="19"/>
               </w:rPr>
-              <w:t xml:space="preserve">The crisis period after Lehman’s failure</w:t>
+              <w:t xml:space="preserve">NBER crisis, Dec. 2007 to May 2009</w:t>
             </w:r>
           </w:p>
         </w:tc>
@@ -967,7 +1317,7 @@
                 <w:rFonts w:ascii="Times New Roman" w:hAnsi="Times New Roman"/>
                 <w:sz w:val="19"/>
               </w:rPr>
-              <w:t xml:space="preserve">Weeks of extreme decline in the other asset, by sub-period</w:t>
+              <w:t xml:space="preserve">Extreme weeks of the other asset; before vs after 2009</w:t>
             </w:r>
           </w:p>
         </w:tc>
@@ -986,12 +1336,15 @@
                 <w:rFonts w:ascii="Times New Roman" w:hAnsi="Times New Roman"/>
                 <w:sz w:val="19"/>
               </w:rPr>
-              <w:t xml:space="preserve">Joint extreme outcomes in the tails</w:t>
+              <w:t xml:space="preserve">Co-kurtosis; no crisis in the sample</w:t>
             </w:r>
           </w:p>
         </w:tc>
       </w:tr>
       <w:tr>
+        <w:trPr>
+          <w:cantSplit/>
+        </w:trPr>
         <w:tc>
           <w:tcPr>
             <w:tcW w:type="dxa" w:w="1505"/>
@@ -1008,7 +1361,7 @@
                 <w:b/>
                 <w:sz w:val="19"/>
               </w:rPr>
-              <w:t xml:space="preserve">Main conclusion</w:t>
+              <w:t xml:space="preserve">Key results</w:t>
             </w:r>
           </w:p>
         </w:tc>
@@ -1027,7 +1380,7 @@
                 <w:rFonts w:ascii="Times New Roman" w:hAnsi="Times New Roman"/>
                 <w:sz w:val="19"/>
               </w:rPr>
-              <w:t xml:space="preserve">Zero-beta only outside crises; small crisis effect; betas back to pre-crisis levels after the 2009 structures</w:t>
+              <w:t xml:space="preserve">Correlation with S&amp;P 500: 0.016 / 0.252 / 0.058; beta peaks at 0.014</w:t>
             </w:r>
           </w:p>
         </w:tc>
@@ -1046,7 +1399,45 @@
                 <w:rFonts w:ascii="Times New Roman" w:hAnsi="Times New Roman"/>
                 <w:sz w:val="19"/>
               </w:rPr>
-              <w:t xml:space="preserve">Poor hedge; effective diversifier; strong safe haven against stocks only post-crisis</w:t>
+              <w:t xml:space="preserve">Average correlation with stocks 0.24 before 2009, 0.10 after; post-crisis</w:t>
+            </w:r>
+            <w:r>
+              <w:rPr>
+                <w:rFonts w:ascii="Times New Roman" w:hAnsi="Times New Roman"/>
+                <w:sz w:val="19"/>
+              </w:rPr>
+              <w:t xml:space="preserve"> </w:t>
+            </w:r>
+            <w:r>
+              <w:rPr>
+                <w:iCs/>
+                <w:rFonts w:ascii="Times New Roman" w:hAnsi="Times New Roman"/>
+                <w:i/>
+                <w:sz w:val="19"/>
+              </w:rPr>
+              <w:t xml:space="preserve">m</w:t>
+            </w:r>
+            <w:r>
+              <w:rPr>
+                <w:rFonts w:ascii="Times New Roman" w:hAnsi="Times New Roman"/>
+                <w:sz w:val="19"/>
+                <w:vertAlign w:val="subscript"/>
+              </w:rPr>
+              <w:t xml:space="preserve">2</w:t>
+            </w:r>
+            <w:r>
+              <w:rPr>
+                <w:rFonts w:ascii="Times New Roman" w:hAnsi="Times New Roman"/>
+                <w:sz w:val="19"/>
+              </w:rPr>
+              <w:t xml:space="preserve"> </w:t>
+            </w:r>
+            <w:r>
+              <w:rPr>
+                <w:rFonts w:ascii="Times New Roman" w:hAnsi="Times New Roman"/>
+                <w:sz w:val="19"/>
+              </w:rPr>
+              <w:t xml:space="preserve">= −0.091</w:t>
             </w:r>
           </w:p>
         </w:tc>
@@ -1065,12 +1456,15 @@
                 <w:rFonts w:ascii="Times New Roman" w:hAnsi="Times New Roman"/>
                 <w:sz w:val="19"/>
               </w:rPr>
-              <w:t xml:space="preserve">Highest risk-adjusted performance; one of the best diversifiers; least increase in extreme co-movement</w:t>
+              <w:t xml:space="preserve">Beta 0.031; beta co-kurtosis 0.015; modified Sharpe ratio 0.112</w:t>
             </w:r>
           </w:p>
         </w:tc>
       </w:tr>
       <w:tr>
+        <w:trPr>
+          <w:cantSplit/>
+        </w:trPr>
         <w:tc>
           <w:tcPr>
             <w:tcW w:type="dxa" w:w="1505"/>
@@ -1087,7 +1481,7 @@
                 <w:b/>
                 <w:sz w:val="19"/>
               </w:rPr>
-              <w:t xml:space="preserve">Position on the zero-beta claim</w:t>
+              <w:t xml:space="preserve">Position on zero beta</w:t>
             </w:r>
           </w:p>
         </w:tc>
@@ -1106,7 +1500,7 @@
                 <w:rFonts w:ascii="Times New Roman" w:hAnsi="Times New Roman"/>
                 <w:sz w:val="19"/>
               </w:rPr>
-              <w:t xml:space="preserve">Holds in normal times (weak hedge), fails after Lehman</w:t>
+              <w:t xml:space="preserve">Rejected in the crisis, holds outside it</w:t>
             </w:r>
           </w:p>
         </w:tc>
@@ -1125,7 +1519,7 @@
                 <w:rFonts w:ascii="Times New Roman" w:hAnsi="Times New Roman"/>
                 <w:sz w:val="19"/>
               </w:rPr>
-              <w:t xml:space="preserve">Rejected on average (positive correlation), partly restored in post-crisis stress</w:t>
+              <w:t xml:space="preserve">Rejected on average; safe haven against stocks after 2009</w:t>
             </w:r>
           </w:p>
         </w:tc>
@@ -1144,7 +1538,7 @@
                 <w:rFonts w:ascii="Times New Roman" w:hAnsi="Times New Roman"/>
                 <w:sz w:val="19"/>
               </w:rPr>
-              <w:t xml:space="preserve">Supported for extreme co-movement with equities</w:t>
+              <w:t xml:space="preserve">Supported</w:t>
             </w:r>
           </w:p>
         </w:tc>
@@ -1175,7 +1569,7 @@
         <w:pStyle w:val="FirstParagraph"/>
       </w:pPr>
       <w:r>
-        <w:t xml:space="preserve">The contradictions are of two kinds. The first concerns average behaviour. Outside crises, Carayannopoulos and Perez cannot distinguish the beta of CAT bonds from zero, which makes CAT bonds a weak hedge in Baur and Lucey’s terms. Drobetz et al. find a positive average correlation, which makes them a diversifier but a poor hedge. Gürtler et al. and Braun find that CAT bond premiums move with corporate spreads even outside crises. The second and sharper contradiction concerns stress. Carayannopoulos and Perez and Gürtler et al. find that CAT bonds moved with markets in the 2007-2009 crisis. Drobetz et al. find a strong safe haven against stocks only after that crisis, Feng and Zeng find a safe haven after the COVID-19 outbreak, and Haffar and Le Fur find the weakest extreme co-movement with equities of all the assets they study. On one point all the studies agree: CAT bonds lower portfolio risk on average, whether they are classed as a weak hedge or as a diversifier.</w:t>
+        <w:t xml:space="preserve">The contradictions are of two kinds. The first concerns average behaviour. Outside crises, Carayannopoulos and Perez cannot distinguish the correlation of CAT bonds with the stock market from zero, which makes CAT bonds a weak hedge in Baur and Lucey’s terms. Drobetz et al. find a positive and significant average correlation, which makes them a diversifier but not a hedge, and Gürtler et al. and Braun find that CAT bond premiums move with corporate spreads. The second and sharper contradiction concerns stress. Carayannopoulos and Perez find that CAT bonds moved with markets after Lehman’s failure, and Drobetz et al. find that the correlation rose in extreme weeks before 2009. Drobetz et al. find a safe haven against stocks after 2009, Feng and Zeng after the COVID-19 outbreak, and Haffar and Le Fur find the weakest extreme co-movement of all the assets they study.</w:t>
       </w:r>
     </w:p>
     <w:p>
@@ -1183,7 +1577,7 @@
         <w:pStyle w:val="BodyText"/>
       </w:pPr>
       <w:r>
-        <w:t xml:space="preserve">The negative findings on stress come from 2007-2009 and the positive ones from later periods. Three explanations are available: the bonds changed, the crises differed, or the methods differed. A simpler account would say that 2008 was a special case and the rest is a matter of method. My argument is that all three explanations hold together, that a decomposition can separate them, and that it makes a prediction the simpler account does not make (Section 3.5).</w:t>
+        <w:t xml:space="preserve">The numbers show that the disagreement is smaller than the labels suggest. Every study finds small exposures, with betas of 0.014 (Carayannopoulos and Perez) and 0.031 (Haffar and Le Fur). The studies disagree mainly on whether a small but significant exposure contradicts the zero-beta claim, and on whether 2008 tells us anything about later crises. A simple account would call 2008 a special case and the rest a matter of method. My argument is that the bonds changed, the crises differed and the methods differed, and that a decomposition can separate the three and make a prediction the simple account does not make (Section 3.5).</w:t>
       </w:r>
     </w:p>
     <w:bookmarkEnd w:id="28"/>
@@ -2199,70 +2593,7 @@
         <w:t xml:space="preserve"> </w:t>
       </w:r>
       <w:r>
-        <w:t xml:space="preserve">&lt; 0), so both channels push the beta above zero in a crisis. The split follows the distinction of Campbell and Vuolteenaho (2004) between cash-flow beta and discount-rate beta:</w:t>
-      </w:r>
-      <w:r>
-        <w:t xml:space="preserve"> </w:t>
-      </w:r>
-      <w:r>
-        <w:rPr>
-          <w:iCs/>
-          <w:i/>
-        </w:rPr>
-        <w:t xml:space="preserve">ℓ</w:t>
-      </w:r>
-      <w:r>
-        <w:rPr>
-          <w:vertAlign w:val="subscript"/>
-        </w:rPr>
-        <w:t xml:space="preserve">t</w:t>
-      </w:r>
-      <w:r>
-        <w:t xml:space="preserve"> </w:t>
-      </w:r>
-      <w:r>
-        <w:t xml:space="preserve">and</w:t>
-      </w:r>
-      <w:r>
-        <w:t xml:space="preserve"> </w:t>
-      </w:r>
-      <w:r>
-        <w:rPr>
-          <w:iCs/>
-          <w:i/>
-        </w:rPr>
-        <w:t xml:space="preserve">k</w:t>
-      </w:r>
-      <w:r>
-        <w:rPr>
-          <w:vertAlign w:val="subscript"/>
-        </w:rPr>
-        <w:t xml:space="preserve">t</w:t>
-      </w:r>
-      <w:r>
-        <w:t xml:space="preserve"> </w:t>
-      </w:r>
-      <w:r>
-        <w:t xml:space="preserve">are cash-flow news, Δ</w:t>
-      </w:r>
-      <w:r>
-        <w:rPr>
-          <w:iCs/>
-          <w:i/>
-        </w:rPr>
-        <w:t xml:space="preserve">π</w:t>
-      </w:r>
-      <w:r>
-        <w:rPr>
-          <w:vertAlign w:val="subscript"/>
-        </w:rPr>
-        <w:t xml:space="preserve">t</w:t>
-      </w:r>
-      <w:r>
-        <w:t xml:space="preserve"> </w:t>
-      </w:r>
-      <w:r>
-        <w:t xml:space="preserve">is discount-rate news. That distinction matters for investors. A price fall caused by a higher premium is recovered as the bond approaches maturity if no catastrophe occurs, so it is a loss mainly for a holder who has to sell.</w:t>
+        <w:t xml:space="preserve">&lt; 0), so both channels push the beta above zero in a crisis. The account of 2008 by Carayannopoulos and Perez contains both: collateral that lost value, and distressed bonds sold into an illiquid market. As in Campbell and Vuolteenaho’s (2004) split between cash-flow and discount-rate beta, a price fall caused by a higher premium is recovered as the bond approaches maturity if no catastrophe occurs, so it is a loss mainly for a holder who has to sell.</w:t>
       </w:r>
     </w:p>
     <w:p>
@@ -2270,7 +2601,7 @@
         <w:pStyle w:val="BodyText"/>
       </w:pPr>
       <w:r>
-        <w:t xml:space="preserve">Two qualifications apply. A very large catastrophe can move a regional stock market, as the Tōhoku earthquake of March 2011 moved Japanese equities, so against a regional benchmark</w:t>
+        <w:t xml:space="preserve">Two qualifications apply. Carayannopoulos and Perez find shorter high-correlation regimes with the S&amp;P 500 after Katrina, the 2011 Japanese earthquake and Sandy, so</w:t>
       </w:r>
       <w:r>
         <w:t xml:space="preserve"> </w:t>
@@ -2344,7 +2675,7 @@
         <w:t xml:space="preserve"> </w:t>
       </w:r>
       <w:r>
-        <w:t xml:space="preserve">is small. It need not be exactly zero: the link between CAT premiums and corporate spreads found by Gürtler et al. (2016) and Braun (2016) exists outside crises, which is consistent with the positive average correlation found by Drobetz et al. (2020).</w:t>
+        <w:t xml:space="preserve">is small. It need not be exactly zero: the link between CAT premiums and corporate spreads found by Gürtler et al. (2016) and Braun (2016) exists outside crises, which is consistent with the positive average correlation of about 0.10 found by Drobetz et al. (2020) after 2009.</w:t>
       </w:r>
     </w:p>
     <w:p>
@@ -2356,7 +2687,7 @@
         <w:pStyle w:val="Compact"/>
       </w:pPr>
       <w:r>
-        <w:t xml:space="preserve">The collateral channel is open only when the collateral is exposed to the credit of a financial institution. It was open before 2009 and is close to closed for deals whose collateral is held in Treasury money-market funds.</w:t>
+        <w:t xml:space="preserve">The collateral channel is open only when the collateral is exposed to the credit of a financial institution. It was open before 2009 and is close to closed for deals whose collateral is held in Treasury money-market funds or government-backed notes.</w:t>
       </w:r>
     </w:p>
     <w:p>
@@ -2368,7 +2699,7 @@
         <w:pStyle w:val="Compact"/>
       </w:pPr>
       <w:r>
-        <w:t xml:space="preserve">The premium channel opens when holders of CAT bonds need cash at the moment the market falls. They sell, and dealers short of capital absorb the bonds only at a higher premium. When funding is scarce, market liquidity and funding liquidity reinforce each other (Brunnermeier and Pedersen, 2009), and when capital moves slowly into a market after such a shock, prices fall further than fundamentals justify and then recover gradually (Duffie, 2010). Herrmann and Hibbeln’s (2023) estimate that liquidity accounts for about a fifth of CAT bond spreads shows that this channel has room to move prices. The same channel covers the evidence of Gürtler et al. and Braun: if the capital available to bear catastrophe risk shrinks with financial wealth, the price of catastrophe risk rises when credit spreads rise, as Froot’s (2001) account of capital-driven catastrophe pricing would predict.</w:t>
+        <w:t xml:space="preserve">The premium channel opens when holders of CAT bonds need cash at the moment the market falls. They sell, and dealers short of capital absorb the bonds only at a higher premium. When funding is scarce, market liquidity and funding liquidity reinforce each other (Brunnermeier and Pedersen, 2009), and when capital moves slowly into a market after such a shock, prices fall further than fundamentals justify and then recover gradually (Duffie, 2010). The same channel covers the evidence of Gürtler et al. and Braun: if the capital available to bear catastrophe risk shrinks with financial wealth, its price rises with credit spreads, as Froot’s (2001) account of capital-driven pricing predicts.</w:t>
       </w:r>
     </w:p>
     <w:p>
@@ -2457,6 +2788,8 @@
       <w:tr>
         <w:trPr>
           <w:tblHeader w:val="true"/>
+          <w:cantSplit/>
+          <w:tblHeader/>
         </w:trPr>
         <w:tc>
           <w:tcPr>
@@ -2512,6 +2845,9 @@
         </w:tc>
       </w:tr>
       <w:tr>
+        <w:trPr>
+          <w:cantSplit/>
+        </w:trPr>
         <w:tc>
           <w:tcPr>
             <w:tcW w:type="dxa" w:w="2257"/>
@@ -2578,7 +2914,7 @@
                 <w:rFonts w:ascii="Times New Roman" w:hAnsi="Times New Roman"/>
                 <w:sz w:val="19"/>
               </w:rPr>
-              <w:t xml:space="preserve">the crisis after Lehman’s failure (Carayannopoulos and Perez, 2015; Gürtler et al., 2016); the four Lehman-backed bonds.</w:t>
+              <w:t xml:space="preserve">correlation with the S&amp;P 500 jumps after September 2008 (Carayannopoulos and Perez, 2015); correlation rises in extreme weeks before 2009 (Drobetz et al., 2020).</w:t>
             </w:r>
           </w:p>
         </w:tc>
@@ -2613,7 +2949,7 @@
                 <w:i/>
                 <w:sz w:val="19"/>
               </w:rPr>
-              <w:t xml:space="preserve">Indirect evidence:</w:t>
+              <w:t xml:space="preserve">Evidence:</w:t>
             </w:r>
             <w:r>
               <w:rPr>
@@ -2627,12 +2963,15 @@
                 <w:rFonts w:ascii="Times New Roman" w:hAnsi="Times New Roman"/>
                 <w:sz w:val="19"/>
               </w:rPr>
-              <w:t xml:space="preserve">zero betas in non-crisis periods (Carayannopoulos and Perez, 2015).</w:t>
+              <w:t xml:space="preserve">correlation near zero until August 2008, through the first nine months of the recession (Carayannopoulos and Perez, 2015).</w:t>
             </w:r>
           </w:p>
         </w:tc>
       </w:tr>
       <w:tr>
+        <w:trPr>
+          <w:cantSplit/>
+        </w:trPr>
         <w:tc>
           <w:tcPr>
             <w:tcW w:type="dxa" w:w="2257"/>
@@ -2650,7 +2989,7 @@
                 <w:b/>
                 <w:sz w:val="19"/>
               </w:rPr>
-              <w:t xml:space="preserve">Collateral in Treasury money-market funds (post-2009)</w:t>
+              <w:t xml:space="preserve">Collateral in Treasury funds or government-backed notes (post-2009)</w:t>
             </w:r>
           </w:p>
         </w:tc>
@@ -2718,7 +3057,7 @@
                 <w:rFonts w:ascii="Times New Roman" w:hAnsi="Times New Roman"/>
                 <w:sz w:val="19"/>
               </w:rPr>
-              <w:t xml:space="preserve">Neither channel open: beta close to zero, at least a weak safe haven.</w:t>
+              <w:t xml:space="preserve">Neither channel open: beta close to zero, weak safe haven.</w:t>
             </w:r>
             <w:r>
               <w:rPr>
@@ -2748,7 +3087,7 @@
                 <w:rFonts w:ascii="Times New Roman" w:hAnsi="Times New Roman"/>
                 <w:sz w:val="19"/>
               </w:rPr>
-              <w:t xml:space="preserve">strong post-crisis safe haven against stocks (Drobetz et al., 2020), whose strong form the grid does not explain.</w:t>
+              <w:t xml:space="preserve">correlation of about 0.01 in extreme stock weeks after 2009 (Drobetz et al., 2020); beta of 0.031 and the lowest co-kurtosis over 2011-2020 (Haffar and Le Fur, 2022).</w:t>
             </w:r>
           </w:p>
         </w:tc>
@@ -2760,7 +3099,7 @@
         <w:spacing w:before="160"/>
       </w:pPr>
       <w:r>
-        <w:t xml:space="preserve">Each of the main results can be placed in one cell. Since the grid was built after reading the evidence, this fit is not a test; it shows that the results are compatible, and Section 3.5 states how the grid could be proved wrong.</w:t>
+        <w:t xml:space="preserve">Each of the main results can be placed in one cell. Since the grid was built after reading the evidence, this fit shows compatibility, not proof; Section 3.5 states how the grid could be proved wrong.</w:t>
       </w:r>
     </w:p>
     <w:p>
@@ -2768,7 +3107,7 @@
         <w:pStyle w:val="BodyText"/>
       </w:pPr>
       <w:r>
-        <w:t xml:space="preserve">The top-left cell contains one episode, the months after Lehman’s failure, when both channels were open. The crisis betas of Carayannopoulos and Perez and the link between CAT premiums and corporate spreads found by Gürtler et al. are what equation (3) predicts there. Carayannopoulos and Perez attribute much of the crisis effect to the collateral design that the market has since abandoned, but none of the reviewed evidence splits the crisis beta between the two channels.</w:t>
+        <w:t xml:space="preserve">The top-left cell contains one episode, the months after Lehman’s failure. The timing found by Carayannopoulos and Perez is the strongest evidence for the collateral channel: the recession and its first funding strains left CAT bonds uncorrelated with stocks for nine months, and the correlation jumped only when the swap structures failed. The positive extreme-week coefficients of Drobetz et al. before 2009 belong to the same cell, since their pre-crisis period ends in December 2008. None of the reviewed evidence, however, splits the 2008 beta between the collateral channel and the forced sales that followed.</w:t>
       </w:r>
     </w:p>
     <w:p>
@@ -2776,7 +3115,25 @@
         <w:pStyle w:val="BodyText"/>
       </w:pPr>
       <w:r>
-        <w:t xml:space="preserve">The post-crisis safe haven of Drobetz et al. belongs to the bottom-right cell. After 2009 the collateral channel was closed, and in my reading the stock market declines of their post-crisis sample did not bring forced selling on the scale of late 2008, so the premium channel stayed weak and CAT bonds should be at least a weak safe haven. The grid does not predict the strong form that Drobetz et al. report, a significant fall in the correlation during extreme weeks. Equation (3) produces it only if the required premium falls when stocks fall, for instance through inflows into CAT bonds during an equity sell-off, which the reviewed evidence does not document. Index smoothing cannot explain it either, since the same index is used in every sub-period. This part of their result is left open. In their crisis sub-period both channels were open, so the absence of a safe haven there is what the grid predicts.</w:t>
+        <w:t xml:space="preserve">The bottom-right cell explains the favourable results. After 2009 the collateral channel was closed, and in my reading the stock market declines of the post-crisis period did not bring forced selling on the scale of late 2008, so the premium channel stayed weak. The grid predicts a beta close to zero and a weak safe haven, which is what the numbers show: in the post-crisis extreme stock weeks of Drobetz et al., the correlation falls to about 0.01. Their</w:t>
+      </w:r>
+      <w:r>
+        <w:t xml:space="preserve"> </w:t>
+      </w:r>
+      <w:r>
+        <w:t xml:space="preserve">“</w:t>
+      </w:r>
+      <w:r>
+        <w:t xml:space="preserve">strong</w:t>
+      </w:r>
+      <w:r>
+        <w:t xml:space="preserve">”</w:t>
+      </w:r>
+      <w:r>
+        <w:t xml:space="preserve"> </w:t>
+      </w:r>
+      <w:r>
+        <w:t xml:space="preserve">label comes from the regression definition and rests on one coefficient, so it does not contradict the grid. The whole sample of Haffar and Le Fur lies in this cell: post-2009 collateral and no funding crisis, ending days before March 2020. Their favourable result is what the grid predicts for that cell, and for the same reason it says nothing about funding crises.</w:t>
       </w:r>
     </w:p>
     <w:p>
@@ -2784,7 +3141,7 @@
         <w:pStyle w:val="BodyText"/>
       </w:pPr>
       <w:r>
-        <w:t xml:space="preserve">March 2020 is the main test of the bottom-left cell: collateral in Treasury funds combined with a severe scramble for cash. The framework predicts a fall driven by forced sales, no loss on collateral, and a recovery once capital returns. The best evidence is Feng and Zeng’s, because it holds with desmoothed returns: CAT bonds remained a safe haven against stocks after the outbreak. Market reports agree. The Swiss Re price return index fell by 0.81 percent in the week to 20 March, with markdowns linked to bulk lists of bonds put up for sale (Insurance Insider ILS, 2020), and by May the sell-off was described as temporary (The Insurer, 2020). Because that index is built from quotes, the true fall was probably larger. The decomposition can still give it an order of magnitude: with a spread duration of one to two years, as for bonds with a few years to maturity, a 0.81 percent price fall corresponds to a rise of roughly 40 to 80 basis points in the required premium, which is of the same order as the average liquidity premium estimated by Herrmann and Hibbeln (2023). A bond can thus qualify as a statistical safe haven and still post a negative return in the week an investor needed to sell it.</w:t>
+        <w:t xml:space="preserve">March 2020 is the main test of the bottom-left cell: collateral in Treasury funds combined with a severe scramble for cash. The framework predicts a fall driven by forced sales, no loss on collateral, and a recovery once capital returns. The best evidence is Feng and Zeng’s, because it holds with desmoothed returns: CAT bonds remained a safe haven against stocks after the outbreak. Market reports agree: the Swiss Re price return index fell by 0.81 percent in the week to 20 March, with markdowns linked to bulk lists of bonds put up for sale (Insurance Insider ILS, 2020), and by May the sell-off was described as temporary (The Insurer, 2020). Since CAT bonds usually mature in three to four years, their spread duration is of the order of one to two years, so equation (1) turns this 0.81 percent fall into a rise of roughly 40 to 80 basis points in the required premium, of the same order as the liquidity premium estimated by Herrmann and Hibbeln (2023). A bond can thus be a statistical safe haven and still lose money in the week an investor needs to sell it.</w:t>
       </w:r>
     </w:p>
     <w:p>
@@ -2792,15 +3149,7 @@
         <w:pStyle w:val="BodyText"/>
       </w:pPr>
       <w:r>
-        <w:t xml:space="preserve">The post-2009 period contains other candidates for this cell that the reviewed studies do not isolate: the strains on euro-area bank funding in 2011-2012, and September-October 2022, when stress in UK pension funds’ liability-driven investment strategies coincided with Hurricane Ian’s landfall in Florida on 28 September, a repeat of the Ike-Lehman coincidence.</w:t>
-      </w:r>
-    </w:p>
-    <w:p>
-      <w:pPr>
-        <w:pStyle w:val="BodyText"/>
-      </w:pPr>
-      <w:r>
-        <w:t xml:space="preserve">Haffar and Le Fur’s result reads, in this grid, as an average over the cells, dominated by calm weeks. The grid predicts stronger tail dependence in funding-crisis weeks alone.</w:t>
+        <w:t xml:space="preserve">Other candidates for this cell are not isolated by the reviewed studies, such as September-October 2022, when the UK pension funds’ liability-driven investment crisis coincided with Hurricane Ian’s landfall on 28 September, a repeat of the Ike-Lehman coincidence.</w:t>
       </w:r>
     </w:p>
     <w:bookmarkEnd w:id="30"/>
@@ -2818,7 +3167,7 @@
         <w:pStyle w:val="FirstParagraph"/>
       </w:pPr>
       <w:r>
-        <w:t xml:space="preserve">Part of the divergence between the articles is statistical, and two biases pull in opposite directions.</w:t>
+        <w:t xml:space="preserve">Part of the divergence between the articles is statistical. Four choices matter.</w:t>
       </w:r>
     </w:p>
     <w:p>
@@ -2836,165 +3185,10 @@
           <w:bCs/>
           <w:b/>
         </w:rPr>
-        <w:t xml:space="preserve">smoothing</w:t>
-      </w:r>
-      <w:r>
-        <w:t xml:space="preserve">. If the index comes from bid indications that adjust with a lag, the observed return is a weighted average of current and past true returns,</w:t>
-      </w:r>
-      <w:r>
-        <w:t xml:space="preserve"> </w:t>
-      </w:r>
-      <w:r>
-        <w:rPr>
-          <w:iCs/>
-          <w:i/>
-        </w:rPr>
-        <w:t xml:space="preserve">R</w:t>
-      </w:r>
-      <w:r>
-        <w:rPr>
-          <w:vertAlign w:val="superscript"/>
-        </w:rPr>
-        <w:t xml:space="preserve">o</w:t>
-      </w:r>
-      <w:r>
-        <w:rPr>
-          <w:vertAlign w:val="subscript"/>
-        </w:rPr>
-        <w:t xml:space="preserve">t</w:t>
-      </w:r>
-      <w:r>
-        <w:t xml:space="preserve"> </w:t>
-      </w:r>
-      <w:r>
-        <w:t xml:space="preserve">=</w:t>
-      </w:r>
-      <w:r>
-        <w:t xml:space="preserve"> </w:t>
-      </w:r>
-      <w:r>
-        <w:rPr>
-          <w:iCs/>
-          <w:i/>
-        </w:rPr>
-        <w:t xml:space="preserve">θ</w:t>
-      </w:r>
-      <w:r>
-        <w:rPr>
-          <w:vertAlign w:val="subscript"/>
-        </w:rPr>
-        <w:t xml:space="preserve">0</w:t>
-      </w:r>
-      <w:r>
-        <w:rPr>
-          <w:iCs/>
-          <w:i/>
-        </w:rPr>
-        <w:t xml:space="preserve">R</w:t>
-      </w:r>
-      <w:r>
-        <w:rPr>
-          <w:vertAlign w:val="subscript"/>
-        </w:rPr>
-        <w:t xml:space="preserve">t</w:t>
-      </w:r>
-      <w:r>
-        <w:t xml:space="preserve"> </w:t>
-      </w:r>
-      <w:r>
-        <w:t xml:space="preserve">+</w:t>
-      </w:r>
-      <w:r>
-        <w:t xml:space="preserve"> </w:t>
-      </w:r>
-      <w:r>
-        <w:rPr>
-          <w:iCs/>
-          <w:i/>
-        </w:rPr>
-        <w:t xml:space="preserve">θ</w:t>
-      </w:r>
-      <w:r>
-        <w:rPr>
-          <w:vertAlign w:val="subscript"/>
-        </w:rPr>
-        <w:t xml:space="preserve">1</w:t>
-      </w:r>
-      <w:r>
-        <w:rPr>
-          <w:iCs/>
-          <w:i/>
-        </w:rPr>
-        <w:t xml:space="preserve">R</w:t>
-      </w:r>
-      <w:r>
-        <w:rPr>
-          <w:vertAlign w:val="subscript"/>
-        </w:rPr>
-        <w:t xml:space="preserve">t−1</w:t>
-      </w:r>
-      <w:r>
-        <w:t xml:space="preserve"> </w:t>
-      </w:r>
-      <w:r>
-        <w:t xml:space="preserve">+ … with weights summing to one (Getmansky et al., 2004). If the true returns are serially uncorrelated, the contemporaneous beta is</w:t>
-      </w:r>
-      <w:r>
-        <w:t xml:space="preserve"> </w:t>
-      </w:r>
-      <w:r>
-        <w:rPr>
-          <w:iCs/>
-          <w:i/>
-        </w:rPr>
-        <w:t xml:space="preserve">θ</w:t>
-      </w:r>
-      <w:r>
-        <w:rPr>
-          <w:vertAlign w:val="subscript"/>
-        </w:rPr>
-        <w:t xml:space="preserve">0</w:t>
-      </w:r>
-      <w:r>
-        <w:t xml:space="preserve"> </w:t>
-      </w:r>
-      <w:r>
-        <w:t xml:space="preserve">times the true beta, and the correlation is scaled by</w:t>
-      </w:r>
-      <w:r>
-        <w:t xml:space="preserve"> </w:t>
-      </w:r>
-      <w:r>
-        <w:rPr>
-          <w:iCs/>
-          <w:i/>
-        </w:rPr>
-        <w:t xml:space="preserve">θ</w:t>
-      </w:r>
-      <w:r>
-        <w:rPr>
-          <w:vertAlign w:val="subscript"/>
-        </w:rPr>
-        <w:t xml:space="preserve">0</w:t>
-      </w:r>
-      <w:r>
-        <w:t xml:space="preserve">/√(Σ</w:t>
-      </w:r>
-      <w:r>
-        <w:rPr>
-          <w:iCs/>
-          <w:i/>
-        </w:rPr>
-        <w:t xml:space="preserve">θ</w:t>
-      </w:r>
-      <w:r>
-        <w:rPr>
-          <w:vertAlign w:val="subscript"/>
-        </w:rPr>
-        <w:t xml:space="preserve">j</w:t>
-      </w:r>
-      <w:r>
-        <w:t xml:space="preserve">²), a smaller reduction because smoothing also lowers the measured volatility. Both are biased toward zero. The bias is probably largest in a crisis, when quotes are updated less often. It makes CAT bonds look more like a safe haven than they are. Dimson (1979) betas, which add lagged market returns to the regression, recover the covariance that a stale price misses.</w:t>
+        <w:t xml:space="preserve">economic versus statistical significance</w:t>
+      </w:r>
+      <w:r>
+        <w:t xml:space="preserve">. CAT bond returns are much less volatile than stock returns, so a significant correlation can go with a tiny beta. In the data of Carayannopoulos and Perez, the crisis correlation of 0.25 goes with a beta that peaked at 0.014: a 20 percent fall in the S&amp;P 500 would have cost a CAT bond investor about 0.3 percent. The zero-beta claim is rejected statistically and close to true economically, and the articles differ partly in which of the two they stress.</w:t>
       </w:r>
     </w:p>
     <w:p>
@@ -3178,7 +3372,7 @@
         <w:t xml:space="preserve"> </w:t>
       </w:r>
       <w:r>
-        <w:t xml:space="preserve">&gt; 0 (Forbes and Rigobon, 2002). A correlation measured in a crisis window or in extreme weeks therefore overstates any co-movement that exists. If the true beta is zero, the bias disappears: conditioning on volatility can exaggerate co-movement, but it cannot create it.</w:t>
+        <w:t xml:space="preserve">&gt; 0 (Forbes and Rigobon, 2002). The weekly volatility of the S&amp;P 500 more than doubled during the crisis in the data of Carayannopoulos and Perez, so part of the rise of the correlation from 0.016 to 0.252 is mechanical. Conditioning on volatility can exaggerate co-movement that exists, but it cannot create it, and their beta, which is free of this bias, did rise.</w:t>
       </w:r>
     </w:p>
     <w:p>
@@ -3186,7 +3380,41 @@
         <w:pStyle w:val="BodyText"/>
       </w:pPr>
       <w:r>
-        <w:t xml:space="preserve">Which bias matters depends on the method. A beta, as in Carayannopoulos and Perez, is free of the second bias but exposed to the first. A DCC regression on extreme weeks, as in Drobetz et al., is exposed to both. A copula on GARCH-filtered returns, as in Haffar and Le Fur, is not protected from the second bias by the filtering, because dividing each series by its own volatility leaves their correlation unchanged; its contribution is to measure dependence in the tails, and it still works on observed, possibly smoothed, prices. The studies also differ in their comparison set and in their definition of stress (Table 1), so they would disagree even if they studied the same market history.</w:t>
+        <w:t xml:space="preserve">The third is</w:t>
+      </w:r>
+      <w:r>
+        <w:t xml:space="preserve"> </w:t>
+      </w:r>
+      <w:r>
+        <w:rPr>
+          <w:bCs/>
+          <w:b/>
+        </w:rPr>
+        <w:t xml:space="preserve">smoothing</w:t>
+      </w:r>
+      <w:r>
+        <w:t xml:space="preserve">, which matters less than theory suggests. A smoothed index biases beta and correlation toward zero (Getmansky et al., 2004), but the estimates of Drobetz et al. are virtually unchanged after desmoothing, those of Feng and Zeng hold with desmoothed returns, and the index used by Drobetz et al. has negative first-order autocorrelation (−0.34), whereas smoothing produces positive autocorrelation.</w:t>
+      </w:r>
+    </w:p>
+    <w:p>
+      <w:pPr>
+        <w:pStyle w:val="BodyText"/>
+      </w:pPr>
+      <w:r>
+        <w:t xml:space="preserve">The fourth is the</w:t>
+      </w:r>
+      <w:r>
+        <w:t xml:space="preserve"> </w:t>
+      </w:r>
+      <w:r>
+        <w:rPr>
+          <w:bCs/>
+          <w:b/>
+        </w:rPr>
+        <w:t xml:space="preserve">proxy, frequency and window</w:t>
+      </w:r>
+      <w:r>
+        <w:t xml:space="preserve">, and it matters most. One study uses weekly index returns over a sample that includes 2008, another 100 monthly returns of one fund over a sample that excludes both 2008 and March 2020, which cannot detect what the first detects. The studies also differ in comparison assets and in their definition of stress (Table 1).</w:t>
       </w:r>
     </w:p>
     <w:bookmarkEnd w:id="31"/>
@@ -3440,7 +3668,7 @@
         <w:t xml:space="preserve"> </w:t>
       </w:r>
       <w:r>
-        <w:t xml:space="preserve">&gt; 0 after 2009 as well as before: the correlation rises in extreme weeks only when funding is under stress. The simpler account, in which 2008 was a special case, predicts</w:t>
+        <w:t xml:space="preserve">&gt; 0 after 2009 as well as before: the correlation rises in extreme weeks only when funding is under stress. The simple account, in which 2008 was a special case, predicts</w:t>
       </w:r>
       <w:r>
         <w:t xml:space="preserve"> </w:t>
@@ -3478,83 +3706,13 @@
           <w:iCs/>
           <w:i/>
         </w:rPr>
-        <w:t xml:space="preserve">Correct both biases and separate the components.</w:t>
-      </w:r>
-      <w:r>
-        <w:t xml:space="preserve"> </w:t>
-      </w:r>
-      <w:r>
-        <w:t xml:space="preserve">Desmooth the index, as Feng and Zeng (2025) do, add lagged market returns (Dimson, 1979), and adjust crisis correlations for volatility (Forbes and Rigobon, 2002), or use transaction prices from TRACE, as Herrmann and Hibbeln (2023) do. Using Swiss Re’s price return index instead of the total return index removes the collateral yield and the contractual spread, so what is left is mainly −</w:t>
-      </w:r>
-      <w:r>
-        <w:rPr>
-          <w:iCs/>
-          <w:i/>
-        </w:rPr>
-        <w:t xml:space="preserve">ℓ</w:t>
-      </w:r>
-      <w:r>
-        <w:rPr>
-          <w:vertAlign w:val="subscript"/>
-        </w:rPr>
-        <w:t xml:space="preserve">t</w:t>
-      </w:r>
-      <w:r>
-        <w:t xml:space="preserve"> </w:t>
-      </w:r>
-      <w:r>
-        <w:t xml:space="preserve">−</w:t>
-      </w:r>
-      <w:r>
-        <w:t xml:space="preserve"> </w:t>
-      </w:r>
-      <w:r>
-        <w:rPr>
-          <w:iCs/>
-          <w:i/>
-        </w:rPr>
-        <w:t xml:space="preserve">D</w:t>
-      </w:r>
-      <w:r>
-        <w:t xml:space="preserve">·Δ</w:t>
-      </w:r>
-      <w:r>
-        <w:rPr>
-          <w:iCs/>
-          <w:i/>
-        </w:rPr>
-        <w:t xml:space="preserve">π</w:t>
-      </w:r>
-      <w:r>
-        <w:rPr>
-          <w:vertAlign w:val="subscript"/>
-        </w:rPr>
-        <w:t xml:space="preserve">t</w:t>
-      </w:r>
-      <w:r>
-        <w:t xml:space="preserve"> </w:t>
-      </w:r>
-      <w:r>
-        <w:t xml:space="preserve">−</w:t>
-      </w:r>
-      <w:r>
-        <w:t xml:space="preserve"> </w:t>
-      </w:r>
-      <w:r>
-        <w:rPr>
-          <w:iCs/>
-          <w:i/>
-        </w:rPr>
-        <w:t xml:space="preserve">k</w:t>
-      </w:r>
-      <w:r>
-        <w:rPr>
-          <w:vertAlign w:val="subscript"/>
-        </w:rPr>
-        <w:t xml:space="preserve">t</w:t>
-      </w:r>
-      <w:r>
-        <w:t xml:space="preserve">.</w:t>
+        <w:t xml:space="preserve">Re-run the favourable design on a sample with a funding crisis.</w:t>
+      </w:r>
+      <w:r>
+        <w:t xml:space="preserve"> </w:t>
+      </w:r>
+      <w:r>
+        <w:t xml:space="preserve">Estimating the copula and co-kurtosis measures of Haffar and Le Fur on weekly index data that include 2008 and March 2020 would test the grid’s prediction of stronger extreme co-movement in funding-crisis weeks.</w:t>
       </w:r>
     </w:p>
     <w:p>
@@ -3570,13 +3728,10 @@
           <w:iCs/>
           <w:i/>
         </w:rPr>
-        <w:t xml:space="preserve">Flag catastrophe weeks.</w:t>
-      </w:r>
-      <w:r>
-        <w:t xml:space="preserve"> </w:t>
-      </w:r>
-      <w:r>
-        <w:t xml:space="preserve">Weeks with a major catastrophe, such as the landfalls of Ike in 2008 and Ian in 2022, should be identified separately, so that a coincidence of the two shocks is not read as market beta.</w:t>
+        <w:t xml:space="preserve">Report betas next to correlations</w:t>
+      </w:r>
+      <w:r>
+        <w:t xml:space="preserve">, adjust crisis correlations for volatility (Forbes and Rigobon, 2002), and use TRACE transaction prices where possible (Herrmann and Hibbeln, 2023).</w:t>
       </w:r>
     </w:p>
     <w:p>
@@ -3592,13 +3747,13 @@
           <w:iCs/>
           <w:i/>
         </w:rPr>
-        <w:t xml:space="preserve">Separate liquidity from duration.</w:t>
-      </w:r>
-      <w:r>
-        <w:t xml:space="preserve"> </w:t>
-      </w:r>
-      <w:r>
-        <w:t xml:space="preserve">Less liquid bonds should show larger stress betas, but bonds far from maturity are both less liquid and longer in spread duration. The comparison has to be made between bonds with similar remaining terms.</w:t>
+        <w:t xml:space="preserve">Flag catastrophe weeks and separate liquidity from duration.</w:t>
+      </w:r>
+      <w:r>
+        <w:t xml:space="preserve"> </w:t>
+      </w:r>
+      <w:r>
+        <w:t xml:space="preserve">Weeks with a major catastrophe, such as Ike in 2008 and Ian in 2022, should enter the regressions as separate dummies, so that a coincidence of shocks is not read as market beta. Less liquid bonds should show larger stress betas, but bonds far from maturity are both less liquid and longer in duration, so comparisons must be made between bonds with similar remaining terms.</w:t>
       </w:r>
     </w:p>
     <w:p>
@@ -3638,7 +3793,7 @@
         <w:t xml:space="preserve"> </w:t>
       </w:r>
       <w:r>
-        <w:t xml:space="preserve">Collateral should be held in Treasury money-market funds or equivalent instruments in trust, with no bank guaranteeing its value and with the holdings disclosed. Most of the market has moved this way since 2009 (Artemis, 2011), but investors should verify the terms of each issue.</w:t>
+        <w:t xml:space="preserve">Collateral should be limited to Treasury money-market funds or government-backed notes, held in trust, marked to market and disclosed. Most of the market has moved this way since 2009 (Carayannopoulos and Perez, 2015; Artemis, 2011), but investors should verify the terms of each issue.</w:t>
       </w:r>
     </w:p>
     <w:p>
@@ -3660,7 +3815,7 @@
         <w:t xml:space="preserve"> </w:t>
       </w:r>
       <w:r>
-        <w:t xml:space="preserve">An investor that plans to raise cash by selling CAT bonds in a crisis creates the correlation it bought them to avoid. Funds that promise frequent redemptions should match those terms to the liquidity of their bonds through notice periods, cash buffers or redemption limits, and the allocation should be small enough that it never has to be sold in a crisis. Since a premium-driven fall is recovered by a holder who can wait, the investor’s own funding decides whether the fall becomes a loss.</w:t>
+        <w:t xml:space="preserve">An investor that plans to raise cash by selling CAT bonds in a crisis creates the correlation it bought them to avoid. Funds that promise frequent redemptions should match those terms to the liquidity of their bonds through notice periods, cash buffers or redemption limits, and the allocation should be small enough never to be sold in a crisis. Since a premium-driven fall is recovered by a holder who can wait, the investor’s own funding decides whether it becomes a loss.</w:t>
       </w:r>
     </w:p>
     <w:p>
@@ -3722,7 +3877,7 @@
         <w:pStyle w:val="FirstParagraph"/>
       </w:pPr>
       <w:r>
-        <w:t xml:space="preserve">Whether CAT bonds are zero-beta assets depends on which part of the bond the question refers to. Under the assumption that natural catastrophes do not depend on markets, the insurance core is zero-beta. The bond as a traded security has a small beta in calm markets, a beta that can turn positive in a funding crisis through the premium channel, and a beta that turned positive in 2008, when Carayannopoulos and Perez attribute much of the effect to a collateral design the market has since abandoned. On the evidence reviewed, CAT bonds are a reliable diversifier; whether they also qualify as a weak hedge on average is disputed; and their safe-haven property is conditional: at least weak in equity sell-offs, weaker in funding crises, and absent for perils that are themselves macroeconomic shocks.</w:t>
+        <w:t xml:space="preserve">Whether CAT bonds are zero-beta assets depends on which part of the bond the question refers to. If natural catastrophes do not depend on markets, the insurance core is zero-beta. The traded bond has a small positive beta in calm markets, a beta that can rise in a funding crisis through the premium channel, and a beta that rose in 2008 when pre-2009 collateral structures failed, although even then the exposure was economically small. On the evidence reviewed, CAT bonds are a reliable diversifier; whether they also qualify as a weak hedge on average is disputed; and their safe-haven property is conditional: weak in equity sell-offs after 2009, weaker in funding crises, and absent for perils that are themselves macroeconomic shocks.</w:t>
       </w:r>
     </w:p>
     <w:bookmarkEnd w:id="33"/>
@@ -3741,7 +3896,7 @@
         <w:pStyle w:val="FirstParagraph"/>
       </w:pPr>
       <w:r>
-        <w:t xml:space="preserve">This paper asked whether CAT bonds keep their diversification benefits during financial stress. The literature gives three answers: the zero-beta property holds (Carayannopoulos and Perez, 2015, outside crises; Haffar and Le Fur, 2022), it fails (Gürtler et al., 2016; Carayannopoulos and Perez after Lehman’s failure), or it depends on the period (Drobetz et al., 2020; Feng and Zeng, 2025).</w:t>
+        <w:t xml:space="preserve">This paper asked whether CAT bonds keep their diversification benefits during financial stress. The literature gives three answers: the zero-beta property holds (Haffar and Le Fur, 2022), it fails (Carayannopoulos and Perez, 2015; Gürtler et al., 2016), or it fails on average while CAT bonds still protect against extreme stock market declines in some periods (Drobetz et al., 2020; Feng and Zeng, 2025). My contribution is a framework under which these conclusions are consistent. It splits the CAT bond return into an insurance core, which for natural perils is close to independent of markets, and a financial wrapper, whose exposure depends on the collateral structure and on whether a stress episode is a funding crisis. The samples of the three articles fall into different cells of Table 2: the 2008 crisis with exposed collateral for Carayannopoulos and Perez, a period split around 2009 for Drobetz et al., and a calm post-2009 window for Haffar and Le Fur. Read this way, their results describe different regimes rather than contradicting each other. Part of the disagreement is also statistical: significant correlations go with tiny betas, volatile periods exaggerate measured correlation, and a short monthly sample from a calm period cannot detect what a weekly sample containing 2008 detects.</w:t>
       </w:r>
     </w:p>
     <w:p>
@@ -3749,7 +3904,7 @@
         <w:pStyle w:val="BodyText"/>
       </w:pPr>
       <w:r>
-        <w:t xml:space="preserve">My contribution is to propose a framework under which these conclusions are consistent. It splits the CAT bond return into an insurance core, which for natural perils is close to independent of markets, and a financial wrapper, whose exposure depends on the collateral structure and on whether a stress episode is a funding crisis. Sorting the evidence into the four regimes of Table 2 accounts for the positive betas of 2007-2009, the safe haven against stocks after the crisis, and the small fall of March 2020 that was described as temporary within weeks. Part of the disagreement is also statistical: quote-based indices bias co-movement toward zero, correlations measured in volatile periods exaggerate the co-movement that exists, and the studies are exposed to these biases in different degrees.</w:t>
+        <w:t xml:space="preserve">The answer to the research question is therefore conditional. CAT bonds retain their diversification benefit in financial stress when their collateral is safe and their holders are not forced to sell. Under those conditions they can act as a weak safe haven against stocks. They lose part of the benefit when either condition fails, although even in 2008 the loss was small. Investors can make the benefit more reliable through collateral rules, liquidity management and concentration limits, but they should treat CAT bonds as a diversifier with a conditional safe-haven property, not as crisis insurance.</w:t>
       </w:r>
     </w:p>
     <w:p>
@@ -3757,15 +3912,7 @@
         <w:pStyle w:val="BodyText"/>
       </w:pPr>
       <w:r>
-        <w:t xml:space="preserve">The answer to the research question is therefore conditional. CAT bonds retain their diversification benefit in financial stress when their collateral is safe and their holders are not forced to sell. Under those conditions they can act as a weak safe haven against stocks. They lose part of the benefit when either condition fails. Investors can make the benefit more reliable through collateral rules, liquidity management and concentration limits, but they should treat CAT bonds as a diversifier with a conditional safe-haven property, not as crisis insurance.</w:t>
-      </w:r>
-    </w:p>
-    <w:p>
-      <w:pPr>
-        <w:pStyle w:val="BodyText"/>
-      </w:pPr>
-      <w:r>
-        <w:t xml:space="preserve">The analysis has limits. It rests on published results rather than new estimates, and the grid was built after reading the evidence, so the predictions of Section 3.5 are hypotheses that still need to be tested. The strong post-crisis safe haven found by Drobetz et al. is not explained by the framework. Several post-2009 funding episodes, in 2011-2012 and in 2022, have not been studied separately, so the evidence for the bottom-left cell of Table 2 rests mainly on March 2020. Finally, the framework assumes that catastrophe losses are independent of markets for natural perils. That assumption is a reasonable starting point, but it deserves to be re-examined as pandemic, cyber and climate-related risks take a larger share of the market.</w:t>
+        <w:t xml:space="preserve">The analysis has limits. It rests on published results rather than new estimates, and the grid was built after reading the evidence, so the predictions of Section 3.5 still need to be tested. The evidence for the bottom-left cell of Table 2 rests mainly on March 2020. Finally, the framework assumes that catastrophe losses are nearly independent of markets for natural perils. That assumption is a reasonable starting point, but it deserves to be re-examined as pandemic, cyber and climate-related risks take a larger share of the market.</w:t>
       </w:r>
     </w:p>
     <w:bookmarkEnd w:id="35"/>
@@ -4414,64 +4561,6 @@
           <w:sz w:val="21"/>
         </w:rPr>
         <w:t xml:space="preserve">, vol. 76, no. 3, p. 493–545. https://doi.org/10.1111/j.1539-6975.2009.01311.x</w:t>
-      </w:r>
-    </w:p>
-    <w:p>
-      <w:pPr>
-        <w:pStyle w:val="BodyText"/>
-        <w:spacing w:after="80" w:line="240" w:lineRule="auto"/>
-        <w:ind w:left="567" w:hanging="567"/>
-        <w:jc w:val="left"/>
-      </w:pPr>
-      <w:r>
-        <w:rPr>
-          <w:sz w:val="21"/>
-        </w:rPr>
-        <w:t xml:space="preserve">Dimson, Elroy (1979).</w:t>
-      </w:r>
-      <w:r>
-        <w:rPr>
-          <w:sz w:val="21"/>
-        </w:rPr>
-        <w:t xml:space="preserve"> </w:t>
-      </w:r>
-      <w:r>
-        <w:rPr>
-          <w:sz w:val="21"/>
-        </w:rPr>
-        <w:t xml:space="preserve">“</w:t>
-      </w:r>
-      <w:r>
-        <w:rPr>
-          <w:sz w:val="21"/>
-        </w:rPr>
-        <w:t xml:space="preserve">Risk measurement when shares are subject to infrequent trading,</w:t>
-      </w:r>
-      <w:r>
-        <w:rPr>
-          <w:sz w:val="21"/>
-        </w:rPr>
-        <w:t xml:space="preserve">”</w:t>
-      </w:r>
-      <w:r>
-        <w:rPr>
-          <w:sz w:val="21"/>
-        </w:rPr>
-        <w:t xml:space="preserve"> </w:t>
-      </w:r>
-      <w:r>
-        <w:rPr>
-          <w:iCs/>
-          <w:i/>
-          <w:sz w:val="21"/>
-        </w:rPr>
-        <w:t xml:space="preserve">Journal of Financial Economics</w:t>
-      </w:r>
-      <w:r>
-        <w:rPr>
-          <w:sz w:val="21"/>
-        </w:rPr>
-        <w:t xml:space="preserve">, vol. 7, no. 2, p. 197–226. https://doi.org/10.1016/0304-405X(79)90013-8</w:t>
       </w:r>
     </w:p>
     <w:p>

</xml_diff>